<commit_message>
updated drafts - sent to ko
</commit_message>
<xml_diff>
--- a/drafts/pnas:ecolets/draftSep2025ebd.docx
+++ b/drafts/pnas:ecolets/draftSep2025ebd.docx
@@ -54,7 +54,23 @@
         <w:pStyle w:val="BodyText"/>
       </w:pPr>
       <w:r>
+        <w:t>OR</w:t>
+      </w:r>
+    </w:p>
+    <w:p>
+      <w:pPr>
+        <w:pStyle w:val="BodyText"/>
+      </w:pPr>
+      <w:r>
         <w:t>Caching in: The importance of time and place for species interactions</w:t>
+      </w:r>
+    </w:p>
+    <w:p>
+      <w:pPr>
+        <w:pStyle w:val="BodyText"/>
+      </w:pPr>
+      <w:r>
+        <w:t>OR</w:t>
       </w:r>
     </w:p>
     <w:p>
@@ -741,7 +757,14 @@
         <w:rPr>
           <w:rStyle w:val="normaltextrun"/>
         </w:rPr>
-        <w:t xml:space="preserve">In addition to temporal </w:t>
+        <w:t>In addition to temporal</w:t>
+      </w:r>
+      <w:commentRangeStart w:id="8"/>
+      <w:r>
+        <w:rPr>
+          <w:rStyle w:val="normaltextrun"/>
+        </w:rPr>
+        <w:t xml:space="preserve"> </w:t>
       </w:r>
       <w:r>
         <w:rPr>
@@ -750,6 +773,14 @@
         </w:rPr>
         <w:t>legacies</w:t>
       </w:r>
+      <w:commentRangeEnd w:id="8"/>
+      <w:r>
+        <w:rPr>
+          <w:rStyle w:val="CommentReference"/>
+          <w:rFonts w:asciiTheme="minorHAnsi" w:eastAsiaTheme="minorHAnsi" w:hAnsiTheme="minorHAnsi" w:cstheme="minorBidi"/>
+        </w:rPr>
+        <w:commentReference w:id="8"/>
+      </w:r>
       <w:r>
         <w:rPr>
           <w:rStyle w:val="normaltextrun"/>
@@ -849,21 +880,7 @@
         <w:rPr>
           <w:rStyle w:val="normaltextrun"/>
         </w:rPr>
-        <w:t>resources and less time exploring their environments (</w:t>
-      </w:r>
-      <w:proofErr w:type="spellStart"/>
-      <w:r>
-        <w:rPr>
-          <w:rStyle w:val="normaltextrun"/>
-        </w:rPr>
-        <w:t>Charnov</w:t>
-      </w:r>
-      <w:proofErr w:type="spellEnd"/>
-      <w:r>
-        <w:rPr>
-          <w:rStyle w:val="normaltextrun"/>
-        </w:rPr>
-        <w:t xml:space="preserve">, Barnett et al. 2007). </w:t>
+        <w:t xml:space="preserve">resources and less time exploring their environments (Charnov, Barnett et al. 2007). </w:t>
       </w:r>
       <w:r>
         <w:rPr>
@@ -962,7 +979,19 @@
         <w:rPr>
           <w:rStyle w:val="normaltextrun"/>
         </w:rPr>
-        <w:t xml:space="preserve">All seed dispersal interactions are likely dynamic in strength and direction through space and time. This dynamism is likely heightened in systems where seed dispersers depend on unreliable resources, such as interactions with masting plant species. Masting plants are those which, at the population level, produce a synchronous and abundant seed crop in particular years, usually due to cyclical climatic suitability and mediated by how much plants rely on animal-mediated pollination and dispersal (Pearse et al., 2016; Qiu et al., 2023). Masting leads to unreliable resources for seed dispersers since seeds are available in abundance some years and virtually absent in other years. Thus, masting plant species often have weaker mutualist interactions overall (Kelly and Sork). Seed dispersers and predators that rely on masting species often have a variety of temporal responses to seed availability, including anticipatory (e.g., “predictive”; Boutin et al., Wauters et al.) and lagged (e.g., “response”; Hallworth et al. 2024). Due to the variable availability of seeds, masting seed eaters rely on a variety of food sources (McKinnon et al., 2017; Simon et al., 2023) and have evolved behaviors that optimize finding </w:t>
+        <w:t>All seed dispersal interactions are likely dynamic in strength and direction through space and time. This dynamism is likely heightened in systems where seed dispersers depend on unreliable resources, such as interactions with masting plant species. Masting plants are those which, at the population level, produce a synchronous and abundant seed crop in particular years</w:t>
+      </w:r>
+      <w:r>
+        <w:rPr>
+          <w:rStyle w:val="normaltextrun"/>
+        </w:rPr>
+        <w:t xml:space="preserve"> (Pearse et al. 2016). Masting is </w:t>
+      </w:r>
+      <w:r>
+        <w:rPr>
+          <w:rStyle w:val="normaltextrun"/>
+        </w:rPr>
+        <w:t xml:space="preserve">due to cyclical climatic suitability and mediated by how much plants rely on animal-mediated pollination and dispersal (Qiu et al., 2023). Masting leads to unreliable resources for seed dispersers since seeds are available in abundance some years and virtually absent in other years. Thus, masting plant species often have weaker mutualist interactions overall (Kelly and Sork). Seed dispersers and predators that rely on masting species often have a variety of temporal responses to seed availability, including anticipatory (e.g., “predictive”; Boutin et al., Wauters et al.) and lagged (e.g., “response”; Hallworth et al. 2024). Due to the variable availability of seeds, masting seed eaters rely on a variety of food sources (McKinnon et al., 2017; Simon et al., 2023) and have evolved behaviors that optimize finding </w:t>
       </w:r>
       <w:r>
         <w:rPr>
@@ -1296,36 +1325,12 @@
         <w:pStyle w:val="Heading3"/>
         <w:spacing w:before="180" w:after="180" w:line="480" w:lineRule="auto"/>
       </w:pPr>
-      <w:bookmarkStart w:id="8" w:name="pinyon-jay-biology-and-study-site"/>
+      <w:bookmarkStart w:id="9" w:name="pinyon-jay-biology-and-study-site"/>
       <w:r>
         <w:t xml:space="preserve">2.1 </w:t>
       </w:r>
-      <w:commentRangeStart w:id="9"/>
-      <w:commentRangeStart w:id="10"/>
       <w:r>
         <w:t>Study region</w:t>
-      </w:r>
-      <w:commentRangeEnd w:id="9"/>
-      <w:r>
-        <w:rPr>
-          <w:rStyle w:val="CommentReference"/>
-          <w:rFonts w:asciiTheme="minorHAnsi" w:eastAsiaTheme="minorHAnsi" w:hAnsiTheme="minorHAnsi" w:cstheme="minorBidi"/>
-          <w:bCs w:val="0"/>
-          <w:i w:val="0"/>
-          <w:color w:val="auto"/>
-        </w:rPr>
-        <w:commentReference w:id="9"/>
-      </w:r>
-      <w:commentRangeEnd w:id="10"/>
-      <w:r>
-        <w:rPr>
-          <w:rStyle w:val="CommentReference"/>
-          <w:rFonts w:asciiTheme="minorHAnsi" w:eastAsiaTheme="minorHAnsi" w:hAnsiTheme="minorHAnsi" w:cstheme="minorBidi"/>
-          <w:bCs w:val="0"/>
-          <w:i w:val="0"/>
-          <w:color w:val="auto"/>
-        </w:rPr>
-        <w:commentReference w:id="10"/>
       </w:r>
     </w:p>
     <w:p>
@@ -1343,7 +1348,13 @@
         <w:t>)</w:t>
       </w:r>
       <w:r>
-        <w:t xml:space="preserve"> (cite)</w:t>
+        <w:t xml:space="preserve"> (cite</w:t>
+      </w:r>
+      <w:r>
+        <w:t xml:space="preserve"> eBird status and trends, Figure 1</w:t>
+      </w:r>
+      <w:r>
+        <w:t>)</w:t>
       </w:r>
       <w:r>
         <w:t xml:space="preserve">. </w:t>
@@ -1568,7 +1579,13 @@
         <w:t xml:space="preserve">nyon </w:t>
       </w:r>
       <w:r>
-        <w:t xml:space="preserve">cone production can be found in Figure 1. </w:t>
+        <w:t xml:space="preserve">cone production can be found in Figure </w:t>
+      </w:r>
+      <w:r>
+        <w:t>2</w:t>
+      </w:r>
+      <w:r>
+        <w:t xml:space="preserve">. </w:t>
       </w:r>
     </w:p>
     <w:p>
@@ -1576,8 +1593,8 @@
         <w:pStyle w:val="Heading3"/>
         <w:spacing w:before="180" w:after="180" w:line="480" w:lineRule="auto"/>
       </w:pPr>
-      <w:bookmarkStart w:id="11" w:name="covariate-data"/>
-      <w:bookmarkEnd w:id="8"/>
+      <w:bookmarkStart w:id="10" w:name="covariate-data"/>
+      <w:bookmarkEnd w:id="9"/>
       <w:r>
         <w:t xml:space="preserve">2.2 </w:t>
       </w:r>
@@ -1657,7 +1674,7 @@
         <w:lastRenderedPageBreak/>
         <w:t>2.2.1 Bird abundance from eBird</w:t>
       </w:r>
-      <w:bookmarkStart w:id="12" w:name="ebird-filtering-and-subsampling"/>
+      <w:bookmarkStart w:id="11" w:name="ebird-filtering-and-subsampling"/>
     </w:p>
     <w:p>
       <w:pPr>
@@ -1992,7 +2009,13 @@
       </w:r>
       <w:proofErr w:type="spellEnd"/>
       <w:r>
-        <w:t xml:space="preserve"> checklists per grid cell in a specific year). We downloaded eBird data in May (Colorado and New Mexico) and June (Arizona and Utah) 2024 </w:t>
+        <w:t xml:space="preserve"> checklists per grid cell in a specific year</w:t>
+      </w:r>
+      <w:r>
+        <w:t>, Figure 1</w:t>
+      </w:r>
+      <w:r>
+        <w:t xml:space="preserve">). We downloaded eBird data in May (Colorado and New Mexico) and June (Arizona and Utah) 2024 </w:t>
       </w:r>
       <w:r>
         <w:fldChar w:fldCharType="begin"/>
@@ -2042,7 +2065,7 @@
         <w:t>).</w:t>
       </w:r>
     </w:p>
-    <w:bookmarkEnd w:id="12"/>
+    <w:bookmarkEnd w:id="11"/>
     <w:p>
       <w:pPr>
         <w:pStyle w:val="BodyText"/>
@@ -2255,13 +2278,19 @@
         <w:pStyle w:val="FirstParagraph"/>
         <w:ind w:firstLine="720"/>
       </w:pPr>
+      <w:commentRangeStart w:id="12"/>
       <w:commentRangeStart w:id="13"/>
-      <w:commentRangeStart w:id="14"/>
       <w:r>
         <w:t>As an indicator of habitat structure,</w:t>
       </w:r>
       <w:r>
-        <w:t xml:space="preserve"> and to filter eBird observations to areas with pinyon pine,</w:t>
+        <w:t xml:space="preserve"> and to filter eBird observations to areas with pinyon pine</w:t>
+      </w:r>
+      <w:r>
+        <w:t xml:space="preserve"> (Figure 1)</w:t>
+      </w:r>
+      <w:r>
+        <w:t>,</w:t>
       </w:r>
       <w:r>
         <w:t xml:space="preserve"> w</w:t>
@@ -2269,20 +2298,20 @@
       <w:r>
         <w:t>e derived yearly basal area</w:t>
       </w:r>
+      <w:commentRangeEnd w:id="12"/>
+      <w:r>
+        <w:rPr>
+          <w:rStyle w:val="CommentReference"/>
+        </w:rPr>
+        <w:commentReference w:id="12"/>
+      </w:r>
       <w:commentRangeEnd w:id="13"/>
-      <w:r>
-        <w:rPr>
-          <w:rStyle w:val="CommentReference"/>
-        </w:rPr>
-        <w:commentReference w:id="13"/>
-      </w:r>
-      <w:commentRangeEnd w:id="14"/>
       <w:r>
         <w:rPr>
           <w:rStyle w:val="CommentReference"/>
           <w:rFonts w:asciiTheme="minorHAnsi" w:hAnsiTheme="minorHAnsi"/>
         </w:rPr>
-        <w:commentReference w:id="14"/>
+        <w:commentReference w:id="13"/>
       </w:r>
       <w:r>
         <w:t xml:space="preserve"> </w:t>
@@ -2527,76 +2556,76 @@
       <w:r>
         <w:t xml:space="preserve">year from 2010 to 2022 based on </w:t>
       </w:r>
-      <w:commentRangeStart w:id="15"/>
+      <w:commentRangeStart w:id="14"/>
       <w:r>
         <w:t>remotely sensed estimates</w:t>
       </w:r>
-      <w:commentRangeEnd w:id="15"/>
+      <w:commentRangeEnd w:id="14"/>
       <w:r>
         <w:rPr>
           <w:rStyle w:val="CommentReference"/>
           <w:rFonts w:asciiTheme="minorHAnsi" w:hAnsiTheme="minorHAnsi"/>
         </w:rPr>
+        <w:commentReference w:id="14"/>
+      </w:r>
+      <w:r>
+        <w:t xml:space="preserve"> of canopy cover.</w:t>
+      </w:r>
+      <w:r>
+        <w:t xml:space="preserve"> </w:t>
+      </w:r>
+      <w:commentRangeStart w:id="15"/>
+      <w:r>
+        <w:t xml:space="preserve">This </w:t>
+      </w:r>
+      <w:r>
+        <w:t xml:space="preserve">approach </w:t>
+      </w:r>
+      <w:r>
+        <w:t>allow</w:t>
+      </w:r>
+      <w:r>
+        <w:t>ed</w:t>
+      </w:r>
+      <w:r>
+        <w:t xml:space="preserve"> for both </w:t>
+      </w:r>
+      <w:r>
+        <w:t>increases or decreases in pinyon BA</w:t>
+      </w:r>
+      <w:r>
+        <w:t xml:space="preserve"> </w:t>
+      </w:r>
+      <w:r>
+        <w:t xml:space="preserve">during </w:t>
+      </w:r>
+      <w:r>
+        <w:t>our study period</w:t>
+      </w:r>
+      <w:r>
+        <w:t xml:space="preserve"> based on patterns of ingrowth or mortality, respectively</w:t>
+      </w:r>
+      <w:r>
+        <w:t>, and qualitatively align</w:t>
+      </w:r>
+      <w:r>
+        <w:t>ed</w:t>
+      </w:r>
+      <w:r>
+        <w:t xml:space="preserve"> with patterns of forest change in different locations throughout the Southwest</w:t>
+      </w:r>
+      <w:r>
+        <w:t>.</w:t>
+      </w:r>
+      <w:r>
+        <w:t xml:space="preserve"> For this study, we</w:t>
+      </w:r>
+      <w:commentRangeEnd w:id="15"/>
+      <w:r>
+        <w:rPr>
+          <w:rStyle w:val="CommentReference"/>
+        </w:rPr>
         <w:commentReference w:id="15"/>
-      </w:r>
-      <w:r>
-        <w:t xml:space="preserve"> of canopy cover.</w:t>
-      </w:r>
-      <w:r>
-        <w:t xml:space="preserve"> </w:t>
-      </w:r>
-      <w:commentRangeStart w:id="16"/>
-      <w:r>
-        <w:t xml:space="preserve">This </w:t>
-      </w:r>
-      <w:r>
-        <w:t xml:space="preserve">approach </w:t>
-      </w:r>
-      <w:r>
-        <w:t>allow</w:t>
-      </w:r>
-      <w:r>
-        <w:t>ed</w:t>
-      </w:r>
-      <w:r>
-        <w:t xml:space="preserve"> for both </w:t>
-      </w:r>
-      <w:r>
-        <w:t>increases or decreases in pinyon BA</w:t>
-      </w:r>
-      <w:r>
-        <w:t xml:space="preserve"> </w:t>
-      </w:r>
-      <w:r>
-        <w:t xml:space="preserve">during </w:t>
-      </w:r>
-      <w:r>
-        <w:t>our study period</w:t>
-      </w:r>
-      <w:r>
-        <w:t xml:space="preserve"> based on patterns of ingrowth or mortality, respectively</w:t>
-      </w:r>
-      <w:r>
-        <w:t>, and qualitatively align</w:t>
-      </w:r>
-      <w:r>
-        <w:t>ed</w:t>
-      </w:r>
-      <w:r>
-        <w:t xml:space="preserve"> with patterns of forest change in different locations throughout the Southwest</w:t>
-      </w:r>
-      <w:r>
-        <w:t>.</w:t>
-      </w:r>
-      <w:r>
-        <w:t xml:space="preserve"> For this study, we</w:t>
-      </w:r>
-      <w:commentRangeEnd w:id="16"/>
-      <w:r>
-        <w:rPr>
-          <w:rStyle w:val="CommentReference"/>
-        </w:rPr>
-        <w:commentReference w:id="16"/>
       </w:r>
       <w:r>
         <w:t xml:space="preserve"> aggregated these 250-m grids to a 4-km resolution to align with other covariates.</w:t>
@@ -2806,8 +2835,8 @@
         <w:pStyle w:val="Heading3"/>
         <w:spacing w:before="180" w:after="180" w:line="480" w:lineRule="auto"/>
       </w:pPr>
-      <w:bookmarkStart w:id="17" w:name="X9f51ec2d939dc3732bbaff33291cd7faf9c78c2"/>
-      <w:bookmarkEnd w:id="11"/>
+      <w:bookmarkStart w:id="16" w:name="X9f51ec2d939dc3732bbaff33291cd7faf9c78c2"/>
+      <w:bookmarkEnd w:id="10"/>
       <w:r>
         <w:t>2.</w:t>
       </w:r>
@@ -3032,45 +3061,13 @@
         <w:t>)</w:t>
       </w:r>
       <w:r>
-        <w:t xml:space="preserve">. </w:t>
-      </w:r>
-      <w:commentRangeStart w:id="18"/>
-      <w:commentRangeStart w:id="19"/>
-      <w:r>
-        <w:t>We verified that checklists within our filtered dataset (</w:t>
-      </w:r>
-      <w:r>
-        <w:t xml:space="preserve">see </w:t>
-      </w:r>
-      <w:r>
-        <w:t>Section 2.</w:t>
-      </w:r>
-      <w:r>
-        <w:t>2.1</w:t>
-      </w:r>
-      <w:r>
-        <w:t>) met this assumption by comparing values for all covariates at locations with checklists to all gridded data available for those covariates (described more in Section 2.2</w:t>
-      </w:r>
-      <w:r>
-        <w:t>.2 and 2.2.3</w:t>
+        <w:t>. We verified that checklists within our filtered dataset met this assumption by comparing values for all covariates at locations with checklists to all gridded data available for those covariates (</w:t>
+      </w:r>
+      <w:r>
+        <w:t>SI Figure 1</w:t>
       </w:r>
       <w:r>
         <w:t xml:space="preserve">). </w:t>
-      </w:r>
-      <w:commentRangeEnd w:id="18"/>
-      <w:r>
-        <w:rPr>
-          <w:rStyle w:val="CommentReference"/>
-        </w:rPr>
-        <w:commentReference w:id="18"/>
-      </w:r>
-      <w:commentRangeEnd w:id="19"/>
-      <w:r>
-        <w:rPr>
-          <w:rStyle w:val="CommentReference"/>
-          <w:rFonts w:asciiTheme="minorHAnsi" w:hAnsiTheme="minorHAnsi"/>
-        </w:rPr>
-        <w:commentReference w:id="19"/>
       </w:r>
     </w:p>
     <w:p>
@@ -3078,8 +3075,8 @@
         <w:pStyle w:val="Heading3"/>
         <w:spacing w:before="180" w:after="180" w:line="480" w:lineRule="auto"/>
       </w:pPr>
-      <w:bookmarkStart w:id="20" w:name="observation-process-for-ebird"/>
-      <w:bookmarkEnd w:id="17"/>
+      <w:bookmarkStart w:id="17" w:name="observation-process-for-ebird"/>
+      <w:bookmarkEnd w:id="16"/>
       <w:r>
         <w:t>2.</w:t>
       </w:r>
@@ -3131,22 +3128,19 @@
         <w:t xml:space="preserve"> of the observer</w:t>
       </w:r>
       <w:r>
-        <w:t xml:space="preserve"> (&lt; 5km in our dataset after filtering). Thus, there is spatial uncertainty arising from two sources: 1) uncertainty in the location in which the survey was conducted (e.g., was the location recorded at the beginning, middle, or end of a survey and at what level of precision) and 2) uncertainty in </w:t>
+        <w:t xml:space="preserve"> (&lt; 5km in our dataset after filtering). Thus, there is spatial uncertainty arising from two sources: 1) uncertainty in the location in which the survey was conducted (e.g., was the location recorded at the beginning, middle, or end of a survey and at what level of precision) and 2) uncertainty in the location along a survey at which pinyon jays were observed (e.g., </w:t>
+      </w:r>
+      <w:r>
+        <w:t xml:space="preserve">it is unknown if </w:t>
+      </w:r>
+      <w:r>
+        <w:t xml:space="preserve">birds </w:t>
+      </w:r>
+      <w:r>
+        <w:t xml:space="preserve">were </w:t>
       </w:r>
       <w:r>
         <w:lastRenderedPageBreak/>
-        <w:t xml:space="preserve">the location along a survey at which pinyon jays were observed (e.g., </w:t>
-      </w:r>
-      <w:r>
-        <w:t xml:space="preserve">it is unknown if </w:t>
-      </w:r>
-      <w:r>
-        <w:t xml:space="preserve">birds </w:t>
-      </w:r>
-      <w:r>
-        <w:t xml:space="preserve">were </w:t>
-      </w:r>
-      <w:r>
         <w:t xml:space="preserve">observed at the beginning, middle, or end of a walking survey). To account for this spatial uncertainty, we created </w:t>
       </w:r>
       <w:r>
@@ -3336,7 +3330,22 @@
         <w:t xml:space="preserve">(“number of trials”) </w:t>
       </w:r>
       <w:r>
-        <w:t>in the checklist:</w:t>
+        <w:t xml:space="preserve">in the </w:t>
+      </w:r>
+      <w:commentRangeStart w:id="18"/>
+      <w:r>
+        <w:t>checklist</w:t>
+      </w:r>
+      <w:commentRangeEnd w:id="18"/>
+      <w:r>
+        <w:rPr>
+          <w:rStyle w:val="CommentReference"/>
+          <w:rFonts w:asciiTheme="minorHAnsi" w:hAnsiTheme="minorHAnsi"/>
+        </w:rPr>
+        <w:commentReference w:id="18"/>
+      </w:r>
+      <w:r>
+        <w:t>:</w:t>
       </w:r>
     </w:p>
     <w:p>
@@ -3919,7 +3928,7 @@
         <w:lastRenderedPageBreak/>
         <w:t xml:space="preserve">where </w:t>
       </w:r>
-      <w:bookmarkStart w:id="21" w:name="_Hlk206770191"/>
+      <w:bookmarkStart w:id="19" w:name="_Hlk206770191"/>
       <m:oMath>
         <m:sSub>
           <m:sSubPr>
@@ -3950,7 +3959,7 @@
       <w:r>
         <w:t xml:space="preserve"> i</w:t>
       </w:r>
-      <w:bookmarkEnd w:id="21"/>
+      <w:bookmarkEnd w:id="19"/>
       <w:r>
         <w:t xml:space="preserve">s intercept and each </w:t>
       </w:r>
@@ -4109,8 +4118,8 @@
         <w:pStyle w:val="Heading3"/>
         <w:spacing w:before="180" w:after="180" w:line="480" w:lineRule="auto"/>
       </w:pPr>
-      <w:bookmarkStart w:id="22" w:name="X9e09589101055a0b716ce1af6e945302d419ef3"/>
-      <w:bookmarkEnd w:id="20"/>
+      <w:bookmarkStart w:id="20" w:name="X9e09589101055a0b716ce1af6e945302d419ef3"/>
+      <w:bookmarkEnd w:id="17"/>
       <w:r>
         <w:t xml:space="preserve">2.4.2 Biological process </w:t>
       </w:r>
@@ -5792,7 +5801,10 @@
         <w:t>current year (both “predictive” time periods), and three years after the current year (“lagged” time periods</w:t>
       </w:r>
       <w:r>
-        <w:t>, with two separate hypotheses of why they may shape jay abundance, Figure 1</w:t>
+        <w:t xml:space="preserve">, with two separate hypotheses of why they may shape jay abundance, Figure </w:t>
+      </w:r>
+      <w:r>
+        <w:t>2</w:t>
       </w:r>
       <w:r>
         <w:t xml:space="preserve">). Both temperature and precipitation were </w:t>
@@ -6031,8 +6043,8 @@
         <w:pStyle w:val="Heading3"/>
         <w:spacing w:before="180" w:after="180" w:line="480" w:lineRule="auto"/>
       </w:pPr>
-      <w:bookmarkStart w:id="23" w:name="Xbdd7eae3a7324731b0bcf4a544447a868577823"/>
-      <w:bookmarkEnd w:id="22"/>
+      <w:bookmarkStart w:id="21" w:name="Xbdd7eae3a7324731b0bcf4a544447a868577823"/>
+      <w:bookmarkEnd w:id="20"/>
       <w:r>
         <w:t>2</w:t>
       </w:r>
@@ -6810,8 +6822,8 @@
         <w:pStyle w:val="Heading3"/>
         <w:spacing w:before="180" w:after="180" w:line="480" w:lineRule="auto"/>
       </w:pPr>
-      <w:bookmarkStart w:id="24" w:name="out-of-sample-model-validation"/>
-      <w:bookmarkEnd w:id="23"/>
+      <w:bookmarkStart w:id="22" w:name="out-of-sample-model-validation"/>
+      <w:bookmarkEnd w:id="21"/>
       <w:r>
         <w:t>2.6 Out of sample model validation</w:t>
       </w:r>
@@ -6960,9 +6972,9 @@
         <w:pStyle w:val="Heading1"/>
         <w:spacing w:before="180" w:after="180"/>
       </w:pPr>
-      <w:bookmarkStart w:id="25" w:name="results"/>
+      <w:bookmarkStart w:id="23" w:name="results"/>
       <w:bookmarkEnd w:id="0"/>
-      <w:bookmarkEnd w:id="24"/>
+      <w:bookmarkEnd w:id="22"/>
       <w:r>
         <w:lastRenderedPageBreak/>
         <w:t xml:space="preserve">3 </w:t>
@@ -7058,10 +7070,10 @@
         <w:t xml:space="preserve"> (</w:t>
       </w:r>
       <w:r>
-        <w:rPr>
-          <w:highlight w:val="magenta"/>
-        </w:rPr>
-        <w:t>Figure X</w:t>
+        <w:t xml:space="preserve">Figure </w:t>
+      </w:r>
+      <w:r>
+        <w:t>3</w:t>
       </w:r>
       <w:r>
         <w:t>)</w:t>
@@ -7592,7 +7604,13 @@
         </m:acc>
       </m:oMath>
       <w:r>
-        <w:t xml:space="preserve"> = 0.60 [0.50, 0.69] and 0.34 [0.25, 0.44], for the breeding and fledging seasons, respectively). All other weights were not important (SI Figure 2).</w:t>
+        <w:t xml:space="preserve"> = 0.60 [0.50, 0.69] and 0.34 [0.25, 0.44], for the breeding and fledging seasons, respectively). All other weights were not important (SI Figure </w:t>
+      </w:r>
+      <w:r>
+        <w:t>3</w:t>
+      </w:r>
+      <w:r>
+        <w:t>).</w:t>
       </w:r>
       <w:r>
         <w:t xml:space="preserve"> In other words, high temperatures during the breeding and fledging season two years ago had a negative effect on pinyon jay abundance. </w:t>
@@ -7699,22 +7717,22 @@
         <w:t xml:space="preserve"> 1.1 </w:t>
       </w:r>
       <w:r>
-        <w:t>(</w:t>
-      </w:r>
-      <w:r>
-        <w:rPr>
-          <w:highlight w:val="magenta"/>
-        </w:rPr>
-        <w:t>SI Figure 1).</w:t>
-      </w:r>
-      <w:r>
-        <w:t xml:space="preserve"> </w:t>
+        <w:t xml:space="preserve">(SI Figure </w:t>
+      </w:r>
+      <w:r>
+        <w:t>2</w:t>
+      </w:r>
+      <w:r>
+        <w:t xml:space="preserve">). </w:t>
       </w:r>
       <w:r>
         <w:t>T</w:t>
       </w:r>
       <w:r>
-        <w:t xml:space="preserve">he relationship between our observed data and replicated data produced by the model had a mean </w:t>
+        <w:t>he</w:t>
+      </w:r>
+      <w:r>
+        <w:t xml:space="preserve"> relationship between our observed data and replicated data produced by the model had a mean </w:t>
       </w:r>
       <m:oMath>
         <m:sSup>
@@ -7749,28 +7767,28 @@
       <w:r>
         <w:t>o</w:t>
       </w:r>
-      <w:commentRangeStart w:id="26"/>
-      <w:commentRangeStart w:id="27"/>
+      <w:commentRangeStart w:id="24"/>
+      <w:commentRangeStart w:id="25"/>
       <w:r>
         <w:t>f</w:t>
       </w:r>
       <w:r>
         <w:t xml:space="preserve"> 0.7</w:t>
       </w:r>
-      <w:commentRangeEnd w:id="26"/>
+      <w:commentRangeEnd w:id="24"/>
       <w:r>
         <w:rPr>
           <w:rStyle w:val="CommentReference"/>
         </w:rPr>
-        <w:commentReference w:id="26"/>
-      </w:r>
-      <w:commentRangeEnd w:id="27"/>
+        <w:commentReference w:id="24"/>
+      </w:r>
+      <w:commentRangeEnd w:id="25"/>
       <w:r>
         <w:rPr>
           <w:rStyle w:val="CommentReference"/>
           <w:rFonts w:asciiTheme="minorHAnsi" w:hAnsiTheme="minorHAnsi"/>
         </w:rPr>
-        <w:commentReference w:id="27"/>
+        <w:commentReference w:id="25"/>
       </w:r>
       <w:r>
         <w:t>4 (SE: 0.0003). In general, the model under-estimate</w:t>
@@ -7797,7 +7815,13 @@
         <w:t xml:space="preserve"> well on most other values</w:t>
       </w:r>
       <w:r>
-        <w:t xml:space="preserve"> (SI Figure 3). The RMSE for our in-sample (“test”) dataset had an average value</w:t>
+        <w:t xml:space="preserve"> (SI Figure </w:t>
+      </w:r>
+      <w:r>
+        <w:t>4</w:t>
+      </w:r>
+      <w:r>
+        <w:t>). The RMSE for our in-sample (“test”) dataset had an average value</w:t>
       </w:r>
       <w:r>
         <w:t xml:space="preserve"> of 3.25 (SE: 0.001)</w:t>
@@ -7809,7 +7833,13 @@
         <w:t xml:space="preserve">5.10 (SE: 0.0002; </w:t>
       </w:r>
       <w:r>
-        <w:t>SI Figure 4). Thus, our model predicts slightly better to our in-sample (“test”) data than out-of-</w:t>
+        <w:t xml:space="preserve">SI Figure </w:t>
+      </w:r>
+      <w:r>
+        <w:t>5</w:t>
+      </w:r>
+      <w:r>
+        <w:t>). Thus, our model predicts slightly better to our in-sample (“test”) data than out-of-</w:t>
       </w:r>
       <w:r>
         <w:lastRenderedPageBreak/>
@@ -7819,7 +7849,13 @@
         <w:t>We observed no strong spatial autocorrelation in residuals</w:t>
       </w:r>
       <w:r>
-        <w:t xml:space="preserve"> (SI Figure 5).</w:t>
+        <w:t xml:space="preserve"> (SI Figure </w:t>
+      </w:r>
+      <w:r>
+        <w:t>6</w:t>
+      </w:r>
+      <w:r>
+        <w:t>).</w:t>
       </w:r>
     </w:p>
     <w:p>
@@ -7834,50 +7870,46 @@
     <w:p>
       <w:pPr>
         <w:pStyle w:val="BodyText"/>
-      </w:pPr>
-      <w:r>
-        <w:t>[Main takeaways framed broadly]</w:t>
-      </w:r>
-    </w:p>
-    <w:p>
-      <w:pPr>
-        <w:pStyle w:val="BodyText"/>
-      </w:pPr>
-      <w:r>
-        <w:t>[Temporal signal and why it matters for this and other interactions]</w:t>
-      </w:r>
-    </w:p>
-    <w:p>
-      <w:pPr>
-        <w:pStyle w:val="BodyText"/>
-      </w:pPr>
-      <w:r>
-        <w:t>[Context dependence here in OFT and more broadly for other interactions]</w:t>
-      </w:r>
-    </w:p>
-    <w:p>
-      <w:pPr>
-        <w:pStyle w:val="BodyText"/>
-      </w:pPr>
-      <w:r>
-        <w:t>[Gaps/Next steps]</w:t>
-      </w:r>
-    </w:p>
-    <w:p>
-      <w:pPr>
-        <w:pStyle w:val="BodyText"/>
-      </w:pPr>
-      <w:r>
-        <w:t xml:space="preserve">[Broad takeaways </w:t>
-      </w:r>
-      <w:r>
-        <w:t>–</w:t>
-      </w:r>
-      <w:r>
-        <w:t xml:space="preserve"> </w:t>
-      </w:r>
-      <w:r>
-        <w:t>zoom out beyond mutualisms a bit more to talk about how important it is to model species interactions understanding their temporal signal and local context dependence]</w:t>
+        <w:ind w:firstLine="720"/>
+      </w:pPr>
+      <w:r>
+        <w:t xml:space="preserve">Here, we demonstrate that seed dispersal interactions can have complex temporal legacies and are shaped by local habitat and climate context. In the pinyon jay mutualism with two-needle pinyon pine, birds exhibited lagged responses to cone availability that support two mechanistic hypotheses. Specifically, birds aggregate near cached seeds from the previous fall and </w:t>
+      </w:r>
+      <w:r>
+        <w:t xml:space="preserve">population boons from high-seed years can be observed up to three years following seed production. </w:t>
+      </w:r>
+      <w:r>
+        <w:t>We also found that the relationship between pinyon jay abundance and seed availability is mediated by a suite of habitat and climate variables</w:t>
+      </w:r>
+      <w:r>
+        <w:t xml:space="preserve">. </w:t>
+      </w:r>
+      <w:r>
+        <w:t xml:space="preserve">These interactive relationships suggest a combination of ecological effects, including a stronger relationship with seed availability following “stressful” climatic conditions during the nesting season and a weaker relationship with seed availability in more “suitable” habitat. Determining the relationship between pinyon jays and pinyon pine seed availability and how this relationship is shaped by climate and habitat context is an important step in recognizing potential mechanisms for pinyon jay population changes. </w:t>
+      </w:r>
+      <w:r>
+        <w:t xml:space="preserve">Our modeling approach allowed us to test the temporal dynamics between interacting partners and could be more generally used in understanding context dependence in a suite of ecological interactions beyond mutualisms </w:t>
+      </w:r>
+      <w:r>
+        <w:fldChar w:fldCharType="begin"/>
+      </w:r>
+      <w:r>
+        <w:instrText xml:space="preserve"> ADDIN ZOTERO_ITEM CSL_CITATION {"citationID":"aIB16gnK","properties":{"formattedCitation":"(Moore &amp; Dittel, 2020)","plainCitation":"(Moore &amp; Dittel, 2020)","noteIndex":0},"citationItems":[{"id":2866,"uris":["http://zotero.org/groups/5634119/items/DSHJRM3N"],"itemData":{"id":2866,"type":"article-journal","abstract":"AbstractSpecies interactions are context dependent, in that their direction and magnitude can vary across ecological conditions. For seed dispersal interactions—especially interactions between plants and seed‐caching animals—the direction of the interactions is often obscured because of seed mortality inherent in seed handling and the delayed effects of fitness benefits received by plants. It is, therefore, an open question in ecology to understand the ecological contexts under which seed dispersal interactions are facilitative, antagonistic or null.We review the fitness benefits of animal‐mediated seed dispersal, extend a recently published model to include negative density‐dependent effects, and review the feedback between seed production (with a focus on masting) and seed‐caching animal populations.Negative density‐dependent effects are pervasive and strongly affect the direction of plant‐seed‐disperser interactions, and including them into models will give a more accurate understanding of the direction of the interaction. Including negative density‐dependent effects also makes the interpretation of interaction more mutualistic since seed dispersers decrease seed densities. Additionally, there is substantial interannual variability in seed production in most nut‐producing plant species, and the lags between seed production and seed‐disperser population sizes complicate and limit inferences made about the direction of interactions in any given short‐term study.Synthesis. If we wish to know the direction of species interactions in real ecological communities, we need models that contain a minimum level of biological realism. For complex and long‐term phenomena such as context‐dependent species interactions we should embrace a multifaceted approach of short‐term field research, long‐term field research, simple models, and complex models to form a more robust understanding of the ecological problem of context dependency.","container-title":"Journal of Ecology","DOI":"10.1111/1365-2745.13414","ISSN":"0022-0477, 1365-2745","issue":"5","language":"en","license":"http://creativecommons.org/licenses/by/4.0/","note":"publisher: Wiley","page":"1775-1783","source":"Crossref","title":"On mutualism, models, and masting: The effects of seed‐dispersing animals on the plants they disperse","title-short":"On mutualism, models, and masting","volume":"108","author":[{"family":"Moore","given":"Christopher M."},{"family":"Dittel","given":"Jacob W."}],"editor":[{"family":"Shefferson","given":"Richard"}],"issued":{"date-parts":[["2020",9]]}}}],"schema":"https://github.com/citation-style-language/schema/raw/master/csl-citation.json"} </w:instrText>
+      </w:r>
+      <w:r>
+        <w:fldChar w:fldCharType="separate"/>
+      </w:r>
+      <w:r>
+        <w:rPr>
+          <w:noProof/>
+        </w:rPr>
+        <w:t>(Moore &amp; Dittel, 2020)</w:t>
+      </w:r>
+      <w:r>
+        <w:fldChar w:fldCharType="end"/>
+      </w:r>
+      <w:r>
+        <w:t>.</w:t>
       </w:r>
     </w:p>
     <w:p>
@@ -7885,12 +7917,354 @@
         <w:pStyle w:val="BodyText"/>
         <w:ind w:firstLine="720"/>
       </w:pPr>
+      <w:r>
+        <w:t xml:space="preserve">In many systems with masting tree species, populations of seed predators are known to </w:t>
+      </w:r>
+      <w:r>
+        <w:t>increase</w:t>
+      </w:r>
+      <w:r>
+        <w:t xml:space="preserve"> in synchrony with or following large masting events (e.g., </w:t>
+      </w:r>
+      <w:r>
+        <w:fldChar w:fldCharType="begin"/>
+      </w:r>
+      <w:r>
+        <w:instrText xml:space="preserve"> ADDIN ZOTERO_ITEM CSL_CITATION {"citationID":"bmLyT6DZ","properties":{"formattedCitation":"(Boutin et al., 2006; Schnurr et al., 2002)","plainCitation":"(Boutin et al., 2006; Schnurr et al., 2002)","noteIndex":0},"citationItems":[{"id":2983,"uris":["http://zotero.org/groups/5634119/items/JHIYW3CU"],"itemData":{"id":2983,"type":"article-journal","abstract":"Mast seeding, the intermittent, synchronous production of large seed crops by a population of plants, is a well-known example of resource pulses that create lagged responses in successive trophic levels of ecological communities. These lags arise because seed predators are thought capable of increasing reproduction and population size only after the resource pulse is available for consumption. The resulting satiation of predators is a widely cited explanation for the evolution of masting. Our study shows that both American and Eurasian tree squirrels anticipate resource pulses and increase reproductive output before a masting event, thereby increasing population size in synchrony with the resource pulse and eliminating the population lag thought to be universal in resource pulse systems.","container-title":"Science","DOI":"10.1126/science.1135520","ISSN":"0036-8075, 1095-9203","issue":"5807","journalAbbreviation":"Science","language":"en","page":"1928-1930","source":"DOI.org (Crossref)","title":"Anticipatory Reproduction and Population Growth in Seed Predators","volume":"314","author":[{"family":"Boutin","given":"Stan"},{"family":"Wauters","given":"Lucas A."},{"family":"McAdam","given":"Andrew G."},{"family":"Humphries","given":"Murray M."},{"family":"Tosi","given":"Guido"},{"family":"Dhondt","given":"André A."}],"issued":{"date-parts":[["2006",12,22]]}}},{"id":2982,"uris":["http://zotero.org/groups/5634119/items/QD85BJ5Z"],"itemData":{"id":2982,"type":"article-journal","abstract":"Many plant species are thought to benefit from mast seeding as a result of increased seed survival through predator satiation. However, in communities with many different masting species, lack of synchrony in seed production among species may decrease seed survival by maintaining seed predator populations through the intermast cycle. Similarly, masting by different plant species may have different effects on the seed predator community. We conducted a three‐year study in a northeastern USA temperate deciduous forest to determine if production of large seed crops by several tree species was synchronous, and if they had similar effects on all small mammal species. We found that red oak mast crops resulted in increased densities of\n              Peromyscus leucopus\n              and\n              P. maniculatus\n              , but had no effect on\n              Clethrionomys gapperi\n              abundance. Conversely,\n              C. gapperi\n              populations, but not\n              Peromyscus\n              populations, appeared to increase in response to a large red maple seed crop. Differences in small mammal abundance resulted in changes in species‐specific seed survival: in the year of abundant\n              C. gapperi\n              , experimentally placed red oak acorns had significantly higher survival than in the year of high\n              Peromyscus\n              abundance. Red oak acorn removal was positively correlated with\n              Peromyscus\n              abundance, while red maple seed removal was significantly higher with increased\n              C. gapperi\n              abundance. Thus, species‐specific seed production had differential effects on subsequent small mammal abundance, which in turn affected seed survival. We suggest that at the level of the community, even short‐term lack of synchrony in production of large seed crops can cause variation in postdispersal seed survival, through differential effects on the community of small mammal seed predators.","container-title":"Oikos","DOI":"10.1034/j.1600-0706.2002.960302.x","ISSN":"0030-1299, 1600-0706","issue":"3","journalAbbreviation":"Oikos","language":"en","page":"402-410","source":"DOI.org (Crossref)","title":"Direct and indirect effects of masting on rodent populations and tree seed survival","volume":"96","author":[{"family":"Schnurr","given":"Jaclyn L."},{"family":"Ostfeld","given":"Richard S."},{"family":"Canham","given":"Charles D."}],"issued":{"date-parts":[["2002",3]]}}}],"schema":"https://github.com/citation-style-language/schema/raw/master/csl-citation.json"} </w:instrText>
+      </w:r>
+      <w:r>
+        <w:fldChar w:fldCharType="separate"/>
+      </w:r>
+      <w:r>
+        <w:rPr>
+          <w:noProof/>
+        </w:rPr>
+        <w:t>(Boutin et al., 2006; Schnurr et al., 2002)</w:t>
+      </w:r>
+      <w:r>
+        <w:fldChar w:fldCharType="end"/>
+      </w:r>
+      <w:r>
+        <w:t xml:space="preserve">. This population growth has implications not only for seed predation and dispersal, </w:t>
+      </w:r>
+      <w:r>
+        <w:lastRenderedPageBreak/>
+        <w:t xml:space="preserve">but also other ecosystem functions and services (e.g., food web responses and disease dynamics </w:t>
+      </w:r>
+      <w:r>
+        <w:fldChar w:fldCharType="begin"/>
+      </w:r>
+      <w:r>
+        <w:instrText xml:space="preserve"> ADDIN ZOTERO_ITEM CSL_CITATION {"citationID":"SmgUSONs","properties":{"formattedCitation":"(Bogdziewicz et al., 2016; Bregnard et al., 2021; Ostfeld &amp; Keesing, 2000)","plainCitation":"(Bogdziewicz et al., 2016; Bregnard et al., 2021; Ostfeld &amp; Keesing, 2000)","noteIndex":0},"citationItems":[{"id":2991,"uris":["http://zotero.org/groups/5634119/items/8NUB2F2E"],"itemData":{"id":2991,"type":"article-journal","abstract":"Mast‐seeding is the synchronized and intermittent production of a large seed crop by a population of plants. The cascading effects of masting on wildlife have been well documented in granivorous rodents. Yet, the effects of mast‐seeding are potentially further reaching, since a number of generalist species can take advantage of mast years. We employed a full‐text search algorithm to identify all papers that discussed effects of mast‐seeding on wildlife, in addition to typical searches of titles and abstracts. We aimed to evaluate the breadth of wildlife species for which mast years are thought to be important drivers. In addition, we tested three hypotheses derived from past reviews: 1) species with lower reproductive potential (lower average litter size) are more likely to show aggregative responses to mast‐seeding, 2) species with lower body sizes (lower mobility) are more likely to show reproductive responses, and 3) indirect consumers of mast (predators) are more likely to show aggregative responses than direct consumers. We found 186 articles including reports of response of 122 species of vertebrates to mast‐seeding. Expectations were partly confirmed: relationships 1) and 2) held for mammals, but not for birds. However, 3) direct consumers were more likely than indirect consumers to show aggregative responses. Our tests of the first two hypotheses question the generality of past predictions for taxa other than mammals. Our test of the third hypothesis suggests that responses of direct and indirect consumers might depend on the type of resource pulse. Many of the examples in our analysis come from systems in which wildlife responses to mast have been less rigorously documented than the examples in past reviews. They suggest the range of wildlife responses to mast‐seeding are more taxonomically and ecologically diverse than past reviews have widely recognized and point to directions for future research.\n            \n              \n                \n                  Synthesis\n                \n                Mast seeding is a pulsed resource with numerous cascading effects on wildlife. Yet, because masting is largely unpredictable, it is inherently difficult to study. We developed a full‐text search algorithm to identify incidental reports as well as deliberate studies of vertebrate reactions to masting. We found that the type of response to mast seeding (reproductive or through immigration) varies predictably as a function of life history traits (litter size and body mass) in mammals, but not in birds.  Our literature search also shows that responses to mast‐seeding are more taxonomically and ecologically diverse than past reviews have recognized.","container-title":"Oikos","DOI":"10.1111/oik.03012","ISSN":"0030-1299, 1600-0706","issue":"3","journalAbbreviation":"Oikos","language":"en","page":"300-307","source":"DOI.org (Crossref)","title":"How do vertebrates respond to mast seeding?","volume":"125","author":[{"family":"Bogdziewicz","given":"Michał"},{"family":"Zwolak","given":"Rafał"},{"family":"Crone","given":"Elizabeth E."}],"issued":{"date-parts":[["2016",3]]}}},{"id":2988,"uris":["http://zotero.org/groups/5634119/items/VDENFAUA"],"itemData":{"id":2988,"type":"article-journal","abstract":"Abstract\n            \n              Background\n              \n                The incidence of Lyme borreliosis and other tick-borne diseases is increasing in Europe and North America. There is currently much interest in identifying the ecological factors that determine the density of infected ticks as this variable determines the risk of Lyme borreliosis to vertebrate hosts, including humans. Lyme borreliosis is caused by the bacterium\n                Borrelia burgdorferi\n                sensu lato (s.l.) and in western Europe, the hard tick\n                Ixodes ricinus\n                is the most important vector.\n              \n            \n            \n              Methods\n              \n                Over a 15-year period (2004–2018), we monitored the monthly abundance of\n                I. ricinus\n                ticks (nymphs and adults) and their\n                B. burgdorferi\n                s.l. infection status at four different elevations on a mountain in western Switzerland. We collected climate variables in the field and from nearby weather stations. We obtained data on beech tree seed production (masting) from the literature, as the abundance of\n                Ixodes\n                nymphs can increase dramatically 2 years after a masting event. We used generalized linear mixed effects models and AIC-based model selection to identify the ecological factors that influence inter-annual variation in the nymphal infection prevalence (NIP) and the density of infected nymphs (DIN).\n              \n            \n            \n              Results\n              \n                We found that the NIP decreased by 78% over the study period. Inter-annual variation in the NIP was explained by the mean precipitation in the present year, and the duration that the DNA extraction was stored in the freezer prior to pathogen detection. The DIN decreased over the study period at all four elevation sites, and the decrease was significant at the top elevation. Inter-annual variation in the DIN was best explained by elevation site, year, beech tree masting index 2 years prior and the mean relative humidity in the present year. This is the first study in Europe to demonstrate that seed production by deciduous trees influences the density of nymphs infected with\n                B. burgdorferi\n                s.l. and hence the risk of Lyme borreliosis.\n              \n            \n            \n              Conclusions\n              Public health officials in Europe should be aware that masting by deciduous trees is an important predictor of the risk of Lyme borreliosis.\n            \n            \n              Graphical Abstract","container-title":"Parasites &amp; Vectors","DOI":"10.1186/s13071-021-04646-0","ISSN":"1756-3305","issue":"1","journalAbbreviation":"Parasites Vectors","language":"en","page":"168","source":"DOI.org (Crossref)","title":"Masting by beech trees predicts the risk of Lyme disease","volume":"14","author":[{"family":"Bregnard","given":"Cindy"},{"family":"Rais","given":"Olivier"},{"family":"Voordouw","given":"Maarten Jeroen"}],"issued":{"date-parts":[["2021",3,20]]}}},{"id":2990,"uris":["http://zotero.org/groups/5634119/items/EW2YI756"],"itemData":{"id":2990,"type":"article-journal","container-title":"Trends in Ecology &amp; Evolution","DOI":"10.1016/S0169-5347(00)01862-0","ISSN":"01695347","issue":"6","journalAbbreviation":"Trends in Ecology &amp; Evolution","language":"en","license":"https://www.elsevier.com/tdm/userlicense/1.0/","page":"232-237","source":"DOI.org (Crossref)","title":"Pulsed resources and community dynamics of consumers in terrestrial ecosystems","volume":"15","author":[{"family":"Ostfeld","given":"Richard S."},{"family":"Keesing","given":"Felicia"}],"issued":{"date-parts":[["2000",6]]}}}],"schema":"https://github.com/citation-style-language/schema/raw/master/csl-citation.json"} </w:instrText>
+      </w:r>
+      <w:r>
+        <w:fldChar w:fldCharType="separate"/>
+      </w:r>
+      <w:r>
+        <w:rPr>
+          <w:noProof/>
+        </w:rPr>
+        <w:t>(Bogdziewicz et al., 2016; Bregnard et al., 2021; Ostfeld &amp; Keesing, 2000)</w:t>
+      </w:r>
+      <w:r>
+        <w:fldChar w:fldCharType="end"/>
+      </w:r>
+      <w:r>
+        <w:t xml:space="preserve">. While we did not observe a “predictive” or synchronous abundance response in pinyon jays (postulated in Ligon, 1978), we did observe that the effects of masting years in two-needle pinyon pine have lasting effects on population dynamics for at least three years (Figure </w:t>
+      </w:r>
+      <w:r>
+        <w:t>3</w:t>
+      </w:r>
+      <w:r>
+        <w:t xml:space="preserve">). Further, we expect that these lagged responses are due to multiple mechanisms. The first, and stronger, mechanism (~63% of covariate importance weight) is that </w:t>
+      </w:r>
+      <w:proofErr w:type="spellStart"/>
+      <w:r>
+        <w:t>birds</w:t>
+      </w:r>
+      <w:proofErr w:type="spellEnd"/>
+      <w:r>
+        <w:t xml:space="preserve"> nest in the spring near cache sites from the previous fall </w:t>
+      </w:r>
+      <w:r>
+        <w:fldChar w:fldCharType="begin"/>
+      </w:r>
+      <w:r>
+        <w:instrText xml:space="preserve"> ADDIN ZOTERO_ITEM CSL_CITATION {"citationID":"qX3Ix4dt","properties":{"formattedCitation":"(Stotz &amp; Balda, 1995)","plainCitation":"(Stotz &amp; Balda, 1995)","noteIndex":0},"citationItems":[{"id":2860,"uris":["http://zotero.org/groups/5634119/items/MRSH59Y5"],"itemData":{"id":2860,"type":"article-journal","container-title":"The Southwestern Naturalist","issue":"2","page":"180-184","title":"Cache and recovery behavior of wild pinyon jays in northern Arizona","volume":"40","author":[{"family":"Stotz","given":"Nancy G."},{"family":"Balda","given":"Russell P."}],"issued":{"date-parts":[["1995"]]}}}],"schema":"https://github.com/citation-style-language/schema/raw/master/csl-citation.json"} </w:instrText>
+      </w:r>
+      <w:r>
+        <w:fldChar w:fldCharType="separate"/>
+      </w:r>
+      <w:r>
+        <w:rPr>
+          <w:noProof/>
+        </w:rPr>
+        <w:t>(Stotz &amp; Balda, 1995)</w:t>
+      </w:r>
+      <w:r>
+        <w:fldChar w:fldCharType="end"/>
+      </w:r>
+      <w:r>
+        <w:t xml:space="preserve">. The second, weaker, mechanism (13-21% of covariate importance weight), is likely a delayed population response from mast-year fledglings maturing to the breeding population (1.5-2 years after fledging; </w:t>
+      </w:r>
+      <w:r>
+        <w:fldChar w:fldCharType="begin"/>
+      </w:r>
+      <w:r>
+        <w:instrText xml:space="preserve"> ADDIN ZOTERO_ITEM CSL_CITATION {"citationID":"QBZapt7l","properties":{"formattedCitation":"(Marzluff &amp; Balda, 1988)","plainCitation":"(Marzluff &amp; Balda, 1988)","noteIndex":0},"citationItems":[{"id":2861,"uris":["http://zotero.org/groups/5634119/items/CQUD9PTD"],"itemData":{"id":2861,"type":"article-journal","container-title":"The Auk","DOI":"10.2307/4087492","ISSN":"0004-8038, 1938-4254","issue":"2","note":"publisher: Oxford University Press (OUP)","page":"286-295","source":"Crossref","title":"The Advantages of, and Constraints Forcing, Mate Fidelity in Pinyon Jays","volume":"105","author":[{"family":"Marzluff","given":"John M."},{"family":"Balda","given":"Russell P."}],"issued":{"date-parts":[["1988",4]]}}}],"schema":"https://github.com/citation-style-language/schema/raw/master/csl-citation.json"} </w:instrText>
+      </w:r>
+      <w:r>
+        <w:fldChar w:fldCharType="separate"/>
+      </w:r>
+      <w:r>
+        <w:rPr>
+          <w:noProof/>
+        </w:rPr>
+        <w:t>(Marzluff &amp; Balda, 1988)</w:t>
+      </w:r>
+      <w:r>
+        <w:fldChar w:fldCharType="end"/>
+      </w:r>
+      <w:r>
+        <w:t xml:space="preserve">. Temporal delays are common in trophic interactions, including seed dispersal, though they are often discounted in food web and interaction network models </w:t>
+      </w:r>
+      <w:r>
+        <w:fldChar w:fldCharType="begin"/>
+      </w:r>
+      <w:r>
+        <w:instrText xml:space="preserve"> ADDIN ZOTERO_ITEM CSL_CITATION {"citationID":"wVlDcmr5","properties":{"formattedCitation":"(Yang et al., 2023)","plainCitation":"(Yang et al., 2023)","noteIndex":0},"citationItems":[{"id":2992,"uris":["http://zotero.org/groups/5634119/items/QAH9W9BL"],"itemData":{"id":2992,"type":"article-journal","abstract":"Abstract\n            What drives the stability, or instability, of complex ecosystems? This question sits at the heart of community ecology and has motivated a large body of theoretical work exploring how community properties shape ecosystem dynamics. However, the overwhelming majority of current theory assumes that species interactions are instantaneous, meaning that changes in the abundance of one species will lead to immediate changes in the abundances of its partners. In practice, time delays in how species respond to one another are widespread across ecological contexts, yet the impact of these delays on ecosystems remains unclear. Here we derive a new body of theory to comprehensively study the impact of time delays on ecological stability. We find that time delays are important for ecosystem stability. Large delays are typically destabilizing but, surprisingly, short delays can substantially increase community stability. Moreover, in stark contrast to delay-free systems, delays dictate that communities with more abundant species can be less stable than ones with less abundant species. Finally, we show that delays fundamentally shift how species interactions impact ecosystem stability, with communities of mixed interaction types becoming the most stable class of ecosystem. Our work demonstrates that time delays can be critical for the stability of complex ecosystems.","container-title":"Nature Ecology &amp; Evolution","DOI":"10.1038/s41559-023-02158-x","ISSN":"2397-334X","issue":"10","journalAbbreviation":"Nat Ecol Evol","language":"en","page":"1610-1619","source":"DOI.org (Crossref)","title":"Time delays modulate the stability of complex ecosystems","volume":"7","author":[{"family":"Yang","given":"Yuguang"},{"family":"Foster","given":"Kevin R."},{"family":"Coyte","given":"Katharine Z."},{"family":"Li","given":"Aming"}],"issued":{"date-parts":[["2023",8,17]]}}}],"schema":"https://github.com/citation-style-language/schema/raw/master/csl-citation.json"} </w:instrText>
+      </w:r>
+      <w:r>
+        <w:fldChar w:fldCharType="separate"/>
+      </w:r>
+      <w:r>
+        <w:rPr>
+          <w:noProof/>
+        </w:rPr>
+        <w:t>(Yang et al., 2023)</w:t>
+      </w:r>
+      <w:r>
+        <w:fldChar w:fldCharType="end"/>
+      </w:r>
+      <w:r>
+        <w:t xml:space="preserve">. In any system, understanding these delayed responses and their mechanisms will aid in building better predictive models of species interactions </w:t>
+      </w:r>
+      <w:r>
+        <w:fldChar w:fldCharType="begin"/>
+      </w:r>
+      <w:r>
+        <w:instrText xml:space="preserve"> ADDIN ZOTERO_ITEM CSL_CITATION {"citationID":"1kLkKsy9","properties":{"formattedCitation":"(Poisot et al., 2015)","plainCitation":"(Poisot et al., 2015)","noteIndex":0},"citationItems":[{"id":2996,"uris":["http://zotero.org/groups/5634119/items/98XVULPE"],"itemData":{"id":2996,"type":"article-journal","abstract":"Community ecology is tasked with the considerable challenge of predicting the structure, and properties, of emerging ecosystems. It requires the ability to understand how and why species interact, as this will allow the development of mechanism‐based predictive models, and as such to better characterize how ecological mechanisms act locally on the existence of inter‐specific interactions. Here we argue that the current conceptualization of species interaction networks is ill‐suited for this task. Instead, we propose that future research must start to account for the intrinsic variability of species interactions, then scale up from here onto complex networks. This can be accomplished simply by recognizing that there exists intra‐specific variability, in traits or properties related to the establishment of species interactions. By shifting the scale towards population‐based processes, we show that this new approach will improve our predictive ability and mechanistic understanding of how species interact over large spatial or temporal scales.\n            \n              \n                \n                  Synthesis\n                \n                Although species interactions are the backbone of ecological communities, we have little insights on how (and why) they vary through space and time. In this article, we build on existing empirical literature to show that the same species may happen to interact in different ways when their local abundances vary, their trait distribution changes, or when the environment affects either of these factors. We discuss how these findings can be integrated in existing frameworks for the analysis and simulation of species interactions.","container-title":"Oikos","DOI":"10.1111/oik.01719","ISSN":"0030-1299, 1600-0706","issue":"3","journalAbbreviation":"Oikos","language":"en","page":"243-251","source":"DOI.org (Crossref)","title":"Beyond species: why ecological interaction networks vary through space and time","title-short":"Beyond species","volume":"124","author":[{"family":"Poisot","given":"Timothée"},{"family":"Stouffer","given":"Daniel B."},{"family":"Gravel","given":"Dominique"}],"issued":{"date-parts":[["2015",3]]}}}],"schema":"https://github.com/citation-style-language/schema/raw/master/csl-citation.json"} </w:instrText>
+      </w:r>
+      <w:r>
+        <w:fldChar w:fldCharType="separate"/>
+      </w:r>
+      <w:r>
+        <w:rPr>
+          <w:noProof/>
+        </w:rPr>
+        <w:t>(Poisot et al., 2015)</w:t>
+      </w:r>
+      <w:r>
+        <w:fldChar w:fldCharType="end"/>
+      </w:r>
+      <w:r>
+        <w:t xml:space="preserve">. Delayed effects may be particularly important to understand in systems with resource pulses (like masting), since they can link population fluctuations to proximal causes </w:t>
+      </w:r>
+      <w:r>
+        <w:t>in systems with high dynamism</w:t>
+      </w:r>
+      <w:r>
+        <w:t xml:space="preserve"> </w:t>
+      </w:r>
+      <w:r>
+        <w:fldChar w:fldCharType="begin"/>
+      </w:r>
+      <w:r>
+        <w:instrText xml:space="preserve"> ADDIN ZOTERO_ITEM CSL_CITATION {"citationID":"fcHmoNab","properties":{"formattedCitation":"(Clark et al., 2019)","plainCitation":"(Clark et al., 2019)","noteIndex":0},"citationItems":[{"id":2998,"uris":["http://zotero.org/groups/5634119/items/U6KQ2STX"],"itemData":{"id":2998,"type":"article-journal","abstract":"Abstract\n            \n              Mast‐fruiting trees represent a pulsed resource that both supports and destabilizes consumer populations. Whereas a reliable resource is abundant on average and with limited variation in time and space, masting is volatile and localized, and that variability ramifies throughout food‐webs. Theory is developed to evaluate how the space–time structure of masting interacts with consumers who exploit alternative hosts, forage widely in space, and store reserves in time. We derive the space–time–species covariance in resource supply and combine it with the space–time–diet breadth of consumers, or ambit. Direct connection to data is made possible with Mast Inference and Forecasting (\n              MASTIF\n              ), a state‐space autoregressive model that fits seed‐trap and canopy observations and predicts resource availability within the canopy and on the forest floor with full uncertainty. A resource score can be assigned to each consumer–habitat combination that integrates the benefits of a high mean supply weighed against the variance cost. As the consumer ambit increases, the volatility of an unreliable resource shifts from a variance cost to a mean benefit. Consumers foraging in the canopy (arboreal arthropods and rodents, song birds) experience space‐time covariance between host trees. Consumers on the forest floor (seed and damping‐off fungi, arthropods, rodents, ground‐nesting birds, mammals) experience instead a redistribution of that covariance by dispersal. For consumers lacking mobility, demographic storage in the form of episodic birth cohorts following mast years is important for population persistence. Consumers additionally compensate volatility with diet breadth. Depending on the dominant masting strategies of host tree species in the diet, habitats differentially limit consumers depending on the misalignment between consumer ambit and spatiotemporal covariance of hosts. The impact of adding or subtracting a diet item can be gauged with the standard error (\n              SE\n              ) rule or the benefit of an added diet item balanced against the variance cost, both of which depend on the existing diet, the abundance of the new host, and the consumer's foraging ambit. Results rank habitats by their capacities to support wildlife and other consumers from a resource perspective. Results are connected directly to data, with full uncertainty, by\n              MASTIF\n              .","container-title":"Ecological Monographs","DOI":"10.1002/ecm.1381","ISSN":"0012-9615, 1557-7015","issue":"4","journalAbbreviation":"Ecological Monographs","language":"en","page":"e01381","source":"DOI.org (Crossref)","title":"Foodwebs based on unreliable foundations: spatiotemporal masting merged with consumer movement, storage, and diet","title-short":"Foodwebs based on unreliable foundations","volume":"89","author":[{"family":"Clark","given":"James S."},{"family":"Nuñez","given":"Chase L."},{"family":"Tomasek","given":"Bradley"}],"issued":{"date-parts":[["2019",11]]}}}],"schema":"https://github.com/citation-style-language/schema/raw/master/csl-citation.json"} </w:instrText>
+      </w:r>
+      <w:r>
+        <w:fldChar w:fldCharType="separate"/>
+      </w:r>
+      <w:r>
+        <w:rPr>
+          <w:noProof/>
+        </w:rPr>
+        <w:t>(Clark et al., 2019)</w:t>
+      </w:r>
+      <w:r>
+        <w:fldChar w:fldCharType="end"/>
+      </w:r>
+      <w:r>
+        <w:t>.</w:t>
+      </w:r>
     </w:p>
     <w:p>
       <w:pPr>
         <w:pStyle w:val="BodyText"/>
         <w:ind w:firstLine="720"/>
       </w:pPr>
+      <w:r>
+        <w:t xml:space="preserve">Understanding the context dependence of species interactions helps predict current and future ecosystem states given ongoing anthropogenic changes (e.g., </w:t>
+      </w:r>
+      <w:r>
+        <w:fldChar w:fldCharType="begin"/>
+      </w:r>
+      <w:r>
+        <w:instrText xml:space="preserve"> ADDIN ZOTERO_ITEM CSL_CITATION {"citationID":"CiZM8YcL","properties":{"formattedCitation":"(Liu &amp; Gaines, 2022; Polazzo et al., 2022)","plainCitation":"(Liu &amp; Gaines, 2022; Polazzo et al., 2022)","noteIndex":0},"citationItems":[{"id":2994,"uris":["http://zotero.org/groups/5634119/items/U3VNYJAY"],"itemData":{"id":2994,"type":"article-journal","abstract":"Significance\n            Multiple anthropogenic disturbances affect the structure and functioning of communities. Recent evidence highlighted that, after pulse disturbance, the functioning a community performs may be recovered fast due to functional redundancy, whereas community multivariate composition needs a longer time. Yet, the mechanisms that drive the different community recovery times have not been quantified empirically. We use quantitative food-web analysis to assess the influence of species interactions on community recovery. We found species-interactions strength to be the main mechanism driving differences between structural and functional recovery. Additionally, we show that interactions between multiple disturbances appear in the long term only when both species-interaction strength and food-web architecture change significantly.\n          , \n            Ecological communities are constantly exposed to multiple natural and anthropogenic disturbances. Multivariate composition (if recovered) has been found to need significantly more time to be regained after pulsed disturbance compared to univariate diversity metrics and functional endpoints. However, the mechanisms driving the different recovery times of communities to single and multiple disturbances remain unexplored. Here, we apply quantitative ecological network analyses to try to elucidate the mechanisms driving long-term community-composition dissimilarity and late-stage disturbance interactions at the community level. For this, we evaluate the effects of two pesticides, nutrient enrichment, and their interactions in outdoor mesocosms containing a complex freshwater community. We found changes in interactions strength to be strongly related to compositional changes and identified postdisturbance interaction-strength rewiring to be responsible for most of the observed compositional changes. Additionally, we found pesticide interactions to be significant in the long term only when both interaction strength and food-web architecture are reshaped by the disturbances. We suggest that quantitative network analysis has the potential to unveil ecological processes that prevent long-term community recovery.","container-title":"Proceedings of the National Academy of Sciences","DOI":"10.1073/pnas.2117364119","ISSN":"0027-8424, 1091-6490","issue":"17","journalAbbreviation":"Proc. Natl. Acad. Sci. U.S.A.","language":"en","page":"e2117364119","source":"DOI.org (Crossref)","title":"Food web rewiring drives long-term compositional differences and late-disturbance interactions at the community level","volume":"119","author":[{"family":"Polazzo","given":"Francesco"},{"family":"Marina","given":"Tomás I."},{"family":"Crettaz-Minaglia","given":"Melina"},{"family":"Rico","given":"Andreu"}],"issued":{"date-parts":[["2022",4,26]]}}},{"id":3001,"uris":["http://zotero.org/groups/5634119/items/LW73UBXP"],"itemData":{"id":3001,"type":"article-journal","abstract":"Ecological interactions are not uniform across time and can vary with environmental conditions. Yet, interactions among species are often measured with short-term controlled experiments whose outcomes can depend greatly on the particular environmental conditions under which they are performed. As an alternative, we use empirical dynamic modeling to estimate species interactions across a wide range of environmental conditions directly from existing long-term monitoring data. In our case study from a southern California kelp forest, we test whether interactions between multiple kelp and sea urchin species can be reliably reconstructed from time-series data and whether those interactions vary predictably in strength and direction across observed fluctuations in temperature, disturbance, and low-frequency oceanographic regimes. We show that environmental context greatly alters the strength and direction of species interactions. In particular, the state of the North Pacific Gyre Oscillation seems to drive the competitive balance between kelp species, asserting bottom-up control on kelp ecosystem dynamics. We show the importance of specifically studying variation in interaction strength, rather than mean interaction outcomes, when trying to understand the dynamics of complex ecosystems. The significant context dependency in species interactions found in this study argues for a greater utilization of long-term data and empirical dynamic modeling in studies of the dynamics of other ecosystems.","container-title":"Proceedings of the National Academy of Sciences","DOI":"10.1073/pnas.2118539119","ISSN":"0027-8424, 1091-6490","issue":"36","journalAbbreviation":"Proc. Natl. Acad. Sci. U.S.A.","language":"en","page":"e2118539119","source":"DOI.org (Crossref)","title":"Environmental context dependency in species interactions","volume":"119","author":[{"family":"Liu","given":"Owen R."},{"family":"Gaines","given":"Steven D."}],"issued":{"date-parts":[["2022",9,6]]}}}],"schema":"https://github.com/citation-style-language/schema/raw/master/csl-citation.json"} </w:instrText>
+      </w:r>
+      <w:r>
+        <w:fldChar w:fldCharType="separate"/>
+      </w:r>
+      <w:r>
+        <w:rPr>
+          <w:noProof/>
+        </w:rPr>
+        <w:t>(Liu &amp; Gaines, 2022; Polazzo et al., 2022)</w:t>
+      </w:r>
+      <w:r>
+        <w:fldChar w:fldCharType="end"/>
+      </w:r>
+      <w:r>
+        <w:t xml:space="preserve">. However, context dependent results are most useful if variation can be explained by consistent patterns or mechanisms </w:t>
+      </w:r>
+      <w:r>
+        <w:fldChar w:fldCharType="begin"/>
+      </w:r>
+      <w:r>
+        <w:instrText xml:space="preserve"> ADDIN ZOTERO_ITEM CSL_CITATION {"citationID":"5uRoylcG","properties":{"formattedCitation":"(Catford et al., 2022)","plainCitation":"(Catford et al., 2022)","noteIndex":0},"citationItems":[{"id":2999,"uris":["http://zotero.org/groups/5634119/items/VT4SLK2C"],"itemData":{"id":2999,"type":"article-journal","container-title":"Trends in Ecology &amp; Evolution","DOI":"10.1016/j.tree.2021.09.007","ISSN":"01695347","issue":"2","journalAbbreviation":"Trends in Ecology &amp; Evolution","language":"en","page":"158-170","source":"DOI.org (Crossref)","title":"Addressing context dependence in ecology","volume":"37","author":[{"family":"Catford","given":"Jane A."},{"family":"Wilson","given":"John R.U."},{"family":"Pyšek","given":"Petr"},{"family":"Hulme","given":"Philip E."},{"family":"Duncan","given":"Richard P."}],"issued":{"date-parts":[["2022",2]]}}}],"schema":"https://github.com/citation-style-language/schema/raw/master/csl-citation.json"} </w:instrText>
+      </w:r>
+      <w:r>
+        <w:fldChar w:fldCharType="separate"/>
+      </w:r>
+      <w:r>
+        <w:rPr>
+          <w:noProof/>
+        </w:rPr>
+        <w:t>(Catford et al., 2022)</w:t>
+      </w:r>
+      <w:r>
+        <w:fldChar w:fldCharType="end"/>
+      </w:r>
+      <w:r>
+        <w:t xml:space="preserve">. We found two predictable patterns in the context dependence of the relationship between pinyon jays and pinyon pine seeds. First, jays rely more on cones following climatic conditions that may be unfavorable for reproduction and population growth (lagged effects of temperature and precipitation, Figure </w:t>
+      </w:r>
+      <w:r>
+        <w:t>5</w:t>
+      </w:r>
+      <w:r>
+        <w:t xml:space="preserve"> a </w:t>
+      </w:r>
+      <w:r>
+        <w:lastRenderedPageBreak/>
+        <w:t xml:space="preserve">and b; </w:t>
+      </w:r>
+      <w:r>
+        <w:fldChar w:fldCharType="begin"/>
+      </w:r>
+      <w:r>
+        <w:instrText xml:space="preserve"> ADDIN ZOTERO_ITEM CSL_CITATION {"citationID":"wCJt3ADZ","properties":{"formattedCitation":"(Ligon, 1978; Marzluff, 1988)","plainCitation":"(Ligon, 1978; Marzluff, 1988)","noteIndex":0},"citationItems":[{"id":2753,"uris":["http://zotero.org/groups/5634119/items/4RGGXF3K"],"itemData":{"id":2753,"type":"article-journal","abstract":"Pinon Jays (Gymnorhinus cyanoephalus) and pinon pine trees (Pinus edulis) interact in a mutualistic fashion, in that the jays provide a primary means of seed dissemination for pinon trees in the Southwest, while at irregular intervals the trees provide the jays with an abundant and highly nutritious source of food. Availability of pinon seeds permits both late winter (February) and late summer (August) breeding by the jays. Seeds and photoperiod interact synergistically to accelerate gonadal development in late winter. When seeds are abundant, considerable testis growth takes place in some Pinon Jay ♂ ♂ even before the winter solstice. This relationship was investigated experimentally. Use of a specific food (pinon seeds) as a proximate timer for breeding, the ability of individual jays to breed in spring, molt, and breed again in August without an intervening period of gonadal refractoriness, and testicular development in early December, when day length approaches its minimum, are extraordinary characteristics among north—temperate—zone passerine birds. The synchrony of seed production by pinon pines over large geographic areas is interpreted as an evolved mechanism that (1) overwhelms invertebrate seed and cone predators, and (2) increases the numbers of seeds per tree that will be cached by Pinon Jays and other vertebrates. Caching sites of Pinon Jays are often at locations especially conducive to germination and growth of pinon pine seedlings.","container-title":"Ecological Monographs","DOI":"10.2307/2937295","ISSN":"0012-9615, 1557-7015","issue":"2","journalAbbreviation":"Ecological Monographs","language":"en","license":"http://onlinelibrary.wiley.com/termsAndConditions#vor","page":"111-126","source":"DOI.org (Crossref)","title":"Reproductive Interdependence of Pinon Jays and Pinon Pines","volume":"48","author":[{"family":"Ligon","given":"J. David"}],"issued":{"date-parts":[["1978",3]]}}},{"id":2862,"uris":["http://zotero.org/groups/5634119/items/PYGWLTH3"],"itemData":{"id":2862,"type":"article-journal","container-title":"Animal Behaviour","DOI":"10.1016/s0003-3472(88)80244-6","ISSN":"0003-3472","issue":"1","language":"en","license":"https://www.elsevier.com/tdm/userlicense/1.0/","note":"publisher: Elsevier BV","page":"1-10","source":"Crossref","title":"Do pinyon jays alter nest placement based on prior experience?","volume":"36","author":[{"family":"Marzluff","given":"John M."}],"issued":{"date-parts":[["1988",2]]}}}],"schema":"https://github.com/citation-style-language/schema/raw/master/csl-citation.json"} </w:instrText>
+      </w:r>
+      <w:r>
+        <w:fldChar w:fldCharType="separate"/>
+      </w:r>
+      <w:r>
+        <w:rPr>
+          <w:noProof/>
+        </w:rPr>
+        <w:t>(Ligon, 1978; Marzluff, 1988)</w:t>
+      </w:r>
+      <w:r>
+        <w:fldChar w:fldCharType="end"/>
+      </w:r>
+      <w:r>
+        <w:t xml:space="preserve">. Second, jays rely less on cones in areas with more favorable habitat (higher pinyon pine basal area and higher North American Monsoon influence; Figure </w:t>
+      </w:r>
+      <w:r>
+        <w:t xml:space="preserve">5 </w:t>
+      </w:r>
+      <w:r>
+        <w:t xml:space="preserve">c and d; </w:t>
+      </w:r>
+      <w:r>
+        <w:fldChar w:fldCharType="begin"/>
+      </w:r>
+      <w:r>
+        <w:instrText xml:space="preserve"> ADDIN ZOTERO_ITEM CSL_CITATION {"citationID":"RlgxL6Qz","properties":{"formattedCitation":"(Boone et al., 2018; Johnson et al., 2016; Ligon, 1978; Neilson &amp; Wullstein, 1983; Van Lanen et al., 2023)","plainCitation":"(Boone et al., 2018; Johnson et al., 2016; Ligon, 1978; Neilson &amp; Wullstein, 1983; Van Lanen et al., 2023)","noteIndex":0},"citationItems":[{"id":2748,"uris":["http://zotero.org/groups/5634119/items/YTCPHGE5"],"itemData":{"id":2748,"type":"chapter","abstract":"The Pinyon Jay (Gymnorhinus cyanocephalus) is closely associated with piñon–juniper woodlands in the Intermountain West and Southwest regions of the United States. It is of conservation concern, given it is one of the landbirds declining the fastest and most persistently in these regions, at an average rate of –3.6% from 1968 to 2015, according to the Breeding Bird Survey. Despite the population’s falling by &gt;50% over this period, the Pinyon Jay has not been widely studied, and little is known about the factors responsible for its diminishing numbers. Although the Pinyon Jay’s rate of decline exceeds that of the Greater SageGrouse (Centrocercus urophasianus)—a species targeted for significant conservation efforts—no comprehensive effort designed to benefit this jay has been implemented. Current management in Great Basin piñon–juniper woodlands includes removal of trees to create or protect shrublands for the benefit of sage-grouse and other sagebrush-associated wildlife, and southwestern piñon–juniper woodlands are being thinned for fuels reduction or management of other wildlife. The effect of these treatments on the Pinyon Jay and other piñon–juniper birds, however, has been little studied. Thus further research is needed to clarify the causes of the jay’s decline, develop habitat models for this and other piñon–juniper species, and devise approaches for management of piñon–juniper woodland that balance the interests of the Pinyon Jay and other species of concern, including the Greater Sage-Grouse.","container-title":"Trends and Traditions: Avifaunal Change in Western North America","ISBN":"978-0-9790585-3-0","note":"DOI: 10.21199/SWB3.10","page":"190-197","publisher":"Western Field Ornithologists","source":"DOI.org (Crossref)","title":"Long-term declines in the Pinyon Jay and management implications for piñon–juniper woodlands","URL":"https://westernfieldornithologists.org/docs/2020/Avifaunal_Change/Boone/Boone-Avifaunal_Change.pdf","container-author":[{"family":"Shuford","given":"W. David"},{"family":"Gill","given":"Robert E."},{"family":"Handel","given":"Colleen M."}],"author":[{"family":"Boone","given":"John D."},{"family":"Ammon","given":"Elisabeth"},{"family":"Johnson","given":"Kristine"}],"accessed":{"date-parts":[["2024",10,10]]},"issued":{"date-parts":[["2018",9,1]]}}},{"id":2903,"uris":["http://zotero.org/groups/5634119/items/XYDLLE9X"],"itemData":{"id":2903,"type":"article-journal","container-title":"Avian Conservation and Ecology","DOI":"10.5751/ace-00890-110206","ISSN":"1712-6568","issue":"2","journalAbbreviation":"ACE","language":"en","note":"publisher: Resilience Alliance, Inc.","source":"Crossref","title":"Home range- and colony-scale habitat models for Pinyon Jays in piñon-juniper woodlands of New Mexico, USA","URL":"http://www.ace-eco.org/vol11/iss2/art6/","volume":"11","author":[{"family":"Johnson","given":"Kristine"},{"family":"Neville","given":"Teri B."},{"family":"Smith","given":"Jacqueline W."},{"family":"Horner","given":"Mark W."}],"accessed":{"date-parts":[["2025",7,16]]},"issued":{"date-parts":[["2016"]]}}},{"id":2753,"uris":["http://zotero.org/groups/5634119/items/4RGGXF3K"],"itemData":{"id":2753,"type":"article-journal","abstract":"Pinon Jays (Gymnorhinus cyanoephalus) and pinon pine trees (Pinus edulis) interact in a mutualistic fashion, in that the jays provide a primary means of seed dissemination for pinon trees in the Southwest, while at irregular intervals the trees provide the jays with an abundant and highly nutritious source of food. Availability of pinon seeds permits both late winter (February) and late summer (August) breeding by the jays. Seeds and photoperiod interact synergistically to accelerate gonadal development in late winter. When seeds are abundant, considerable testis growth takes place in some Pinon Jay ♂ ♂ even before the winter solstice. This relationship was investigated experimentally. Use of a specific food (pinon seeds) as a proximate timer for breeding, the ability of individual jays to breed in spring, molt, and breed again in August without an intervening period of gonadal refractoriness, and testicular development in early December, when day length approaches its minimum, are extraordinary characteristics among north—temperate—zone passerine birds. The synchrony of seed production by pinon pines over large geographic areas is interpreted as an evolved mechanism that (1) overwhelms invertebrate seed and cone predators, and (2) increases the numbers of seeds per tree that will be cached by Pinon Jays and other vertebrates. Caching sites of Pinon Jays are often at locations especially conducive to germination and growth of pinon pine seedlings.","container-title":"Ecological Monographs","DOI":"10.2307/2937295","ISSN":"0012-9615, 1557-7015","issue":"2","journalAbbreviation":"Ecological Monographs","language":"en","license":"http://onlinelibrary.wiley.com/termsAndConditions#vor","page":"111-126","source":"DOI.org (Crossref)","title":"Reproductive Interdependence of Pinon Jays and Pinon Pines","volume":"48","author":[{"family":"Ligon","given":"J. David"}],"issued":{"date-parts":[["1978",3]]}}},{"id":2767,"uris":["http://zotero.org/groups/5634119/items/SFTJSXEN"],"itemData":{"id":2767,"type":"article-journal","container-title":"Biological Conservation","DOI":"10.1016/j.biocon.2023.109959","ISSN":"00063207","journalAbbreviation":"Biological Conservation","language":"en","page":"109959","source":"DOI.org (Crossref)","title":"A hidden cost of single species management: Habitat-relationships reveal potential negative effects of conifer removal on a non-target species","title-short":"A hidden cost of single species management","volume":"280","author":[{"family":"Van Lanen","given":"Nicholas J."},{"family":"Monroe","given":"Adrian P."},{"family":"Aldridge","given":"Cameron L."}],"issued":{"date-parts":[["2023",4]]}}},{"id":3003,"uris":["http://zotero.org/users/6391447/items/7P8TEDBC"],"itemData":{"id":3003,"type":"article-journal","container-title":"Journal of Biogeography","DOI":"10.2307/2844738","ISSN":"03050270","issue":"4","journalAbbreviation":"Journal of Biogeography","page":"275","source":"DOI.org (Crossref)","title":"Biogeography of Two Southwest American Oaks in Relation to Atmospheric Dynamics","volume":"10","author":[{"family":"Neilson","given":"R. P."},{"family":"Wullstein","given":"L. H."}],"issued":{"date-parts":[["1983",7]]}}}],"schema":"https://github.com/citation-style-language/schema/raw/master/csl-citation.json"} </w:instrText>
+      </w:r>
+      <w:r>
+        <w:fldChar w:fldCharType="separate"/>
+      </w:r>
+      <w:r>
+        <w:rPr>
+          <w:noProof/>
+        </w:rPr>
+        <w:t>(Boone et al., 2018; Johnson et al., 2016; Ligon, 1978; Neilson &amp; Wullstein, 1983; Van Lanen et al., 2023)</w:t>
+      </w:r>
+      <w:r>
+        <w:fldChar w:fldCharType="end"/>
+      </w:r>
+      <w:r>
+        <w:t xml:space="preserve">. These patterns have implications for understanding the seed dispersal interaction between these two species and when it might change in direction or magnitude </w:t>
+      </w:r>
+      <w:r>
+        <w:fldChar w:fldCharType="begin"/>
+      </w:r>
+      <w:r>
+        <w:instrText xml:space="preserve"> ADDIN ZOTERO_ITEM CSL_CITATION {"citationID":"VgYh5oFZ","properties":{"formattedCitation":"(Chamberlain et al., 2014)","plainCitation":"(Chamberlain et al., 2014)","noteIndex":0},"citationItems":[{"id":133,"uris":["http://zotero.org/users/6391447/items/NWNSW57M"],"itemData":{"id":133,"type":"article-journal","abstract":"The net effects of interspeciﬁc species interactions on individuals and populations vary in both sign (À, 0, +) and magnitude (strong to weak). Interaction outcomes are context-dependent when the sign and/or magnitude change as a function of the biotic or abiotic context. While context dependency appears to be common, its distribution in nature is poorly described. Here, we used meta-analysis to quantify variation in species interaction outcomes (competition, mutualism, or predation) for 247 published articles. Contrary to our expectations, variation in the magnitude of effect sizes did not differ among species interactions, and while mutualism was most likely to change sign across contexts (and predation least likely), mutualism did not strongly differ from competition. Both the magnitude and sign of species interactions varied the most along spatial and abiotic gradients, and least as a function of the presence/absence of a third species. However, the degree of context dependency across these context types was not consistent among mutualism, competition and predation studies. Surprisingly, study location and ecosystem type varied in the degree of context dependency, with laboratory studies showing the highest variation in outcomes. We urge that studying context dependency per se, rather than focusing only on mean outcomes, can provide a general method for describing patterns of variation in nature.","container-title":"Ecology Letters","DOI":"10.1111/ele.12279","ISSN":"1461023X","issue":"7","journalAbbreviation":"Ecol Lett","language":"en","page":"881-890","source":"DOI.org (Crossref)","title":"How context dependent are species interactions?","volume":"17","author":[{"family":"Chamberlain","given":"Scott A."},{"family":"Bronstein","given":"Judith L."},{"family":"Rudgers","given":"Jennifer A."}],"editor":[{"family":"Etienne","given":"Rampal"}],"issued":{"date-parts":[["2014",7]]}}}],"schema":"https://github.com/citation-style-language/schema/raw/master/csl-citation.json"} </w:instrText>
+      </w:r>
+      <w:r>
+        <w:fldChar w:fldCharType="separate"/>
+      </w:r>
+      <w:r>
+        <w:rPr>
+          <w:noProof/>
+        </w:rPr>
+        <w:t>(Chamberlain et al., 2014)</w:t>
+      </w:r>
+      <w:r>
+        <w:fldChar w:fldCharType="end"/>
+      </w:r>
+      <w:r>
+        <w:t xml:space="preserve">. For example, jays may eat more seeds that they cache more quickly following stressful climatic conditions (weakening or shifting the mutualistic interaction); or they may eat fewer cached seeds in habitats with more food resources (strengthening the mutualistic interaction). The mediating effects of climate and habitat on seed dispersal in masting species may be more pronounced since seed dispersers have to be adaptable to pulses of resources when they become available </w:t>
+      </w:r>
+      <w:r>
+        <w:fldChar w:fldCharType="begin"/>
+      </w:r>
+      <w:r>
+        <w:instrText xml:space="preserve"> ADDIN ZOTERO_ITEM CSL_CITATION {"citationID":"rvp5qt7L","properties":{"formattedCitation":"(Clark et al., 2019)","plainCitation":"(Clark et al., 2019)","noteIndex":0},"citationItems":[{"id":2998,"uris":["http://zotero.org/groups/5634119/items/U6KQ2STX"],"itemData":{"id":2998,"type":"article-journal","abstract":"Abstract\n            \n              Mast‐fruiting trees represent a pulsed resource that both supports and destabilizes consumer populations. Whereas a reliable resource is abundant on average and with limited variation in time and space, masting is volatile and localized, and that variability ramifies throughout food‐webs. Theory is developed to evaluate how the space–time structure of masting interacts with consumers who exploit alternative hosts, forage widely in space, and store reserves in time. We derive the space–time–species covariance in resource supply and combine it with the space–time–diet breadth of consumers, or ambit. Direct connection to data is made possible with Mast Inference and Forecasting (\n              MASTIF\n              ), a state‐space autoregressive model that fits seed‐trap and canopy observations and predicts resource availability within the canopy and on the forest floor with full uncertainty. A resource score can be assigned to each consumer–habitat combination that integrates the benefits of a high mean supply weighed against the variance cost. As the consumer ambit increases, the volatility of an unreliable resource shifts from a variance cost to a mean benefit. Consumers foraging in the canopy (arboreal arthropods and rodents, song birds) experience space‐time covariance between host trees. Consumers on the forest floor (seed and damping‐off fungi, arthropods, rodents, ground‐nesting birds, mammals) experience instead a redistribution of that covariance by dispersal. For consumers lacking mobility, demographic storage in the form of episodic birth cohorts following mast years is important for population persistence. Consumers additionally compensate volatility with diet breadth. Depending on the dominant masting strategies of host tree species in the diet, habitats differentially limit consumers depending on the misalignment between consumer ambit and spatiotemporal covariance of hosts. The impact of adding or subtracting a diet item can be gauged with the standard error (\n              SE\n              ) rule or the benefit of an added diet item balanced against the variance cost, both of which depend on the existing diet, the abundance of the new host, and the consumer's foraging ambit. Results rank habitats by their capacities to support wildlife and other consumers from a resource perspective. Results are connected directly to data, with full uncertainty, by\n              MASTIF\n              .","container-title":"Ecological Monographs","DOI":"10.1002/ecm.1381","ISSN":"0012-9615, 1557-7015","issue":"4","journalAbbreviation":"Ecological Monographs","language":"en","page":"e01381","source":"DOI.org (Crossref)","title":"Foodwebs based on unreliable foundations: spatiotemporal masting merged with consumer movement, storage, and diet","title-short":"Foodwebs based on unreliable foundations","volume":"89","author":[{"family":"Clark","given":"James S."},{"family":"Nuñez","given":"Chase L."},{"family":"Tomasek","given":"Bradley"}],"issued":{"date-parts":[["2019",11]]}}}],"schema":"https://github.com/citation-style-language/schema/raw/master/csl-citation.json"} </w:instrText>
+      </w:r>
+      <w:r>
+        <w:fldChar w:fldCharType="separate"/>
+      </w:r>
+      <w:r>
+        <w:rPr>
+          <w:noProof/>
+        </w:rPr>
+        <w:t>(Clark et al., 2019)</w:t>
+      </w:r>
+      <w:r>
+        <w:fldChar w:fldCharType="end"/>
+      </w:r>
+      <w:r>
+        <w:t xml:space="preserve">. </w:t>
+      </w:r>
+      <w:r>
+        <w:t xml:space="preserve">These findings about how marginal and favorable conditions shape species interactions support optimal foraging theory, which means they can be used to build predictive frameworks about this species interaction </w:t>
+      </w:r>
+      <w:r>
+        <w:t xml:space="preserve">in other places and times </w:t>
+      </w:r>
+      <w:r>
+        <w:t>(</w:t>
+      </w:r>
+      <w:proofErr w:type="spellStart"/>
+      <w:r>
+        <w:t>Charnov</w:t>
+      </w:r>
+      <w:proofErr w:type="spellEnd"/>
+      <w:r>
+        <w:t xml:space="preserve"> et al., King and Marshall, Sheppard et al.)</w:t>
+      </w:r>
     </w:p>
     <w:p>
       <w:pPr>
@@ -7898,903 +8272,105 @@
         <w:ind w:firstLine="720"/>
       </w:pPr>
       <w:r>
-        <w:t>Here</w:t>
-      </w:r>
-      <w:r>
-        <w:t xml:space="preserve">, we </w:t>
-      </w:r>
-      <w:r>
-        <w:t>demonstrated</w:t>
-      </w:r>
+        <w:t xml:space="preserve">This study highlights how seed dispersal mutualisms likely vary across </w:t>
+      </w:r>
+      <w:r>
+        <w:t>contexts</w:t>
+      </w:r>
+      <w:r>
+        <w:t xml:space="preserve">. For one, climate and food availability interact over multiple years to impact the population dynamics of seed dispersers </w:t>
+      </w:r>
+      <w:r>
+        <w:fldChar w:fldCharType="begin"/>
+      </w:r>
+      <w:r>
+        <w:instrText xml:space="preserve"> ADDIN ZOTERO_ITEM CSL_CITATION {"citationID":"9csCQZkI","properties":{"formattedCitation":"(Lira et al., 2019)","plainCitation":"(Lira et al., 2019)","noteIndex":0},"citationItems":[{"id":2905,"uris":["http://zotero.org/groups/5634119/items/LQCLSCWM"],"itemData":{"id":2905,"type":"article-journal","container-title":"Current Landscape Ecology Reports","DOI":"10.1007/s40823-019-00040-w","ISSN":"2364-494X","issue":"3","journalAbbreviation":"Curr Landscape Ecol Rep","language":"en","license":"http://www.springer.com/tdm","note":"publisher: Springer Science and Business Media LLC","page":"70-82","source":"Crossref","title":"Temporal Lag in Ecological Responses to Landscape Change: Where Are We Now?","title-short":"Temporal Lag in Ecological Responses to Landscape Change","volume":"4","author":[{"family":"Lira","given":"Paula Koeler"},{"family":"De Souza Leite","given":"Melina"},{"family":"Metzger","given":"Jean Paul"}],"issued":{"date-parts":[["2019",9]]}}}],"schema":"https://github.com/citation-style-language/schema/raw/master/csl-citation.json"} </w:instrText>
+      </w:r>
+      <w:r>
+        <w:fldChar w:fldCharType="separate"/>
+      </w:r>
+      <w:r>
+        <w:rPr>
+          <w:noProof/>
+        </w:rPr>
+        <w:t>(Lira et al., 2019)</w:t>
+      </w:r>
+      <w:r>
+        <w:fldChar w:fldCharType="end"/>
+      </w:r>
+      <w:r>
+        <w:t xml:space="preserve">. Especially for declining species of dispersers, this temporal component can provide an </w:t>
+      </w:r>
+      <w:r>
+        <w:t xml:space="preserve">evidence-based moving window with which to evaluate population trends (e.g., </w:t>
+      </w:r>
+      <w:r>
+        <w:fldChar w:fldCharType="begin"/>
+      </w:r>
+      <w:r>
+        <w:instrText xml:space="preserve"> ADDIN ZOTERO_ITEM CSL_CITATION {"citationID":"yCz5AUdZ","properties":{"formattedCitation":"(Rouyer et al., 2011)","plainCitation":"(Rouyer et al., 2011)","noteIndex":0},"citationItems":[{"id":2834,"uris":["http://zotero.org/groups/5634119/items/85DQKW3A"],"itemData":{"id":2834,"type":"article-journal","abstract":"AbstractAccumulating evidence shows that environmental fluctuations and exploitation jointly affect marine fish populations, and understanding their interaction is a key issue for fisheries ecology. In particular, it has been proposed that age truncation induced by fisheries exploitation may increase the population's sensitivity to climate. In this study, we use unique long‐term abundance data for the Northeast Arctic stock of cod (Gadus morhua) and the Norwegian Spring‐Spawning stock of herring (Clupea harengus), which we analyze using techniques based on age‐structured population matrices. After identifying time periods with different age distributions in the spawning stock, we use linear models to quantify the relative effect of exploitation and temperature on the population growth rates. For the two populations, age truncation was found to be associated with an increasing importance of temperature and a relatively decreasing importance of exploitation, while the population growth rate became increasingly sensitive to recruitment variations. The results suggested that the removal of older age classes reduced the buffering capacity of the population, thereby making the population growth rate more dependent on recruitment than adult survival and increasing the effect of environmental fluctuations. Age structure appeared as a key characteristic that can affect the response of fish stocks to climate variations and its consequences may be of key importance for conservation and management.","container-title":"Global Change Biology","DOI":"10.1111/j.1365-2486.2011.02443.x","ISSN":"1354-1013, 1365-2486","issue":"10","language":"en","license":"http://onlinelibrary.wiley.com/termsAndConditions#vor","note":"publisher: Wiley","page":"3046-3057","source":"Crossref","title":"Shifting dynamic forces in fish stock fluctuations triggered by age truncation?","volume":"17","author":[{"family":"Rouyer","given":"Tristan"},{"family":"Ottersen","given":"Geir"},{"family":"Durant","given":"Joël M."},{"family":"Hidalgo","given":"Manuel"},{"family":"Hjermann","given":"Dag Ø."},{"family":"Persson","given":"Jonas"},{"family":"Stige","given":"Leif Chr."},{"family":"Stenseth","given":"Nils Chr."}],"issued":{"date-parts":[["2011",10]]}}}],"schema":"https://github.com/citation-style-language/schema/raw/master/csl-citation.json"} </w:instrText>
+      </w:r>
+      <w:r>
+        <w:fldChar w:fldCharType="separate"/>
+      </w:r>
+      <w:r>
+        <w:rPr>
+          <w:noProof/>
+        </w:rPr>
+        <w:t>(Rouyer et al., 2011)</w:t>
+      </w:r>
+      <w:r>
+        <w:fldChar w:fldCharType="end"/>
+      </w:r>
+      <w:r>
+        <w:t>.</w:t>
+      </w:r>
+      <w:r>
+        <w:t xml:space="preserve"> To understand the consequences of the temporal and spatial patterns shaping this mutualism, further studies can evaluate this system “from the plant’s perspective”</w:t>
+      </w:r>
+      <w:r>
+        <w:t xml:space="preserve"> or using models that directly measure or infer interaction strengths </w:t>
+      </w:r>
+      <w:r>
+        <w:fldChar w:fldCharType="begin"/>
+      </w:r>
+      <w:r>
+        <w:instrText xml:space="preserve"> ADDIN ZOTERO_ITEM CSL_CITATION {"citationID":"jyHvLRS5","properties":{"formattedCitation":"(Hughes et al., 2017; Liu &amp; Gaines, 2022; Magurran et al., 2010)","plainCitation":"(Hughes et al., 2017; Liu &amp; Gaines, 2022; Magurran et al., 2010)","noteIndex":0},"citationItems":[{"id":2325,"uris":["http://zotero.org/groups/4766723/items/2HMURWMH"],"itemData":{"id":2325,"type":"article-journal","container-title":"BioScience","DOI":"10.1093/biosci/biw185","ISSN":"0006-3568, 1525-3244","issue":"3","language":"en","page":"271-281","source":"DOI.org (Crossref)","title":"Long-Term Studies Contribute Disproportionately to Ecology and Policy","volume":"67","author":[{"family":"Hughes","given":"Brent B."},{"family":"Beas-Luna","given":"Rodrigo"},{"family":"Barner","given":"Allison K."},{"family":"Brewitt","given":"Kimberly"},{"family":"Brumbaugh","given":"Daniel R."},{"family":"Cerny-Chipman","given":"Elizabeth B."},{"family":"Close","given":"Sarah L."},{"family":"Coblentz","given":"Kyle E."},{"family":"Nesnera","given":"Kristin L.","non-dropping-particle":"de"},{"family":"Drobnitch","given":"Sarah T."},{"family":"Figurski","given":"Jared D."},{"family":"Focht","given":"Becky"},{"family":"Friedman","given":"Maya"},{"family":"Freiwald","given":"Jan"},{"family":"Heady","given":"Kristen K."},{"family":"Heady","given":"Walter N."},{"family":"Hettinger","given":"Annaliese"},{"family":"Johnson","given":"Angela"},{"family":"Karr","given":"Kendra A."},{"family":"Mahoney","given":"Brenna"},{"family":"Moritsch","given":"Monica M."},{"family":"Osterback","given":"Ann-Marie K."},{"family":"Reimer","given":"Jessica"},{"family":"Robinson","given":"Jonathan"},{"family":"Rohrer","given":"Tully"},{"family":"Rose","given":"Jeremy M."},{"family":"Sabal","given":"Megan"},{"family":"Segui","given":"Leah M."},{"family":"Shen","given":"Chenchen"},{"family":"Sullivan","given":"Jenna"},{"family":"Zuercher","given":"Rachel"},{"family":"Raimondi","given":"Peter T."},{"family":"Menge","given":"Bruce A."},{"family":"Grorud-Colvert","given":"Kirsten"},{"family":"Novak","given":"Mark"},{"family":"Carr","given":"Mark H."}],"issued":{"date-parts":[["2017",3]]}}},{"id":3001,"uris":["http://zotero.org/groups/5634119/items/LW73UBXP"],"itemData":{"id":3001,"type":"article-journal","abstract":"Ecological interactions are not uniform across time and can vary with environmental conditions. Yet, interactions among species are often measured with short-term controlled experiments whose outcomes can depend greatly on the particular environmental conditions under which they are performed. As an alternative, we use empirical dynamic modeling to estimate species interactions across a wide range of environmental conditions directly from existing long-term monitoring data. In our case study from a southern California kelp forest, we test whether interactions between multiple kelp and sea urchin species can be reliably reconstructed from time-series data and whether those interactions vary predictably in strength and direction across observed fluctuations in temperature, disturbance, and low-frequency oceanographic regimes. We show that environmental context greatly alters the strength and direction of species interactions. In particular, the state of the North Pacific Gyre Oscillation seems to drive the competitive balance between kelp species, asserting bottom-up control on kelp ecosystem dynamics. We show the importance of specifically studying variation in interaction strength, rather than mean interaction outcomes, when trying to understand the dynamics of complex ecosystems. The significant context dependency in species interactions found in this study argues for a greater utilization of long-term data and empirical dynamic modeling in studies of the dynamics of other ecosystems.","container-title":"Proceedings of the National Academy of Sciences","DOI":"10.1073/pnas.2118539119","ISSN":"0027-8424, 1091-6490","issue":"36","journalAbbreviation":"Proc. Natl. Acad. Sci. U.S.A.","language":"en","page":"e2118539119","source":"DOI.org (Crossref)","title":"Environmental context dependency in species interactions","volume":"119","author":[{"family":"Liu","given":"Owen R."},{"family":"Gaines","given":"Steven D."}],"issued":{"date-parts":[["2022",9,6]]}}},{"id":2327,"uris":["http://zotero.org/groups/4766723/items/X3CCR7HK"],"itemData":{"id":2327,"type":"article-journal","container-title":"Trends in Ecology &amp; Evolution","DOI":"10.1016/j.tree.2010.06.016","ISSN":"01695347","issue":"10","journalAbbreviation":"Trends in Ecology &amp; Evolution","language":"en","license":"https://www.elsevier.com/tdm/userlicense/1.0/","page":"574-582","source":"DOI.org (Crossref)","title":"Long-term datasets in biodiversity research and monitoring: assessing change in ecological communities through time","title-short":"Long-term datasets in biodiversity research and monitoring","volume":"25","author":[{"family":"Magurran","given":"Anne E."},{"family":"Baillie","given":"Stephen R."},{"family":"Buckland","given":"Stephen T."},{"family":"Dick","given":"Jan McP."},{"family":"Elston","given":"David A."},{"family":"Scott","given":"E. Marian"},{"family":"Smith","given":"Rognvald I."},{"family":"Somerfield","given":"Paul J."},{"family":"Watt","given":"Allan D."}],"issued":{"date-parts":[["2010",10]]}}}],"schema":"https://github.com/citation-style-language/schema/raw/master/csl-citation.json"} </w:instrText>
+      </w:r>
+      <w:r>
+        <w:fldChar w:fldCharType="separate"/>
+      </w:r>
+      <w:r>
+        <w:rPr>
+          <w:noProof/>
+        </w:rPr>
+        <w:t>(Hughes et al., 2017; Liu &amp; Gaines, 2022; Magurran et al., 2010)</w:t>
+      </w:r>
+      <w:r>
+        <w:fldChar w:fldCharType="end"/>
+      </w:r>
+      <w:r>
+        <w:t xml:space="preserve">. Specifically, under what climate and habitat conditions do pinyon jays serve as </w:t>
+      </w:r>
+      <w:r>
+        <w:t>the most e</w:t>
+      </w:r>
+      <w:r>
+        <w:t xml:space="preserve">ffective seed </w:t>
+      </w:r>
+      <w:proofErr w:type="gramStart"/>
+      <w:r>
+        <w:t>dispersers?</w:t>
+      </w:r>
+      <w:proofErr w:type="gramEnd"/>
       <w:r>
         <w:t xml:space="preserve"> </w:t>
-      </w:r>
-      <w:r>
-        <w:t>that pinyon jay</w:t>
-      </w:r>
-      <w:r>
-        <w:t xml:space="preserve">s </w:t>
-      </w:r>
-      <w:r>
-        <w:t xml:space="preserve">have a strong, </w:t>
-      </w:r>
-      <w:r>
-        <w:t>positive</w:t>
-      </w:r>
-      <w:r>
-        <w:t xml:space="preserve"> r</w:t>
-      </w:r>
-      <w:r>
-        <w:t>elationship with</w:t>
-      </w:r>
-      <w:r>
-        <w:t xml:space="preserve"> </w:t>
-      </w:r>
-      <w:r>
-        <w:t>pi</w:t>
-      </w:r>
-      <w:r>
-        <w:t>ny</w:t>
-      </w:r>
-      <w:r>
-        <w:t xml:space="preserve">on pine seed </w:t>
-      </w:r>
-      <w:r>
-        <w:t>production</w:t>
-      </w:r>
-      <w:r>
-        <w:t xml:space="preserve"> across the US Southwest</w:t>
-      </w:r>
-      <w:r>
-        <w:t xml:space="preserve">, </w:t>
-      </w:r>
-      <w:r>
-        <w:t>indicating that</w:t>
-      </w:r>
-      <w:r>
-        <w:t xml:space="preserve"> food</w:t>
-      </w:r>
-      <w:r>
-        <w:t xml:space="preserve"> resource availability plays a critical role in the abundance </w:t>
-      </w:r>
-      <w:r>
-        <w:t xml:space="preserve">and spatiotemporal trends </w:t>
-      </w:r>
-      <w:r>
-        <w:t>of</w:t>
-      </w:r>
-      <w:r>
-        <w:t xml:space="preserve"> </w:t>
-      </w:r>
-      <w:r>
-        <w:t xml:space="preserve">a </w:t>
-      </w:r>
-      <w:r>
-        <w:t>declining avian species</w:t>
-      </w:r>
-      <w:r>
-        <w:t xml:space="preserve">. </w:t>
-      </w:r>
-      <w:r>
-        <w:t>Specifically, b</w:t>
-      </w:r>
-      <w:r>
-        <w:t>irds</w:t>
-      </w:r>
-      <w:r>
-        <w:t xml:space="preserve"> occurred</w:t>
-      </w:r>
-      <w:r>
-        <w:t xml:space="preserve"> </w:t>
-      </w:r>
-      <w:r>
-        <w:t xml:space="preserve">in greater abundance </w:t>
-      </w:r>
-      <w:r>
-        <w:t xml:space="preserve">near </w:t>
-      </w:r>
-      <w:r>
-        <w:t>cache sites the year after high seed production years</w:t>
-      </w:r>
-      <w:r>
-        <w:t>, with lagged effects that occur over at least two subsequent years</w:t>
-      </w:r>
-      <w:r>
-        <w:t xml:space="preserve">. </w:t>
-      </w:r>
-      <w:r>
-        <w:t>We also found that</w:t>
-      </w:r>
-      <w:r>
-        <w:t xml:space="preserve"> the relationship between pinyon jay abundance and seed availability is mediated by a suite of habitat and climate variables, including maximum temperature, precipitation, pinyon basal area, and the relative </w:t>
-      </w:r>
-      <w:r>
-        <w:t>importance</w:t>
-      </w:r>
-      <w:r>
-        <w:t xml:space="preserve"> of </w:t>
-      </w:r>
-      <w:r>
-        <w:t>the North American M</w:t>
-      </w:r>
-      <w:r>
-        <w:t xml:space="preserve">onsoon (July-September). These </w:t>
-      </w:r>
-      <w:r>
-        <w:lastRenderedPageBreak/>
-        <w:t>interactive</w:t>
-      </w:r>
-      <w:r>
-        <w:t xml:space="preserve"> </w:t>
-      </w:r>
-      <w:r>
-        <w:t>relationships</w:t>
-      </w:r>
-      <w:r>
-        <w:t xml:space="preserve"> suggest a combination of ecological effects, including a stronger relationship with seed availability </w:t>
-      </w:r>
-      <w:r>
-        <w:t>following</w:t>
-      </w:r>
-      <w:r>
-        <w:t xml:space="preserve"> “stressful” climatic </w:t>
-      </w:r>
-      <w:r>
-        <w:t>conditions during the nesting season</w:t>
-      </w:r>
-      <w:r>
-        <w:t xml:space="preserve"> and a weaker relationship with seed availability in more “suitable” habitat</w:t>
-      </w:r>
-      <w:r>
-        <w:t xml:space="preserve">. </w:t>
-      </w:r>
-      <w:r>
-        <w:t>Determining the relationship between pinyon jays and pinyon pine seed availability and how this relationship is shaped by climate and habitat context is an important step in recognizing potential mechanisms for pinyon jay population changes. We can build on these observations to understand how this important mutualism changes in magnitude or direction through space and time</w:t>
-      </w:r>
-      <w:r>
-        <w:t xml:space="preserve"> and build an approach for understanding seed dispersal mutualisms in general </w:t>
-      </w:r>
-      <w:r>
-        <w:fldChar w:fldCharType="begin"/>
-      </w:r>
-      <w:r>
-        <w:instrText xml:space="preserve"> ADDIN ZOTERO_ITEM CSL_CITATION {"citationID":"aIB16gnK","properties":{"formattedCitation":"(Moore &amp; Dittel, 2020)","plainCitation":"(Moore &amp; Dittel, 2020)","noteIndex":0},"citationItems":[{"id":2866,"uris":["http://zotero.org/groups/5634119/items/DSHJRM3N"],"itemData":{"id":2866,"type":"article-journal","abstract":"AbstractSpecies interactions are context dependent, in that their direction and magnitude can vary across ecological conditions. For seed dispersal interactions—especially interactions between plants and seed‐caching animals—the direction of the interactions is often obscured because of seed mortality inherent in seed handling and the delayed effects of fitness benefits received by plants. It is, therefore, an open question in ecology to understand the ecological contexts under which seed dispersal interactions are facilitative, antagonistic or null.We review the fitness benefits of animal‐mediated seed dispersal, extend a recently published model to include negative density‐dependent effects, and review the feedback between seed production (with a focus on masting) and seed‐caching animal populations.Negative density‐dependent effects are pervasive and strongly affect the direction of plant‐seed‐disperser interactions, and including them into models will give a more accurate understanding of the direction of the interaction. Including negative density‐dependent effects also makes the interpretation of interaction more mutualistic since seed dispersers decrease seed densities. Additionally, there is substantial interannual variability in seed production in most nut‐producing plant species, and the lags between seed production and seed‐disperser population sizes complicate and limit inferences made about the direction of interactions in any given short‐term study.Synthesis. If we wish to know the direction of species interactions in real ecological communities, we need models that contain a minimum level of biological realism. For complex and long‐term phenomena such as context‐dependent species interactions we should embrace a multifaceted approach of short‐term field research, long‐term field research, simple models, and complex models to form a more robust understanding of the ecological problem of context dependency.","container-title":"Journal of Ecology","DOI":"10.1111/1365-2745.13414","ISSN":"0022-0477, 1365-2745","issue":"5","language":"en","license":"http://creativecommons.org/licenses/by/4.0/","note":"publisher: Wiley","page":"1775-1783","source":"Crossref","title":"On mutualism, models, and masting: The effects of seed‐dispersing animals on the plants they disperse","title-short":"On mutualism, models, and masting","volume":"108","author":[{"family":"Moore","given":"Christopher M."},{"family":"Dittel","given":"Jacob W."}],"editor":[{"family":"Shefferson","given":"Richard"}],"issued":{"date-parts":[["2020",9]]}}}],"schema":"https://github.com/citation-style-language/schema/raw/master/csl-citation.json"} </w:instrText>
-      </w:r>
-      <w:r>
-        <w:fldChar w:fldCharType="separate"/>
-      </w:r>
-      <w:r>
-        <w:rPr>
-          <w:noProof/>
-        </w:rPr>
-        <w:t>(Moore &amp; Dittel, 2020)</w:t>
-      </w:r>
-      <w:r>
-        <w:fldChar w:fldCharType="end"/>
-      </w:r>
-      <w:r>
-        <w:t>.</w:t>
-      </w:r>
-    </w:p>
-    <w:p>
-      <w:pPr>
-        <w:pStyle w:val="BodyText"/>
-      </w:pPr>
-      <w:r>
-        <w:tab/>
-        <w:t>In many systems with masting tree species, populations of seed predators are known to boom in synchrony with or following large masting events (e.g.,</w:t>
-      </w:r>
-      <w:r>
-        <w:t xml:space="preserve"> </w:t>
-      </w:r>
-      <w:r>
-        <w:fldChar w:fldCharType="begin"/>
-      </w:r>
-      <w:r>
-        <w:instrText xml:space="preserve"> ADDIN ZOTERO_ITEM CSL_CITATION {"citationID":"bmLyT6DZ","properties":{"formattedCitation":"(Boutin et al., 2006; Schnurr et al., 2002)","plainCitation":"(Boutin et al., 2006; Schnurr et al., 2002)","noteIndex":0},"citationItems":[{"id":2983,"uris":["http://zotero.org/groups/5634119/items/JHIYW3CU"],"itemData":{"id":2983,"type":"article-journal","abstract":"Mast seeding, the intermittent, synchronous production of large seed crops by a population of plants, is a well-known example of resource pulses that create lagged responses in successive trophic levels of ecological communities. These lags arise because seed predators are thought capable of increasing reproduction and population size only after the resource pulse is available for consumption. The resulting satiation of predators is a widely cited explanation for the evolution of masting. Our study shows that both American and Eurasian tree squirrels anticipate resource pulses and increase reproductive output before a masting event, thereby increasing population size in synchrony with the resource pulse and eliminating the population lag thought to be universal in resource pulse systems.","container-title":"Science","DOI":"10.1126/science.1135520","ISSN":"0036-8075, 1095-9203","issue":"5807","journalAbbreviation":"Science","language":"en","page":"1928-1930","source":"DOI.org (Crossref)","title":"Anticipatory Reproduction and Population Growth in Seed Predators","volume":"314","author":[{"family":"Boutin","given":"Stan"},{"family":"Wauters","given":"Lucas A."},{"family":"McAdam","given":"Andrew G."},{"family":"Humphries","given":"Murray M."},{"family":"Tosi","given":"Guido"},{"family":"Dhondt","given":"André A."}],"issued":{"date-parts":[["2006",12,22]]}}},{"id":2982,"uris":["http://zotero.org/groups/5634119/items/QD85BJ5Z"],"itemData":{"id":2982,"type":"article-journal","abstract":"Many plant species are thought to benefit from mast seeding as a result of increased seed survival through predator satiation. However, in communities with many different masting species, lack of synchrony in seed production among species may decrease seed survival by maintaining seed predator populations through the intermast cycle. Similarly, masting by different plant species may have different effects on the seed predator community. We conducted a three‐year study in a northeastern USA temperate deciduous forest to determine if production of large seed crops by several tree species was synchronous, and if they had similar effects on all small mammal species. We found that red oak mast crops resulted in increased densities of\n              Peromyscus leucopus\n              and\n              P. maniculatus\n              , but had no effect on\n              Clethrionomys gapperi\n              abundance. Conversely,\n              C. gapperi\n              populations, but not\n              Peromyscus\n              populations, appeared to increase in response to a large red maple seed crop. Differences in small mammal abundance resulted in changes in species‐specific seed survival: in the year of abundant\n              C. gapperi\n              , experimentally placed red oak acorns had significantly higher survival than in the year of high\n              Peromyscus\n              abundance. Red oak acorn removal was positively correlated with\n              Peromyscus\n              abundance, while red maple seed removal was significantly higher with increased\n              C. gapperi\n              abundance. Thus, species‐specific seed production had differential effects on subsequent small mammal abundance, which in turn affected seed survival. We suggest that at the level of the community, even short‐term lack of synchrony in production of large seed crops can cause variation in postdispersal seed survival, through differential effects on the community of small mammal seed predators.","container-title":"Oikos","DOI":"10.1034/j.1600-0706.2002.960302.x","ISSN":"0030-1299, 1600-0706","issue":"3","journalAbbreviation":"Oikos","language":"en","page":"402-410","source":"DOI.org (Crossref)","title":"Direct and indirect effects of masting on rodent populations and tree seed survival","volume":"96","author":[{"family":"Schnurr","given":"Jaclyn L."},{"family":"Ostfeld","given":"Richard S."},{"family":"Canham","given":"Charles D."}],"issued":{"date-parts":[["2002",3]]}}}],"schema":"https://github.com/citation-style-language/schema/raw/master/csl-citation.json"} </w:instrText>
-      </w:r>
-      <w:r>
-        <w:fldChar w:fldCharType="separate"/>
-      </w:r>
-      <w:r>
-        <w:rPr>
-          <w:noProof/>
-        </w:rPr>
-        <w:t>(Boutin et al., 2006; Schnurr et al., 2002)</w:t>
-      </w:r>
-      <w:r>
-        <w:fldChar w:fldCharType="end"/>
-      </w:r>
-      <w:r>
-        <w:t xml:space="preserve">. This population </w:t>
-      </w:r>
-      <w:r>
-        <w:t xml:space="preserve">growth </w:t>
-      </w:r>
-      <w:r>
-        <w:t xml:space="preserve">has implications not only for seed predation and dispersal, but also other ecosystem functions and services (e.g., </w:t>
-      </w:r>
-      <w:r>
-        <w:t>food web</w:t>
-      </w:r>
-      <w:r>
-        <w:t xml:space="preserve"> responses and disease dynamics</w:t>
-      </w:r>
-      <w:r>
-        <w:t xml:space="preserve"> </w:t>
-      </w:r>
-      <w:r>
-        <w:fldChar w:fldCharType="begin"/>
-      </w:r>
-      <w:r>
-        <w:instrText xml:space="preserve"> ADDIN ZOTERO_ITEM CSL_CITATION {"citationID":"SmgUSONs","properties":{"formattedCitation":"(Bogdziewicz et al., 2016; Bregnard et al., 2021; Ostfeld &amp; Keesing, 2000)","plainCitation":"(Bogdziewicz et al., 2016; Bregnard et al., 2021; Ostfeld &amp; Keesing, 2000)","noteIndex":0},"citationItems":[{"id":2991,"uris":["http://zotero.org/groups/5634119/items/8NUB2F2E"],"itemData":{"id":2991,"type":"article-journal","abstract":"Mast‐seeding is the synchronized and intermittent production of a large seed crop by a population of plants. The cascading effects of masting on wildlife have been well documented in granivorous rodents. Yet, the effects of mast‐seeding are potentially further reaching, since a number of generalist species can take advantage of mast years. We employed a full‐text search algorithm to identify all papers that discussed effects of mast‐seeding on wildlife, in addition to typical searches of titles and abstracts. We aimed to evaluate the breadth of wildlife species for which mast years are thought to be important drivers. In addition, we tested three hypotheses derived from past reviews: 1) species with lower reproductive potential (lower average litter size) are more likely to show aggregative responses to mast‐seeding, 2) species with lower body sizes (lower mobility) are more likely to show reproductive responses, and 3) indirect consumers of mast (predators) are more likely to show aggregative responses than direct consumers. We found 186 articles including reports of response of 122 species of vertebrates to mast‐seeding. Expectations were partly confirmed: relationships 1) and 2) held for mammals, but not for birds. However, 3) direct consumers were more likely than indirect consumers to show aggregative responses. Our tests of the first two hypotheses question the generality of past predictions for taxa other than mammals. Our test of the third hypothesis suggests that responses of direct and indirect consumers might depend on the type of resource pulse. Many of the examples in our analysis come from systems in which wildlife responses to mast have been less rigorously documented than the examples in past reviews. They suggest the range of wildlife responses to mast‐seeding are more taxonomically and ecologically diverse than past reviews have widely recognized and point to directions for future research.\n            \n              \n                \n                  Synthesis\n                \n                Mast seeding is a pulsed resource with numerous cascading effects on wildlife. Yet, because masting is largely unpredictable, it is inherently difficult to study. We developed a full‐text search algorithm to identify incidental reports as well as deliberate studies of vertebrate reactions to masting. We found that the type of response to mast seeding (reproductive or through immigration) varies predictably as a function of life history traits (litter size and body mass) in mammals, but not in birds.  Our literature search also shows that responses to mast‐seeding are more taxonomically and ecologically diverse than past reviews have recognized.","container-title":"Oikos","DOI":"10.1111/oik.03012","ISSN":"0030-1299, 1600-0706","issue":"3","journalAbbreviation":"Oikos","language":"en","page":"300-307","source":"DOI.org (Crossref)","title":"How do vertebrates respond to mast seeding?","volume":"125","author":[{"family":"Bogdziewicz","given":"Michał"},{"family":"Zwolak","given":"Rafał"},{"family":"Crone","given":"Elizabeth E."}],"issued":{"date-parts":[["2016",3]]}}},{"id":2988,"uris":["http://zotero.org/groups/5634119/items/VDENFAUA"],"itemData":{"id":2988,"type":"article-journal","abstract":"Abstract\n            \n              Background\n              \n                The incidence of Lyme borreliosis and other tick-borne diseases is increasing in Europe and North America. There is currently much interest in identifying the ecological factors that determine the density of infected ticks as this variable determines the risk of Lyme borreliosis to vertebrate hosts, including humans. Lyme borreliosis is caused by the bacterium\n                Borrelia burgdorferi\n                sensu lato (s.l.) and in western Europe, the hard tick\n                Ixodes ricinus\n                is the most important vector.\n              \n            \n            \n              Methods\n              \n                Over a 15-year period (2004–2018), we monitored the monthly abundance of\n                I. ricinus\n                ticks (nymphs and adults) and their\n                B. burgdorferi\n                s.l. infection status at four different elevations on a mountain in western Switzerland. We collected climate variables in the field and from nearby weather stations. We obtained data on beech tree seed production (masting) from the literature, as the abundance of\n                Ixodes\n                nymphs can increase dramatically 2 years after a masting event. We used generalized linear mixed effects models and AIC-based model selection to identify the ecological factors that influence inter-annual variation in the nymphal infection prevalence (NIP) and the density of infected nymphs (DIN).\n              \n            \n            \n              Results\n              \n                We found that the NIP decreased by 78% over the study period. Inter-annual variation in the NIP was explained by the mean precipitation in the present year, and the duration that the DNA extraction was stored in the freezer prior to pathogen detection. The DIN decreased over the study period at all four elevation sites, and the decrease was significant at the top elevation. Inter-annual variation in the DIN was best explained by elevation site, year, beech tree masting index 2 years prior and the mean relative humidity in the present year. This is the first study in Europe to demonstrate that seed production by deciduous trees influences the density of nymphs infected with\n                B. burgdorferi\n                s.l. and hence the risk of Lyme borreliosis.\n              \n            \n            \n              Conclusions\n              Public health officials in Europe should be aware that masting by deciduous trees is an important predictor of the risk of Lyme borreliosis.\n            \n            \n              Graphical Abstract","container-title":"Parasites &amp; Vectors","DOI":"10.1186/s13071-021-04646-0","ISSN":"1756-3305","issue":"1","journalAbbreviation":"Parasites Vectors","language":"en","page":"168","source":"DOI.org (Crossref)","title":"Masting by beech trees predicts the risk of Lyme disease","volume":"14","author":[{"family":"Bregnard","given":"Cindy"},{"family":"Rais","given":"Olivier"},{"family":"Voordouw","given":"Maarten Jeroen"}],"issued":{"date-parts":[["2021",3,20]]}}},{"id":2990,"uris":["http://zotero.org/groups/5634119/items/EW2YI756"],"itemData":{"id":2990,"type":"article-journal","container-title":"Trends in Ecology &amp; Evolution","DOI":"10.1016/S0169-5347(00)01862-0","ISSN":"01695347","issue":"6","journalAbbreviation":"Trends in Ecology &amp; Evolution","language":"en","license":"https://www.elsevier.com/tdm/userlicense/1.0/","page":"232-237","source":"DOI.org (Crossref)","title":"Pulsed resources and community dynamics of consumers in terrestrial ecosystems","volume":"15","author":[{"family":"Ostfeld","given":"Richard S."},{"family":"Keesing","given":"Felicia"}],"issued":{"date-parts":[["2000",6]]}}}],"schema":"https://github.com/citation-style-language/schema/raw/master/csl-citation.json"} </w:instrText>
-      </w:r>
-      <w:r>
-        <w:fldChar w:fldCharType="separate"/>
-      </w:r>
-      <w:r>
-        <w:rPr>
-          <w:noProof/>
-        </w:rPr>
-        <w:t>(Bogdziewicz et al., 2016; Bregnard et al., 2021; Ostfeld &amp; Keesing, 2000)</w:t>
-      </w:r>
-      <w:r>
-        <w:fldChar w:fldCharType="end"/>
-      </w:r>
-      <w:r>
-        <w:t>. While we did not observe a “predictive” or synchronous</w:t>
-      </w:r>
-      <w:r>
-        <w:t xml:space="preserve"> abundance</w:t>
-      </w:r>
-      <w:r>
-        <w:t xml:space="preserve"> response in pinyon jays (postulated in Ligon, 1978), we did observe that the effects of masting year</w:t>
-      </w:r>
-      <w:r>
-        <w:t>s</w:t>
-      </w:r>
-      <w:r>
-        <w:t xml:space="preserve"> in two-needle pinyon pine ha</w:t>
-      </w:r>
-      <w:r>
-        <w:t>ve</w:t>
-      </w:r>
-      <w:r>
-        <w:t xml:space="preserve"> lasting effects on population dynamics for at least three years</w:t>
-      </w:r>
-      <w:r>
-        <w:t xml:space="preserve"> (Figure 2)</w:t>
-      </w:r>
-      <w:r>
-        <w:t xml:space="preserve">. Further, we </w:t>
-      </w:r>
-      <w:r>
-        <w:t xml:space="preserve">expect that these lagged responses are due to multiple mechanisms. The first, and stronger, mechanism (~63% of covariate importance weight) is that birds nest in the spring near cache sites from the previous fall </w:t>
-      </w:r>
-      <w:r>
-        <w:fldChar w:fldCharType="begin"/>
-      </w:r>
-      <w:r>
-        <w:instrText xml:space="preserve"> ADDIN ZOTERO_ITEM CSL_CITATION {"citationID":"qX3Ix4dt","properties":{"formattedCitation":"(Stotz &amp; Balda, 1995)","plainCitation":"(Stotz &amp; Balda, 1995)","noteIndex":0},"citationItems":[{"id":2860,"uris":["http://zotero.org/groups/5634119/items/MRSH59Y5"],"itemData":{"id":2860,"type":"article-journal","container-title":"The Southwestern Naturalist","issue":"2","page":"180-184","title":"Cache and recovery behavior of wild pinyon jays in northern Arizona","volume":"40","author":[{"family":"Stotz","given":"Nancy G."},{"family":"Balda","given":"Russell P."}],"issued":{"date-parts":[["1995"]]}}}],"schema":"https://github.com/citation-style-language/schema/raw/master/csl-citation.json"} </w:instrText>
-      </w:r>
-      <w:r>
-        <w:fldChar w:fldCharType="separate"/>
-      </w:r>
-      <w:r>
-        <w:rPr>
-          <w:noProof/>
-        </w:rPr>
-        <w:t>(Stotz &amp; Balda, 1995)</w:t>
-      </w:r>
-      <w:r>
-        <w:fldChar w:fldCharType="end"/>
-      </w:r>
-      <w:r>
-        <w:t>. The second, weaker, mechanism (13-21% of covariate importance weight), is likely a delayed population response</w:t>
-      </w:r>
-      <w:r>
-        <w:t xml:space="preserve"> from mast-year fledgling</w:t>
-      </w:r>
-      <w:r>
-        <w:t xml:space="preserve">s </w:t>
-      </w:r>
-      <w:r>
-        <w:t xml:space="preserve">maturing to the breeding population (1.5-2 years after fledging; </w:t>
-      </w:r>
-      <w:r>
-        <w:fldChar w:fldCharType="begin"/>
-      </w:r>
-      <w:r>
-        <w:instrText xml:space="preserve"> ADDIN ZOTERO_ITEM CSL_CITATION {"citationID":"QBZapt7l","properties":{"formattedCitation":"(Marzluff &amp; Balda, 1988)","plainCitation":"(Marzluff &amp; Balda, 1988)","noteIndex":0},"citationItems":[{"id":2861,"uris":["http://zotero.org/groups/5634119/items/CQUD9PTD"],"itemData":{"id":2861,"type":"article-journal","container-title":"The Auk","DOI":"10.2307/4087492","ISSN":"0004-8038, 1938-4254","issue":"2","note":"publisher: Oxford University Press (OUP)","page":"286-295","source":"Crossref","title":"The Advantages of, and Constraints Forcing, Mate Fidelity in Pinyon Jays","volume":"105","author":[{"family":"Marzluff","given":"John M."},{"family":"Balda","given":"Russell P."}],"issued":{"date-parts":[["1988",4]]}}}],"schema":"https://github.com/citation-style-language/schema/raw/master/csl-citation.json"} </w:instrText>
-      </w:r>
-      <w:r>
-        <w:fldChar w:fldCharType="separate"/>
-      </w:r>
-      <w:r>
-        <w:rPr>
-          <w:noProof/>
-        </w:rPr>
-        <w:t>(Marzluff &amp; Balda, 1988)</w:t>
-      </w:r>
-      <w:r>
-        <w:fldChar w:fldCharType="end"/>
-      </w:r>
-      <w:r>
-        <w:t xml:space="preserve">. </w:t>
-      </w:r>
-      <w:r>
-        <w:t>T</w:t>
-      </w:r>
-      <w:r>
-        <w:t>emporal</w:t>
-      </w:r>
-      <w:r>
-        <w:t xml:space="preserve"> delays are common in trophic interactions, </w:t>
-      </w:r>
-      <w:r>
-        <w:t xml:space="preserve">including </w:t>
-      </w:r>
-      <w:r>
-        <w:t>seed dispersal</w:t>
-      </w:r>
-      <w:r>
-        <w:t>,</w:t>
-      </w:r>
-      <w:r>
-        <w:t xml:space="preserve"> </w:t>
-      </w:r>
-      <w:r>
-        <w:t xml:space="preserve">though they are often discounted in </w:t>
-      </w:r>
-      <w:r>
-        <w:lastRenderedPageBreak/>
-        <w:t xml:space="preserve">food web and interaction network models </w:t>
-      </w:r>
-      <w:r>
-        <w:fldChar w:fldCharType="begin"/>
-      </w:r>
-      <w:r>
-        <w:instrText xml:space="preserve"> ADDIN ZOTERO_ITEM CSL_CITATION {"citationID":"wVlDcmr5","properties":{"formattedCitation":"(Yang et al., 2023)","plainCitation":"(Yang et al., 2023)","noteIndex":0},"citationItems":[{"id":2992,"uris":["http://zotero.org/groups/5634119/items/QAH9W9BL"],"itemData":{"id":2992,"type":"article-journal","abstract":"Abstract\n            What drives the stability, or instability, of complex ecosystems? This question sits at the heart of community ecology and has motivated a large body of theoretical work exploring how community properties shape ecosystem dynamics. However, the overwhelming majority of current theory assumes that species interactions are instantaneous, meaning that changes in the abundance of one species will lead to immediate changes in the abundances of its partners. In practice, time delays in how species respond to one another are widespread across ecological contexts, yet the impact of these delays on ecosystems remains unclear. Here we derive a new body of theory to comprehensively study the impact of time delays on ecological stability. We find that time delays are important for ecosystem stability. Large delays are typically destabilizing but, surprisingly, short delays can substantially increase community stability. Moreover, in stark contrast to delay-free systems, delays dictate that communities with more abundant species can be less stable than ones with less abundant species. Finally, we show that delays fundamentally shift how species interactions impact ecosystem stability, with communities of mixed interaction types becoming the most stable class of ecosystem. Our work demonstrates that time delays can be critical for the stability of complex ecosystems.","container-title":"Nature Ecology &amp; Evolution","DOI":"10.1038/s41559-023-02158-x","ISSN":"2397-334X","issue":"10","journalAbbreviation":"Nat Ecol Evol","language":"en","page":"1610-1619","source":"DOI.org (Crossref)","title":"Time delays modulate the stability of complex ecosystems","volume":"7","author":[{"family":"Yang","given":"Yuguang"},{"family":"Foster","given":"Kevin R."},{"family":"Coyte","given":"Katharine Z."},{"family":"Li","given":"Aming"}],"issued":{"date-parts":[["2023",8,17]]}}}],"schema":"https://github.com/citation-style-language/schema/raw/master/csl-citation.json"} </w:instrText>
-      </w:r>
-      <w:r>
-        <w:fldChar w:fldCharType="separate"/>
-      </w:r>
-      <w:r>
-        <w:rPr>
-          <w:noProof/>
-        </w:rPr>
-        <w:t>(Yang et al., 2023)</w:t>
-      </w:r>
-      <w:r>
-        <w:fldChar w:fldCharType="end"/>
-      </w:r>
-      <w:r>
-        <w:t xml:space="preserve">. </w:t>
-      </w:r>
-      <w:r>
-        <w:t>In any system, understanding these delay</w:t>
-      </w:r>
-      <w:r>
-        <w:t>ed responses</w:t>
-      </w:r>
-      <w:r>
-        <w:t xml:space="preserve"> and their mechanisms </w:t>
-      </w:r>
-      <w:r>
-        <w:t>will aid in building better predictive models of species interactions</w:t>
-      </w:r>
-      <w:r>
-        <w:t xml:space="preserve"> </w:t>
-      </w:r>
-      <w:r>
-        <w:fldChar w:fldCharType="begin"/>
-      </w:r>
-      <w:r>
-        <w:instrText xml:space="preserve"> ADDIN ZOTERO_ITEM CSL_CITATION {"citationID":"1kLkKsy9","properties":{"formattedCitation":"(Poisot et al., 2015)","plainCitation":"(Poisot et al., 2015)","noteIndex":0},"citationItems":[{"id":2996,"uris":["http://zotero.org/groups/5634119/items/98XVULPE"],"itemData":{"id":2996,"type":"article-journal","abstract":"Community ecology is tasked with the considerable challenge of predicting the structure, and properties, of emerging ecosystems. It requires the ability to understand how and why species interact, as this will allow the development of mechanism‐based predictive models, and as such to better characterize how ecological mechanisms act locally on the existence of inter‐specific interactions. Here we argue that the current conceptualization of species interaction networks is ill‐suited for this task. Instead, we propose that future research must start to account for the intrinsic variability of species interactions, then scale up from here onto complex networks. This can be accomplished simply by recognizing that there exists intra‐specific variability, in traits or properties related to the establishment of species interactions. By shifting the scale towards population‐based processes, we show that this new approach will improve our predictive ability and mechanistic understanding of how species interact over large spatial or temporal scales.\n            \n              \n                \n                  Synthesis\n                \n                Although species interactions are the backbone of ecological communities, we have little insights on how (and why) they vary through space and time. In this article, we build on existing empirical literature to show that the same species may happen to interact in different ways when their local abundances vary, their trait distribution changes, or when the environment affects either of these factors. We discuss how these findings can be integrated in existing frameworks for the analysis and simulation of species interactions.","container-title":"Oikos","DOI":"10.1111/oik.01719","ISSN":"0030-1299, 1600-0706","issue":"3","journalAbbreviation":"Oikos","language":"en","page":"243-251","source":"DOI.org (Crossref)","title":"Beyond species: why ecological interaction networks vary through space and time","title-short":"Beyond species","volume":"124","author":[{"family":"Poisot","given":"Timothée"},{"family":"Stouffer","given":"Daniel B."},{"family":"Gravel","given":"Dominique"}],"issued":{"date-parts":[["2015",3]]}}}],"schema":"https://github.com/citation-style-language/schema/raw/master/csl-citation.json"} </w:instrText>
-      </w:r>
-      <w:r>
-        <w:fldChar w:fldCharType="separate"/>
-      </w:r>
-      <w:r>
-        <w:rPr>
-          <w:noProof/>
-        </w:rPr>
-        <w:t>(Poisot et al., 2015)</w:t>
-      </w:r>
-      <w:r>
-        <w:fldChar w:fldCharType="end"/>
-      </w:r>
-      <w:r>
-        <w:t>.</w:t>
-      </w:r>
-      <w:r>
-        <w:t xml:space="preserve"> </w:t>
-      </w:r>
-      <w:r>
-        <w:t>Delayed effects</w:t>
-      </w:r>
-      <w:r>
-        <w:t xml:space="preserve"> may be particularly important to understand in systems </w:t>
-      </w:r>
-      <w:r>
-        <w:t>with resource pulses</w:t>
-      </w:r>
-      <w:r>
-        <w:t xml:space="preserve"> (like masting)</w:t>
-      </w:r>
-      <w:r>
-        <w:t xml:space="preserve">, </w:t>
-      </w:r>
-      <w:r>
-        <w:t>since they can link population fluctuations to proximal causes amidst the dynamic</w:t>
-      </w:r>
-      <w:r>
-        <w:t xml:space="preserve">s </w:t>
-      </w:r>
-      <w:r>
-        <w:t xml:space="preserve">of systems with intrinsic boom and bust cycles </w:t>
-      </w:r>
-      <w:r>
-        <w:fldChar w:fldCharType="begin"/>
-      </w:r>
-      <w:r>
-        <w:instrText xml:space="preserve"> ADDIN ZOTERO_ITEM CSL_CITATION {"citationID":"fcHmoNab","properties":{"formattedCitation":"(Clark et al., 2019)","plainCitation":"(Clark et al., 2019)","noteIndex":0},"citationItems":[{"id":2998,"uris":["http://zotero.org/groups/5634119/items/U6KQ2STX"],"itemData":{"id":2998,"type":"article-journal","abstract":"Abstract\n            \n              Mast‐fruiting trees represent a pulsed resource that both supports and destabilizes consumer populations. Whereas a reliable resource is abundant on average and with limited variation in time and space, masting is volatile and localized, and that variability ramifies throughout food‐webs. Theory is developed to evaluate how the space–time structure of masting interacts with consumers who exploit alternative hosts, forage widely in space, and store reserves in time. We derive the space–time–species covariance in resource supply and combine it with the space–time–diet breadth of consumers, or ambit. Direct connection to data is made possible with Mast Inference and Forecasting (\n              MASTIF\n              ), a state‐space autoregressive model that fits seed‐trap and canopy observations and predicts resource availability within the canopy and on the forest floor with full uncertainty. A resource score can be assigned to each consumer–habitat combination that integrates the benefits of a high mean supply weighed against the variance cost. As the consumer ambit increases, the volatility of an unreliable resource shifts from a variance cost to a mean benefit. Consumers foraging in the canopy (arboreal arthropods and rodents, song birds) experience space‐time covariance between host trees. Consumers on the forest floor (seed and damping‐off fungi, arthropods, rodents, ground‐nesting birds, mammals) experience instead a redistribution of that covariance by dispersal. For consumers lacking mobility, demographic storage in the form of episodic birth cohorts following mast years is important for population persistence. Consumers additionally compensate volatility with diet breadth. Depending on the dominant masting strategies of host tree species in the diet, habitats differentially limit consumers depending on the misalignment between consumer ambit and spatiotemporal covariance of hosts. The impact of adding or subtracting a diet item can be gauged with the standard error (\n              SE\n              ) rule or the benefit of an added diet item balanced against the variance cost, both of which depend on the existing diet, the abundance of the new host, and the consumer's foraging ambit. Results rank habitats by their capacities to support wildlife and other consumers from a resource perspective. Results are connected directly to data, with full uncertainty, by\n              MASTIF\n              .","container-title":"Ecological Monographs","DOI":"10.1002/ecm.1381","ISSN":"0012-9615, 1557-7015","issue":"4","journalAbbreviation":"Ecological Monographs","language":"en","page":"e01381","source":"DOI.org (Crossref)","title":"Foodwebs based on unreliable foundations: spatiotemporal masting merged with consumer movement, storage, and diet","title-short":"Foodwebs based on unreliable foundations","volume":"89","author":[{"family":"Clark","given":"James S."},{"family":"Nuñez","given":"Chase L."},{"family":"Tomasek","given":"Bradley"}],"issued":{"date-parts":[["2019",11]]}}}],"schema":"https://github.com/citation-style-language/schema/raw/master/csl-citation.json"} </w:instrText>
-      </w:r>
-      <w:r>
-        <w:fldChar w:fldCharType="separate"/>
-      </w:r>
-      <w:r>
-        <w:rPr>
-          <w:noProof/>
-        </w:rPr>
-        <w:t>(Clark et al., 2019)</w:t>
-      </w:r>
-      <w:r>
-        <w:fldChar w:fldCharType="end"/>
-      </w:r>
-      <w:r>
-        <w:t>.</w:t>
       </w:r>
     </w:p>
     <w:p>
       <w:pPr>
         <w:pStyle w:val="BodyText"/>
         <w:ind w:firstLine="720"/>
-      </w:pPr>
-      <w:r>
-        <w:t xml:space="preserve">Understanding the context dependence of species interactions helps predict current and future ecosystem states given ongoing anthropogenic changes (e.g., </w:t>
-      </w:r>
-      <w:r>
-        <w:fldChar w:fldCharType="begin"/>
-      </w:r>
-      <w:r>
-        <w:instrText xml:space="preserve"> ADDIN ZOTERO_ITEM CSL_CITATION {"citationID":"CiZM8YcL","properties":{"formattedCitation":"(Liu &amp; Gaines, 2022; Polazzo et al., 2022)","plainCitation":"(Liu &amp; Gaines, 2022; Polazzo et al., 2022)","noteIndex":0},"citationItems":[{"id":2994,"uris":["http://zotero.org/groups/5634119/items/U3VNYJAY"],"itemData":{"id":2994,"type":"article-journal","abstract":"Significance\n            Multiple anthropogenic disturbances affect the structure and functioning of communities. Recent evidence highlighted that, after pulse disturbance, the functioning a community performs may be recovered fast due to functional redundancy, whereas community multivariate composition needs a longer time. Yet, the mechanisms that drive the different community recovery times have not been quantified empirically. We use quantitative food-web analysis to assess the influence of species interactions on community recovery. We found species-interactions strength to be the main mechanism driving differences between structural and functional recovery. Additionally, we show that interactions between multiple disturbances appear in the long term only when both species-interaction strength and food-web architecture change significantly.\n          , \n            Ecological communities are constantly exposed to multiple natural and anthropogenic disturbances. Multivariate composition (if recovered) has been found to need significantly more time to be regained after pulsed disturbance compared to univariate diversity metrics and functional endpoints. However, the mechanisms driving the different recovery times of communities to single and multiple disturbances remain unexplored. Here, we apply quantitative ecological network analyses to try to elucidate the mechanisms driving long-term community-composition dissimilarity and late-stage disturbance interactions at the community level. For this, we evaluate the effects of two pesticides, nutrient enrichment, and their interactions in outdoor mesocosms containing a complex freshwater community. We found changes in interactions strength to be strongly related to compositional changes and identified postdisturbance interaction-strength rewiring to be responsible for most of the observed compositional changes. Additionally, we found pesticide interactions to be significant in the long term only when both interaction strength and food-web architecture are reshaped by the disturbances. We suggest that quantitative network analysis has the potential to unveil ecological processes that prevent long-term community recovery.","container-title":"Proceedings of the National Academy of Sciences","DOI":"10.1073/pnas.2117364119","ISSN":"0027-8424, 1091-6490","issue":"17","journalAbbreviation":"Proc. Natl. Acad. Sci. U.S.A.","language":"en","page":"e2117364119","source":"DOI.org (Crossref)","title":"Food web rewiring drives long-term compositional differences and late-disturbance interactions at the community level","volume":"119","author":[{"family":"Polazzo","given":"Francesco"},{"family":"Marina","given":"Tomás I."},{"family":"Crettaz-Minaglia","given":"Melina"},{"family":"Rico","given":"Andreu"}],"issued":{"date-parts":[["2022",4,26]]}}},{"id":3001,"uris":["http://zotero.org/groups/5634119/items/LW73UBXP"],"itemData":{"id":3001,"type":"article-journal","abstract":"Ecological interactions are not uniform across time and can vary with environmental conditions. Yet, interactions among species are often measured with short-term controlled experiments whose outcomes can depend greatly on the particular environmental conditions under which they are performed. As an alternative, we use empirical dynamic modeling to estimate species interactions across a wide range of environmental conditions directly from existing long-term monitoring data. In our case study from a southern California kelp forest, we test whether interactions between multiple kelp and sea urchin species can be reliably reconstructed from time-series data and whether those interactions vary predictably in strength and direction across observed fluctuations in temperature, disturbance, and low-frequency oceanographic regimes. We show that environmental context greatly alters the strength and direction of species interactions. In particular, the state of the North Pacific Gyre Oscillation seems to drive the competitive balance between kelp species, asserting bottom-up control on kelp ecosystem dynamics. We show the importance of specifically studying variation in interaction strength, rather than mean interaction outcomes, when trying to understand the dynamics of complex ecosystems. The significant context dependency in species interactions found in this study argues for a greater utilization of long-term data and empirical dynamic modeling in studies of the dynamics of other ecosystems.","container-title":"Proceedings of the National Academy of Sciences","DOI":"10.1073/pnas.2118539119","ISSN":"0027-8424, 1091-6490","issue":"36","journalAbbreviation":"Proc. Natl. Acad. Sci. U.S.A.","language":"en","page":"e2118539119","source":"DOI.org (Crossref)","title":"Environmental context dependency in species interactions","volume":"119","author":[{"family":"Liu","given":"Owen R."},{"family":"Gaines","given":"Steven D."}],"issued":{"date-parts":[["2022",9,6]]}}}],"schema":"https://github.com/citation-style-language/schema/raw/master/csl-citation.json"} </w:instrText>
-      </w:r>
-      <w:r>
-        <w:fldChar w:fldCharType="separate"/>
-      </w:r>
-      <w:r>
-        <w:rPr>
-          <w:noProof/>
-        </w:rPr>
-        <w:t>(Liu &amp; Gaines, 2022; Polazzo et al., 2022)</w:t>
-      </w:r>
-      <w:r>
-        <w:fldChar w:fldCharType="end"/>
-      </w:r>
-      <w:r>
-        <w:t xml:space="preserve">. However, context dependent results are most useful if variation can be explained by consistent patterns or mechanisms </w:t>
-      </w:r>
-      <w:r>
-        <w:fldChar w:fldCharType="begin"/>
-      </w:r>
-      <w:r>
-        <w:instrText xml:space="preserve"> ADDIN ZOTERO_ITEM CSL_CITATION {"citationID":"5uRoylcG","properties":{"formattedCitation":"(Catford et al., 2022)","plainCitation":"(Catford et al., 2022)","noteIndex":0},"citationItems":[{"id":2999,"uris":["http://zotero.org/groups/5634119/items/VT4SLK2C"],"itemData":{"id":2999,"type":"article-journal","container-title":"Trends in Ecology &amp; Evolution","DOI":"10.1016/j.tree.2021.09.007","ISSN":"01695347","issue":"2","journalAbbreviation":"Trends in Ecology &amp; Evolution","language":"en","page":"158-170","source":"DOI.org (Crossref)","title":"Addressing context dependence in ecology","volume":"37","author":[{"family":"Catford","given":"Jane A."},{"family":"Wilson","given":"John R.U."},{"family":"Pyšek","given":"Petr"},{"family":"Hulme","given":"Philip E."},{"family":"Duncan","given":"Richard P."}],"issued":{"date-parts":[["2022",2]]}}}],"schema":"https://github.com/citation-style-language/schema/raw/master/csl-citation.json"} </w:instrText>
-      </w:r>
-      <w:r>
-        <w:fldChar w:fldCharType="separate"/>
-      </w:r>
-      <w:r>
-        <w:rPr>
-          <w:noProof/>
-        </w:rPr>
-        <w:t>(Catford et al., 2022)</w:t>
-      </w:r>
-      <w:r>
-        <w:fldChar w:fldCharType="end"/>
-      </w:r>
-      <w:r>
-        <w:t xml:space="preserve">. We found two predictable patterns in the context dependence of the relationship between pinyon jays and pinyon pine seeds. First, jays rely more on cones following climatic conditions that may be unfavorable for reproduction and population growth </w:t>
-      </w:r>
-      <w:r>
-        <w:t>(</w:t>
-      </w:r>
-      <w:r>
-        <w:t xml:space="preserve">lagged effects of </w:t>
-      </w:r>
-      <w:r>
-        <w:t xml:space="preserve">temperature and precipitation, Figure 4 a and b; </w:t>
-      </w:r>
-      <w:r>
-        <w:fldChar w:fldCharType="begin"/>
-      </w:r>
-      <w:r>
-        <w:instrText xml:space="preserve"> ADDIN ZOTERO_ITEM CSL_CITATION {"citationID":"wCJt3ADZ","properties":{"formattedCitation":"(Ligon, 1978; Marzluff, 1988)","plainCitation":"(Ligon, 1978; Marzluff, 1988)","noteIndex":0},"citationItems":[{"id":2753,"uris":["http://zotero.org/groups/5634119/items/4RGGXF3K"],"itemData":{"id":2753,"type":"article-journal","abstract":"Pinon Jays (Gymnorhinus cyanoephalus) and pinon pine trees (Pinus edulis) interact in a mutualistic fashion, in that the jays provide a primary means of seed dissemination for pinon trees in the Southwest, while at irregular intervals the trees provide the jays with an abundant and highly nutritious source of food. Availability of pinon seeds permits both late winter (February) and late summer (August) breeding by the jays. Seeds and photoperiod interact synergistically to accelerate gonadal development in late winter. When seeds are abundant, considerable testis growth takes place in some Pinon Jay ♂ ♂ even before the winter solstice. This relationship was investigated experimentally. Use of a specific food (pinon seeds) as a proximate timer for breeding, the ability of individual jays to breed in spring, molt, and breed again in August without an intervening period of gonadal refractoriness, and testicular development in early December, when day length approaches its minimum, are extraordinary characteristics among north—temperate—zone passerine birds. The synchrony of seed production by pinon pines over large geographic areas is interpreted as an evolved mechanism that (1) overwhelms invertebrate seed and cone predators, and (2) increases the numbers of seeds per tree that will be cached by Pinon Jays and other vertebrates. Caching sites of Pinon Jays are often at locations especially conducive to germination and growth of pinon pine seedlings.","container-title":"Ecological Monographs","DOI":"10.2307/2937295","ISSN":"0012-9615, 1557-7015","issue":"2","journalAbbreviation":"Ecological Monographs","language":"en","license":"http://onlinelibrary.wiley.com/termsAndConditions#vor","page":"111-126","source":"DOI.org (Crossref)","title":"Reproductive Interdependence of Pinon Jays and Pinon Pines","volume":"48","author":[{"family":"Ligon","given":"J. David"}],"issued":{"date-parts":[["1978",3]]}}},{"id":2862,"uris":["http://zotero.org/groups/5634119/items/PYGWLTH3"],"itemData":{"id":2862,"type":"article-journal","container-title":"Animal Behaviour","DOI":"10.1016/s0003-3472(88)80244-6","ISSN":"0003-3472","issue":"1","language":"en","license":"https://www.elsevier.com/tdm/userlicense/1.0/","note":"publisher: Elsevier BV","page":"1-10","source":"Crossref","title":"Do pinyon jays alter nest placement based on prior experience?","volume":"36","author":[{"family":"Marzluff","given":"John M."}],"issued":{"date-parts":[["1988",2]]}}}],"schema":"https://github.com/citation-style-language/schema/raw/master/csl-citation.json"} </w:instrText>
-      </w:r>
-      <w:r>
-        <w:fldChar w:fldCharType="separate"/>
-      </w:r>
-      <w:r>
-        <w:rPr>
-          <w:noProof/>
-        </w:rPr>
-        <w:t>(Ligon, 1978; Marzluff, 1988)</w:t>
-      </w:r>
-      <w:r>
-        <w:fldChar w:fldCharType="end"/>
-      </w:r>
-      <w:r>
-        <w:t xml:space="preserve">. Second, jays rely less on cones in areas with more favorable habitat </w:t>
-      </w:r>
-      <w:r>
-        <w:t xml:space="preserve">(higher pinyon pine basal area and higher North American Monsoon influence; Figure 4 c and d; </w:t>
-      </w:r>
-      <w:r>
-        <w:fldChar w:fldCharType="begin"/>
-      </w:r>
-      <w:r>
-        <w:instrText xml:space="preserve"> ADDIN ZOTERO_ITEM CSL_CITATION {"citationID":"RlgxL6Qz","properties":{"formattedCitation":"(Boone et al., 2018; Johnson et al., 2016; Ligon, 1978; Neilson &amp; Wullstein, 1983; Van Lanen et al., 2023)","plainCitation":"(Boone et al., 2018; Johnson et al., 2016; Ligon, 1978; Neilson &amp; Wullstein, 1983; Van Lanen et al., 2023)","noteIndex":0},"citationItems":[{"id":2748,"uris":["http://zotero.org/groups/5634119/items/YTCPHGE5"],"itemData":{"id":2748,"type":"chapter","abstract":"The Pinyon Jay (Gymnorhinus cyanocephalus) is closely associated with piñon–juniper woodlands in the Intermountain West and Southwest regions of the United States. It is of conservation concern, given it is one of the landbirds declining the fastest and most persistently in these regions, at an average rate of –3.6% from 1968 to 2015, according to the Breeding Bird Survey. Despite the population’s falling by &gt;50% over this period, the Pinyon Jay has not been widely studied, and little is known about the factors responsible for its diminishing numbers. Although the Pinyon Jay’s rate of decline exceeds that of the Greater SageGrouse (Centrocercus urophasianus)—a species targeted for significant conservation efforts—no comprehensive effort designed to benefit this jay has been implemented. Current management in Great Basin piñon–juniper woodlands includes removal of trees to create or protect shrublands for the benefit of sage-grouse and other sagebrush-associated wildlife, and southwestern piñon–juniper woodlands are being thinned for fuels reduction or management of other wildlife. The effect of these treatments on the Pinyon Jay and other piñon–juniper birds, however, has been little studied. Thus further research is needed to clarify the causes of the jay’s decline, develop habitat models for this and other piñon–juniper species, and devise approaches for management of piñon–juniper woodland that balance the interests of the Pinyon Jay and other species of concern, including the Greater Sage-Grouse.","container-title":"Trends and Traditions: Avifaunal Change in Western North America","ISBN":"978-0-9790585-3-0","note":"DOI: 10.21199/SWB3.10","page":"190-197","publisher":"Western Field Ornithologists","source":"DOI.org (Crossref)","title":"Long-term declines in the Pinyon Jay and management implications for piñon–juniper woodlands","URL":"https://westernfieldornithologists.org/docs/2020/Avifaunal_Change/Boone/Boone-Avifaunal_Change.pdf","container-author":[{"family":"Shuford","given":"W. David"},{"family":"Gill","given":"Robert E."},{"family":"Handel","given":"Colleen M."}],"author":[{"family":"Boone","given":"John D."},{"family":"Ammon","given":"Elisabeth"},{"family":"Johnson","given":"Kristine"}],"accessed":{"date-parts":[["2024",10,10]]},"issued":{"date-parts":[["2018",9,1]]}}},{"id":2903,"uris":["http://zotero.org/groups/5634119/items/XYDLLE9X"],"itemData":{"id":2903,"type":"article-journal","container-title":"Avian Conservation and Ecology","DOI":"10.5751/ace-00890-110206","ISSN":"1712-6568","issue":"2","journalAbbreviation":"ACE","language":"en","note":"publisher: Resilience Alliance, Inc.","source":"Crossref","title":"Home range- and colony-scale habitat models for Pinyon Jays in piñon-juniper woodlands of New Mexico, USA","URL":"http://www.ace-eco.org/vol11/iss2/art6/","volume":"11","author":[{"family":"Johnson","given":"Kristine"},{"family":"Neville","given":"Teri B."},{"family":"Smith","given":"Jacqueline W."},{"family":"Horner","given":"Mark W."}],"accessed":{"date-parts":[["2025",7,16]]},"issued":{"date-parts":[["2016"]]}}},{"id":2753,"uris":["http://zotero.org/groups/5634119/items/4RGGXF3K"],"itemData":{"id":2753,"type":"article-journal","abstract":"Pinon Jays (Gymnorhinus cyanoephalus) and pinon pine trees (Pinus edulis) interact in a mutualistic fashion, in that the jays provide a primary means of seed dissemination for pinon trees in the Southwest, while at irregular intervals the trees provide the jays with an abundant and highly nutritious source of food. Availability of pinon seeds permits both late winter (February) and late summer (August) breeding by the jays. Seeds and photoperiod interact synergistically to accelerate gonadal development in late winter. When seeds are abundant, considerable testis growth takes place in some Pinon Jay ♂ ♂ even before the winter solstice. This relationship was investigated experimentally. Use of a specific food (pinon seeds) as a proximate timer for breeding, the ability of individual jays to breed in spring, molt, and breed again in August without an intervening period of gonadal refractoriness, and testicular development in early December, when day length approaches its minimum, are extraordinary characteristics among north—temperate—zone passerine birds. The synchrony of seed production by pinon pines over large geographic areas is interpreted as an evolved mechanism that (1) overwhelms invertebrate seed and cone predators, and (2) increases the numbers of seeds per tree that will be cached by Pinon Jays and other vertebrates. Caching sites of Pinon Jays are often at locations especially conducive to germination and growth of pinon pine seedlings.","container-title":"Ecological Monographs","DOI":"10.2307/2937295","ISSN":"0012-9615, 1557-7015","issue":"2","journalAbbreviation":"Ecological Monographs","language":"en","license":"http://onlinelibrary.wiley.com/termsAndConditions#vor","page":"111-126","source":"DOI.org (Crossref)","title":"Reproductive Interdependence of Pinon Jays and Pinon Pines","volume":"48","author":[{"family":"Ligon","given":"J. David"}],"issued":{"date-parts":[["1978",3]]}}},{"id":2767,"uris":["http://zotero.org/groups/5634119/items/SFTJSXEN"],"itemData":{"id":2767,"type":"article-journal","container-title":"Biological Conservation","DOI":"10.1016/j.biocon.2023.109959","ISSN":"00063207","journalAbbreviation":"Biological Conservation","language":"en","page":"109959","source":"DOI.org (Crossref)","title":"A hidden cost of single species management: Habitat-relationships reveal potential negative effects of conifer removal on a non-target species","title-short":"A hidden cost of single species management","volume":"280","author":[{"family":"Van Lanen","given":"Nicholas J."},{"family":"Monroe","given":"Adrian P."},{"family":"Aldridge","given":"Cameron L."}],"issued":{"date-parts":[["2023",4]]}}},{"id":3003,"uris":["http://zotero.org/users/6391447/items/7P8TEDBC"],"itemData":{"id":3003,"type":"article-journal","container-title":"Journal of Biogeography","DOI":"10.2307/2844738","ISSN":"03050270","issue":"4","journalAbbreviation":"Journal of Biogeography","page":"275","source":"DOI.org (Crossref)","title":"Biogeography of Two Southwest American Oaks in Relation to Atmospheric Dynamics","volume":"10","author":[{"family":"Neilson","given":"R. P."},{"family":"Wullstein","given":"L. H."}],"issued":{"date-parts":[["1983",7]]}}}],"schema":"https://github.com/citation-style-language/schema/raw/master/csl-citation.json"} </w:instrText>
-      </w:r>
-      <w:r>
-        <w:fldChar w:fldCharType="separate"/>
-      </w:r>
-      <w:r>
-        <w:rPr>
-          <w:noProof/>
-        </w:rPr>
-        <w:t>(Boone et al., 2018; Johnson et al., 2016; Ligon, 1978; Neilson &amp; Wullstein, 1983; Van Lanen et al., 2023)</w:t>
-      </w:r>
-      <w:r>
-        <w:fldChar w:fldCharType="end"/>
-      </w:r>
-      <w:r>
-        <w:t>.</w:t>
-      </w:r>
-      <w:r>
-        <w:t xml:space="preserve"> </w:t>
-      </w:r>
-      <w:r>
-        <w:t xml:space="preserve">These patterns have implications for understanding the seed dispersal interaction between these two species and when it might change in direction or magnitude </w:t>
-      </w:r>
-      <w:r>
-        <w:fldChar w:fldCharType="begin"/>
-      </w:r>
-      <w:r>
-        <w:instrText xml:space="preserve"> ADDIN ZOTERO_ITEM CSL_CITATION {"citationID":"VgYh5oFZ","properties":{"formattedCitation":"(Chamberlain et al., 2014)","plainCitation":"(Chamberlain et al., 2014)","noteIndex":0},"citationItems":[{"id":133,"uris":["http://zotero.org/users/6391447/items/NWNSW57M"],"itemData":{"id":133,"type":"article-journal","abstract":"The net effects of interspeciﬁc species interactions on individuals and populations vary in both sign (À, 0, +) and magnitude (strong to weak). Interaction outcomes are context-dependent when the sign and/or magnitude change as a function of the biotic or abiotic context. While context dependency appears to be common, its distribution in nature is poorly described. Here, we used meta-analysis to quantify variation in species interaction outcomes (competition, mutualism, or predation) for 247 published articles. Contrary to our expectations, variation in the magnitude of effect sizes did not differ among species interactions, and while mutualism was most likely to change sign across contexts (and predation least likely), mutualism did not strongly differ from competition. Both the magnitude and sign of species interactions varied the most along spatial and abiotic gradients, and least as a function of the presence/absence of a third species. However, the degree of context dependency across these context types was not consistent among mutualism, competition and predation studies. Surprisingly, study location and ecosystem type varied in the degree of context dependency, with laboratory studies showing the highest variation in outcomes. We urge that studying context dependency per se, rather than focusing only on mean outcomes, can provide a general method for describing patterns of variation in nature.","container-title":"Ecology Letters","DOI":"10.1111/ele.12279","ISSN":"1461023X","issue":"7","journalAbbreviation":"Ecol Lett","language":"en","page":"881-890","source":"DOI.org (Crossref)","title":"How context dependent are species interactions?","volume":"17","author":[{"family":"Chamberlain","given":"Scott A."},{"family":"Bronstein","given":"Judith L."},{"family":"Rudgers","given":"Jennifer A."}],"editor":[{"family":"Etienne","given":"Rampal"}],"issued":{"date-parts":[["2014",7]]}}}],"schema":"https://github.com/citation-style-language/schema/raw/master/csl-citation.json"} </w:instrText>
-      </w:r>
-      <w:r>
-        <w:fldChar w:fldCharType="separate"/>
-      </w:r>
-      <w:r>
-        <w:rPr>
-          <w:noProof/>
-        </w:rPr>
-        <w:t>(Chamberlain et al., 2014)</w:t>
-      </w:r>
-      <w:r>
-        <w:fldChar w:fldCharType="end"/>
-      </w:r>
-      <w:r>
-        <w:t>. For example, jays may eat more seeds that they cache more quickly following stressful climatic conditions (</w:t>
-      </w:r>
-      <w:r>
-        <w:t xml:space="preserve">weakening or shifting the mutualistic interaction); or they may eat fewer cached seeds in habitats with more food resources (strengthening the mutualistic interaction). </w:t>
-      </w:r>
-      <w:r>
-        <w:t xml:space="preserve">The mediating effects of climate and habitat on seed </w:t>
-      </w:r>
-      <w:r>
-        <w:lastRenderedPageBreak/>
-        <w:t>dispersal in masting species may be more pronounced since seed dispersers have to be adaptable to pulses of resources when they become available</w:t>
-      </w:r>
-      <w:r>
-        <w:t xml:space="preserve"> </w:t>
-      </w:r>
-      <w:r>
-        <w:fldChar w:fldCharType="begin"/>
-      </w:r>
-      <w:r>
-        <w:instrText xml:space="preserve"> ADDIN ZOTERO_ITEM CSL_CITATION {"citationID":"rvp5qt7L","properties":{"formattedCitation":"(Clark et al., 2019)","plainCitation":"(Clark et al., 2019)","noteIndex":0},"citationItems":[{"id":2998,"uris":["http://zotero.org/groups/5634119/items/U6KQ2STX"],"itemData":{"id":2998,"type":"article-journal","abstract":"Abstract\n            \n              Mast‐fruiting trees represent a pulsed resource that both supports and destabilizes consumer populations. Whereas a reliable resource is abundant on average and with limited variation in time and space, masting is volatile and localized, and that variability ramifies throughout food‐webs. Theory is developed to evaluate how the space–time structure of masting interacts with consumers who exploit alternative hosts, forage widely in space, and store reserves in time. We derive the space–time–species covariance in resource supply and combine it with the space–time–diet breadth of consumers, or ambit. Direct connection to data is made possible with Mast Inference and Forecasting (\n              MASTIF\n              ), a state‐space autoregressive model that fits seed‐trap and canopy observations and predicts resource availability within the canopy and on the forest floor with full uncertainty. A resource score can be assigned to each consumer–habitat combination that integrates the benefits of a high mean supply weighed against the variance cost. As the consumer ambit increases, the volatility of an unreliable resource shifts from a variance cost to a mean benefit. Consumers foraging in the canopy (arboreal arthropods and rodents, song birds) experience space‐time covariance between host trees. Consumers on the forest floor (seed and damping‐off fungi, arthropods, rodents, ground‐nesting birds, mammals) experience instead a redistribution of that covariance by dispersal. For consumers lacking mobility, demographic storage in the form of episodic birth cohorts following mast years is important for population persistence. Consumers additionally compensate volatility with diet breadth. Depending on the dominant masting strategies of host tree species in the diet, habitats differentially limit consumers depending on the misalignment between consumer ambit and spatiotemporal covariance of hosts. The impact of adding or subtracting a diet item can be gauged with the standard error (\n              SE\n              ) rule or the benefit of an added diet item balanced against the variance cost, both of which depend on the existing diet, the abundance of the new host, and the consumer's foraging ambit. Results rank habitats by their capacities to support wildlife and other consumers from a resource perspective. Results are connected directly to data, with full uncertainty, by\n              MASTIF\n              .","container-title":"Ecological Monographs","DOI":"10.1002/ecm.1381","ISSN":"0012-9615, 1557-7015","issue":"4","journalAbbreviation":"Ecological Monographs","language":"en","page":"e01381","source":"DOI.org (Crossref)","title":"Foodwebs based on unreliable foundations: spatiotemporal masting merged with consumer movement, storage, and diet","title-short":"Foodwebs based on unreliable foundations","volume":"89","author":[{"family":"Clark","given":"James S."},{"family":"Nuñez","given":"Chase L."},{"family":"Tomasek","given":"Bradley"}],"issued":{"date-parts":[["2019",11]]}}}],"schema":"https://github.com/citation-style-language/schema/raw/master/csl-citation.json"} </w:instrText>
-      </w:r>
-      <w:r>
-        <w:fldChar w:fldCharType="separate"/>
-      </w:r>
-      <w:r>
-        <w:rPr>
-          <w:noProof/>
-        </w:rPr>
-        <w:t>(Clark et al., 2019)</w:t>
-      </w:r>
-      <w:r>
-        <w:fldChar w:fldCharType="end"/>
-      </w:r>
-      <w:r>
-        <w:t>.</w:t>
-      </w:r>
-      <w:r>
-        <w:t xml:space="preserve"> </w:t>
-      </w:r>
-    </w:p>
-    <w:p>
-      <w:pPr>
-        <w:pStyle w:val="BodyText"/>
-        <w:ind w:firstLine="720"/>
-      </w:pPr>
-      <w:r>
-        <w:t xml:space="preserve">This study highlights </w:t>
-      </w:r>
-      <w:r>
-        <w:t>how seed dispersal mutualisms likely vary across space and time</w:t>
-      </w:r>
-      <w:r>
-        <w:t>, especially in ecosystems where plant species mast</w:t>
-      </w:r>
-      <w:r>
-        <w:t xml:space="preserve">. For one, climate and food availability interact over multiple years to </w:t>
-      </w:r>
-      <w:r>
-        <w:t xml:space="preserve">impact the population dynamics of seed dispersers </w:t>
-      </w:r>
-      <w:r>
-        <w:fldChar w:fldCharType="begin"/>
-      </w:r>
-      <w:r>
-        <w:instrText xml:space="preserve"> ADDIN ZOTERO_ITEM CSL_CITATION {"citationID":"9csCQZkI","properties":{"formattedCitation":"(Lira et al., 2019)","plainCitation":"(Lira et al., 2019)","noteIndex":0},"citationItems":[{"id":2905,"uris":["http://zotero.org/groups/5634119/items/LQCLSCWM"],"itemData":{"id":2905,"type":"article-journal","container-title":"Current Landscape Ecology Reports","DOI":"10.1007/s40823-019-00040-w","ISSN":"2364-494X","issue":"3","journalAbbreviation":"Curr Landscape Ecol Rep","language":"en","license":"http://www.springer.com/tdm","note":"publisher: Springer Science and Business Media LLC","page":"70-82","source":"Crossref","title":"Temporal Lag in Ecological Responses to Landscape Change: Where Are We Now?","title-short":"Temporal Lag in Ecological Responses to Landscape Change","volume":"4","author":[{"family":"Lira","given":"Paula Koeler"},{"family":"De Souza Leite","given":"Melina"},{"family":"Metzger","given":"Jean Paul"}],"issued":{"date-parts":[["2019",9]]}}}],"schema":"https://github.com/citation-style-language/schema/raw/master/csl-citation.json"} </w:instrText>
-      </w:r>
-      <w:r>
-        <w:fldChar w:fldCharType="separate"/>
-      </w:r>
-      <w:r>
-        <w:rPr>
-          <w:noProof/>
-        </w:rPr>
-        <w:t>(Lira et al., 2019)</w:t>
-      </w:r>
-      <w:r>
-        <w:fldChar w:fldCharType="end"/>
-      </w:r>
-      <w:r>
-        <w:t xml:space="preserve">. </w:t>
-      </w:r>
-      <w:r>
-        <w:t xml:space="preserve">Especially for declining species of dispersers, this temporal component can provide an </w:t>
-      </w:r>
-      <w:r>
-        <w:t xml:space="preserve">evidence-based moving window with which to evaluate population trends (e.g., </w:t>
-      </w:r>
-      <w:r>
-        <w:fldChar w:fldCharType="begin"/>
-      </w:r>
-      <w:r>
-        <w:instrText xml:space="preserve"> ADDIN ZOTERO_ITEM CSL_CITATION {"citationID":"yCz5AUdZ","properties":{"formattedCitation":"(Rouyer et al., 2011)","plainCitation":"(Rouyer et al., 2011)","noteIndex":0},"citationItems":[{"id":2834,"uris":["http://zotero.org/groups/5634119/items/85DQKW3A"],"itemData":{"id":2834,"type":"article-journal","abstract":"AbstractAccumulating evidence shows that environmental fluctuations and exploitation jointly affect marine fish populations, and understanding their interaction is a key issue for fisheries ecology. In particular, it has been proposed that age truncation induced by fisheries exploitation may increase the population's sensitivity to climate. In this study, we use unique long‐term abundance data for the Northeast Arctic stock of cod (Gadus morhua) and the Norwegian Spring‐Spawning stock of herring (Clupea harengus), which we analyze using techniques based on age‐structured population matrices. After identifying time periods with different age distributions in the spawning stock, we use linear models to quantify the relative effect of exploitation and temperature on the population growth rates. For the two populations, age truncation was found to be associated with an increasing importance of temperature and a relatively decreasing importance of exploitation, while the population growth rate became increasingly sensitive to recruitment variations. The results suggested that the removal of older age classes reduced the buffering capacity of the population, thereby making the population growth rate more dependent on recruitment than adult survival and increasing the effect of environmental fluctuations. Age structure appeared as a key characteristic that can affect the response of fish stocks to climate variations and its consequences may be of key importance for conservation and management.","container-title":"Global Change Biology","DOI":"10.1111/j.1365-2486.2011.02443.x","ISSN":"1354-1013, 1365-2486","issue":"10","language":"en","license":"http://onlinelibrary.wiley.com/termsAndConditions#vor","note":"publisher: Wiley","page":"3046-3057","source":"Crossref","title":"Shifting dynamic forces in fish stock fluctuations triggered by age truncation?","volume":"17","author":[{"family":"Rouyer","given":"Tristan"},{"family":"Ottersen","given":"Geir"},{"family":"Durant","given":"Joël M."},{"family":"Hidalgo","given":"Manuel"},{"family":"Hjermann","given":"Dag Ø."},{"family":"Persson","given":"Jonas"},{"family":"Stige","given":"Leif Chr."},{"family":"Stenseth","given":"Nils Chr."}],"issued":{"date-parts":[["2011",10]]}}}],"schema":"https://github.com/citation-style-language/schema/raw/master/csl-citation.json"} </w:instrText>
-      </w:r>
-      <w:r>
-        <w:fldChar w:fldCharType="separate"/>
-      </w:r>
-      <w:r>
-        <w:rPr>
-          <w:noProof/>
-        </w:rPr>
-        <w:t>(Rouyer et al., 2011)</w:t>
-      </w:r>
-      <w:r>
-        <w:fldChar w:fldCharType="end"/>
-      </w:r>
-      <w:r>
-        <w:t>.</w:t>
-      </w:r>
-      <w:r>
-        <w:t xml:space="preserve"> </w:t>
-      </w:r>
-      <w:r>
-        <w:t xml:space="preserve">Further, </w:t>
-      </w:r>
-      <w:r>
-        <w:t xml:space="preserve">seed dispersers in masting systems have likely adapted unique strategies for surviving the boom and bust nature of these ecosystems, including wider diets and behaviors that support population persistence (e.g., sociality, irruptive movement </w:t>
-      </w:r>
-      <w:r>
-        <w:fldChar w:fldCharType="begin"/>
-      </w:r>
-      <w:r>
-        <w:instrText xml:space="preserve"> ADDIN ZOTERO_ITEM CSL_CITATION {"citationID":"mhQXUCZt","properties":{"formattedCitation":"(Strong et al., 2015)","plainCitation":"(Strong et al., 2015)","noteIndex":0},"citationItems":[{"id":2869,"uris":["http://zotero.org/groups/5634119/items/W2LLACPC"],"itemData":{"id":2869,"type":"article-journal","abstract":"SignificanceThis study is the first, to our knowledge, to reveal how climate variability drives irruptions of North American boreal seed-eating birds. Patterns of Pine Siskin irruption and associated climate drivers manifest as two modes (North-South and West-East) in which dipoles of temperature and precipitation anomalies push and pull irruptive movements across the continent at biennial to decadal periodicities. Our study accentuates the value of sustained and synoptic biological observations, contributed by citizen scientists in this case, that match the spatial and temporal scales at which climatic phenomena are observed and understood. Such observations can help probe new questions, such as the role of climatic dipoles in other large-scale ecological processes.","container-title":"Proceedings of the National Academy of Sciences","DOI":"10.1073/pnas.1418414112","ISSN":"0027-8424, 1091-6490","issue":"21","journalAbbreviation":"Proc. Natl. Acad. Sci. U.S.A.","language":"en","license":"http://www.pnas.org/site/misc/userlicense.xhtml","note":"publisher: Proceedings of the National Academy of Sciences","source":"Crossref","title":"Climatic dipoles drive two principal modes of North American boreal bird irruption","URL":"https://pnas.org/doi/full/10.1073/pnas.1418414112","volume":"112","author":[{"family":"Strong","given":"Courtenay"},{"family":"Zuckerberg","given":"Benjamin"},{"family":"Betancourt","given":"Julio L."},{"family":"Koenig","given":"Walter D."}],"accessed":{"date-parts":[["2025",7,16]]},"issued":{"date-parts":[["2015",5,26]]}}}],"schema":"https://github.com/citation-style-language/schema/raw/master/csl-citation.json"} </w:instrText>
-      </w:r>
-      <w:r>
-        <w:fldChar w:fldCharType="separate"/>
-      </w:r>
-      <w:r>
-        <w:rPr>
-          <w:noProof/>
-        </w:rPr>
-        <w:t>(Strong et al., 2015)</w:t>
-      </w:r>
-      <w:r>
-        <w:fldChar w:fldCharType="end"/>
-      </w:r>
-      <w:r>
-        <w:t>). Th</w:t>
-      </w:r>
-      <w:r>
-        <w:t>is</w:t>
-      </w:r>
-      <w:r>
-        <w:t xml:space="preserve"> study demonstrates the importance of long-term and broad scale studies for understanding patterns shaping species interactions and how they shape ecosystems </w:t>
-      </w:r>
-      <w:r>
-        <w:fldChar w:fldCharType="begin"/>
-      </w:r>
-      <w:r>
-        <w:instrText xml:space="preserve"> ADDIN ZOTERO_ITEM CSL_CITATION {"citationID":"jyHvLRS5","properties":{"formattedCitation":"(Hughes et al., 2017; Liu &amp; Gaines, 2022; Magurran et al., 2010)","plainCitation":"(Hughes et al., 2017; Liu &amp; Gaines, 2022; Magurran et al., 2010)","noteIndex":0},"citationItems":[{"id":2325,"uris":["http://zotero.org/groups/4766723/items/2HMURWMH"],"itemData":{"id":2325,"type":"article-journal","container-title":"BioScience","DOI":"10.1093/biosci/biw185","ISSN":"0006-3568, 1525-3244","issue":"3","language":"en","page":"271-281","source":"DOI.org (Crossref)","title":"Long-Term Studies Contribute Disproportionately to Ecology and Policy","volume":"67","author":[{"family":"Hughes","given":"Brent B."},{"family":"Beas-Luna","given":"Rodrigo"},{"family":"Barner","given":"Allison K."},{"family":"Brewitt","given":"Kimberly"},{"family":"Brumbaugh","given":"Daniel R."},{"family":"Cerny-Chipman","given":"Elizabeth B."},{"family":"Close","given":"Sarah L."},{"family":"Coblentz","given":"Kyle E."},{"family":"Nesnera","given":"Kristin L.","non-dropping-particle":"de"},{"family":"Drobnitch","given":"Sarah T."},{"family":"Figurski","given":"Jared D."},{"family":"Focht","given":"Becky"},{"family":"Friedman","given":"Maya"},{"family":"Freiwald","given":"Jan"},{"family":"Heady","given":"Kristen K."},{"family":"Heady","given":"Walter N."},{"family":"Hettinger","given":"Annaliese"},{"family":"Johnson","given":"Angela"},{"family":"Karr","given":"Kendra A."},{"family":"Mahoney","given":"Brenna"},{"family":"Moritsch","given":"Monica M."},{"family":"Osterback","given":"Ann-Marie K."},{"family":"Reimer","given":"Jessica"},{"family":"Robinson","given":"Jonathan"},{"family":"Rohrer","given":"Tully"},{"family":"Rose","given":"Jeremy M."},{"family":"Sabal","given":"Megan"},{"family":"Segui","given":"Leah M."},{"family":"Shen","given":"Chenchen"},{"family":"Sullivan","given":"Jenna"},{"family":"Zuercher","given":"Rachel"},{"family":"Raimondi","given":"Peter T."},{"family":"Menge","given":"Bruce A."},{"family":"Grorud-Colvert","given":"Kirsten"},{"family":"Novak","given":"Mark"},{"family":"Carr","given":"Mark H."}],"issued":{"date-parts":[["2017",3]]}}},{"id":3001,"uris":["http://zotero.org/groups/5634119/items/LW73UBXP"],"itemData":{"id":3001,"type":"article-journal","abstract":"Ecological interactions are not uniform across time and can vary with environmental conditions. Yet, interactions among species are often measured with short-term controlled experiments whose outcomes can depend greatly on the particular environmental conditions under which they are performed. As an alternative, we use empirical dynamic modeling to estimate species interactions across a wide range of environmental conditions directly from existing long-term monitoring data. In our case study from a southern California kelp forest, we test whether interactions between multiple kelp and sea urchin species can be reliably reconstructed from time-series data and whether those interactions vary predictably in strength and direction across observed fluctuations in temperature, disturbance, and low-frequency oceanographic regimes. We show that environmental context greatly alters the strength and direction of species interactions. In particular, the state of the North Pacific Gyre Oscillation seems to drive the competitive balance between kelp species, asserting bottom-up control on kelp ecosystem dynamics. We show the importance of specifically studying variation in interaction strength, rather than mean interaction outcomes, when trying to understand the dynamics of complex ecosystems. The significant context dependency in species interactions found in this study argues for a greater utilization of long-term data and empirical dynamic modeling in studies of the dynamics of other ecosystems.","container-title":"Proceedings of the National Academy of Sciences","DOI":"10.1073/pnas.2118539119","ISSN":"0027-8424, 1091-6490","issue":"36","journalAbbreviation":"Proc. Natl. Acad. Sci. U.S.A.","language":"en","page":"e2118539119","source":"DOI.org (Crossref)","title":"Environmental context dependency in species interactions","volume":"119","author":[{"family":"Liu","given":"Owen R."},{"family":"Gaines","given":"Steven D."}],"issued":{"date-parts":[["2022",9,6]]}}},{"id":2327,"uris":["http://zotero.org/groups/4766723/items/X3CCR7HK"],"itemData":{"id":2327,"type":"article-journal","container-title":"Trends in Ecology &amp; Evolution","DOI":"10.1016/j.tree.2010.06.016","ISSN":"01695347","issue":"10","journalAbbreviation":"Trends in Ecology &amp; Evolution","language":"en","license":"https://www.elsevier.com/tdm/userlicense/1.0/","page":"574-582","source":"DOI.org (Crossref)","title":"Long-term datasets in biodiversity research and monitoring: assessing change in ecological communities through time","title-short":"Long-term datasets in biodiversity research and monitoring","volume":"25","author":[{"family":"Magurran","given":"Anne E."},{"family":"Baillie","given":"Stephen R."},{"family":"Buckland","given":"Stephen T."},{"family":"Dick","given":"Jan McP."},{"family":"Elston","given":"David A."},{"family":"Scott","given":"E. Marian"},{"family":"Smith","given":"Rognvald I."},{"family":"Somerfield","given":"Paul J."},{"family":"Watt","given":"Allan D."}],"issued":{"date-parts":[["2010",10]]}}}],"schema":"https://github.com/citation-style-language/schema/raw/master/csl-citation.json"} </w:instrText>
-      </w:r>
-      <w:r>
-        <w:fldChar w:fldCharType="separate"/>
-      </w:r>
-      <w:r>
-        <w:rPr>
-          <w:noProof/>
-        </w:rPr>
-        <w:t>(Hughes et al., 2017; Liu &amp; Gaines, 2022; Magurran et al., 2010)</w:t>
-      </w:r>
-      <w:r>
-        <w:fldChar w:fldCharType="end"/>
-      </w:r>
-      <w:r>
-        <w:t xml:space="preserve">. </w:t>
-      </w:r>
-      <w:r>
-        <w:t>To</w:t>
-      </w:r>
-      <w:r>
-        <w:t xml:space="preserve"> understand the consequences of the temporal and spatial patterns shaping this mutualism, </w:t>
-      </w:r>
-      <w:r>
-        <w:t xml:space="preserve">further studies can evaluate this system </w:t>
-      </w:r>
-      <w:r>
-        <w:t>“from the plant’s perspective”. Specifically,</w:t>
-      </w:r>
-      <w:r>
-        <w:t xml:space="preserve"> </w:t>
-      </w:r>
-      <w:r>
-        <w:t xml:space="preserve">under what climate and habitat conditions do pinyon jays serve as effective seed </w:t>
-      </w:r>
-      <w:proofErr w:type="gramStart"/>
-      <w:r>
-        <w:t>dispersers?</w:t>
-      </w:r>
-      <w:proofErr w:type="gramEnd"/>
-      <w:r>
-        <w:t xml:space="preserve"> Like many mutualisms, the benefit to pinyon pine may depend on context </w:t>
-      </w:r>
-      <w:r>
-        <w:fldChar w:fldCharType="begin"/>
-      </w:r>
-      <w:r>
-        <w:instrText xml:space="preserve"> ADDIN ZOTERO_ITEM CSL_CITATION {"citationID":"ZECmcPHo","properties":{"formattedCitation":"(Chamberlain et al., 2014; Moore &amp; Dittel, 2020)","plainCitation":"(Chamberlain et al., 2014; Moore &amp; Dittel, 2020)","noteIndex":0},"citationItems":[{"id":133,"uris":["http://zotero.org/users/6391447/items/NWNSW57M"],"itemData":{"id":133,"type":"article-journal","abstract":"The net effects of interspeciﬁc species interactions on individuals and populations vary in both sign (À, 0, +) and magnitude (strong to weak). Interaction outcomes are context-dependent when the sign and/or magnitude change as a function of the biotic or abiotic context. While context dependency appears to be common, its distribution in nature is poorly described. Here, we used meta-analysis to quantify variation in species interaction outcomes (competition, mutualism, or predation) for 247 published articles. Contrary to our expectations, variation in the magnitude of effect sizes did not differ among species interactions, and while mutualism was most likely to change sign across contexts (and predation least likely), mutualism did not strongly differ from competition. Both the magnitude and sign of species interactions varied the most along spatial and abiotic gradients, and least as a function of the presence/absence of a third species. However, the degree of context dependency across these context types was not consistent among mutualism, competition and predation studies. Surprisingly, study location and ecosystem type varied in the degree of context dependency, with laboratory studies showing the highest variation in outcomes. We urge that studying context dependency per se, rather than focusing only on mean outcomes, can provide a general method for describing patterns of variation in nature.","container-title":"Ecology Letters","DOI":"10.1111/ele.12279","ISSN":"1461023X","issue":"7","journalAbbreviation":"Ecol Lett","language":"en","page":"881-890","source":"DOI.org (Crossref)","title":"How context dependent are species interactions?","volume":"17","author":[{"family":"Chamberlain","given":"Scott A."},{"family":"Bronstein","given":"Judith L."},{"family":"Rudgers","given":"Jennifer A."}],"editor":[{"family":"Etienne","given":"Rampal"}],"issued":{"date-parts":[["2014",7]]}}},{"id":2866,"uris":["http://zotero.org/groups/5634119/items/DSHJRM3N"],"itemData":{"id":2866,"type":"article-journal","abstract":"AbstractSpecies interactions are context dependent, in that their direction and magnitude can vary across ecological conditions. For seed dispersal interactions—especially interactions between plants and seed‐caching animals—the direction of the interactions is often obscured because of seed mortality inherent in seed handling and the delayed effects of fitness benefits received by plants. It is, therefore, an open question in ecology to understand the ecological contexts under which seed dispersal interactions are facilitative, antagonistic or null.We review the fitness benefits of animal‐mediated seed dispersal, extend a recently published model to include negative density‐dependent effects, and review the feedback between seed production (with a focus on masting) and seed‐caching animal populations.Negative density‐dependent effects are pervasive and strongly affect the direction of plant‐seed‐disperser interactions, and including them into models will give a more accurate understanding of the direction of the interaction. Including negative density‐dependent effects also makes the interpretation of interaction more mutualistic since seed dispersers decrease seed densities. Additionally, there is substantial interannual variability in seed production in most nut‐producing plant species, and the lags between seed production and seed‐disperser population sizes complicate and limit inferences made about the direction of interactions in any given short‐term study.Synthesis. If we wish to know the direction of species interactions in real ecological communities, we need models that contain a minimum level of biological realism. For complex and long‐term phenomena such as context‐dependent species interactions we should embrace a multifaceted approach of short‐term field research, long‐term field research, simple models, and complex models to form a more robust understanding of the ecological problem of context dependency.","container-title":"Journal of Ecology","DOI":"10.1111/1365-2745.13414","ISSN":"0022-0477, 1365-2745","issue":"5","language":"en","license":"http://creativecommons.org/licenses/by/4.0/","note":"publisher: Wiley","page":"1775-1783","source":"Crossref","title":"On mutualism, models, and masting: The effects of seed‐dispersing animals on the plants they disperse","title-short":"On mutualism, models, and masting","volume":"108","author":[{"family":"Moore","given":"Christopher M."},{"family":"Dittel","given":"Jacob W."}],"editor":[{"family":"Shefferson","given":"Richard"}],"issued":{"date-parts":[["2020",9]]}}}],"schema":"https://github.com/citation-style-language/schema/raw/master/csl-citation.json"} </w:instrText>
-      </w:r>
-      <w:r>
-        <w:fldChar w:fldCharType="separate"/>
-      </w:r>
-      <w:r>
-        <w:rPr>
-          <w:noProof/>
-        </w:rPr>
-        <w:t>(Chamberlain et al., 2014; Moore &amp; Dittel, 2020)</w:t>
-      </w:r>
-      <w:r>
-        <w:fldChar w:fldCharType="end"/>
-      </w:r>
-      <w:r>
-        <w:t>.</w:t>
-      </w:r>
-      <w:r>
-        <w:t xml:space="preserve"> [Understanding the context dependence of this mutualism is crucial giving the ongoing and future changes, including increased tree mortality and declining seed abundance, which will make it harder for pinyon jays to find seeds. Cite the stuff here from intro.]</w:t>
-      </w:r>
-    </w:p>
-    <w:p>
-      <w:pPr>
-        <w:pStyle w:val="BodyText"/>
-        <w:ind w:firstLine="720"/>
-      </w:pPr>
-      <w:r>
-        <w:t xml:space="preserve">Masting systems are defined by </w:t>
-      </w:r>
-      <w:r>
-        <w:t xml:space="preserve">dynamic </w:t>
-      </w:r>
-      <w:r>
-        <w:t>nutrient fluxes</w:t>
-      </w:r>
-      <w:r>
-        <w:t xml:space="preserve"> (CITE).  </w:t>
-      </w:r>
-      <w:r>
-        <w:t xml:space="preserve">These effects ripple out to impact whole food webs over the course of years (CITE). </w:t>
-      </w:r>
-      <w:r>
-        <w:t>While s</w:t>
-      </w:r>
-      <w:r>
-        <w:t xml:space="preserve">eed dispersers that depend on masting species likely adapted to take advantage of seed resource pulses when they became </w:t>
-      </w:r>
-      <w:r>
-        <w:lastRenderedPageBreak/>
-        <w:t>available</w:t>
-      </w:r>
-      <w:r>
-        <w:t>, many systems where masting is regulated by climate may face increased variability with climate change</w:t>
-      </w:r>
-      <w:r>
-        <w:t xml:space="preserve"> as seed production declines or as seed availability becomes </w:t>
-      </w:r>
-      <w:proofErr w:type="gramStart"/>
-      <w:r>
-        <w:t>more patchy</w:t>
-      </w:r>
-      <w:proofErr w:type="gramEnd"/>
-      <w:r>
-        <w:t xml:space="preserve"> with plant mortality events</w:t>
-      </w:r>
-      <w:r>
-        <w:t xml:space="preserve"> (CITE). </w:t>
-      </w:r>
-      <w:r>
-        <w:t xml:space="preserve">Patterns in seed disperser populations and masting species rely on important </w:t>
-      </w:r>
-      <w:proofErr w:type="gramStart"/>
-      <w:r>
-        <w:t>feedbacks</w:t>
-      </w:r>
-      <w:proofErr w:type="gramEnd"/>
-      <w:r>
-        <w:t xml:space="preserve"> between interaction partners, with mutualistic interactions becoming predation when there are fewer seed resources (CITE). Like all mutualistic interactions, seed dispersal interactions are at great risk of disappearing with ongoing change across the globe due to processes such as co-extinction </w:t>
-      </w:r>
-      <w:r>
-        <w:fldChar w:fldCharType="begin"/>
-      </w:r>
-      <w:r>
-        <w:instrText xml:space="preserve"> ADDIN ZOTERO_ITEM CSL_CITATION {"citationID":"hXPJ32AJ","properties":{"formattedCitation":"(Colwell et al., 2012; Dunn et al., 2009)","plainCitation":"(Colwell et al., 2012; Dunn et al., 2009)","noteIndex":0},"citationItems":[{"id":2910,"uris":["http://zotero.org/users/6391447/items/BUDWNGTV"],"itemData":{"id":2910,"type":"article-journal","abstract":"The extinction of a single species is rarely an isolated event. Instead, dependent parasites, commensals, and mutualist partners (affiliates) face the risk of coextinction as their hosts or partners decline and fail. Species interactions in ecological networks can transmit the effects of primary extinctions within and between trophic levels, causing secondary extinctions and extinction cascades. Documenting coextinctions is complicated by ignorance of host specificity, limitations of historical collections, incomplete systematics of affiliate taxa, and lack of experimental studies. Host shifts may reduce the rate of coextinctions, but they are poorly understood. In the absence of better empirical records of coextinctions, statistical models estimate the rates of past and future coextinctions, and based on primary extinctions and interactions among species, network models explore extinction cascades. Models predict and historical evidence reveals that the threat of coextinction is influenced by both host and affiliate traits and is exacerbated by other threats, including habitat loss, climate change, and invasive species.","container-title":"Annual Review of Ecology, Evolution, and Systematics","DOI":"10.1146/annurev-ecolsys-110411-160304","ISSN":"1543-592X, 1545-2069","issue":"1","journalAbbreviation":"Annu. Rev. Ecol. Evol. Syst.","language":"en","note":"publisher: Annual Reviews","page":"183-203","source":"Crossref","title":"Coextinction and Persistence of Dependent Species in a Changing World","volume":"43","author":[{"family":"Colwell","given":"Robert K."},{"family":"Dunn","given":"Robert R."},{"family":"Harris","given":"Nyeema C."}],"issued":{"date-parts":[["2012",12,1]]}}},{"id":2908,"uris":["http://zotero.org/users/6391447/items/JAWB3SAX"],"itemData":{"id":2908,"type":"article-journal","abstract":"The effects of species declines and extinction on biotic interactions remain poorly understood. The loss of a species is expected to result in the loss of other species that depend on it (coextinction), leading to cascading effects across trophic levels. Such effects are likely to be most severe in mutualistic and parasitic interactions. Indeed, models suggest that coextinction may be the most common form of biodiversity loss. Paradoxically, few historical or contemporary coextinction events have actually been recorded. We review the current knowledge of coextinction by: (i) considering plausible explanations for the discrepancy between predicted and observed coextinction rates; (ii) exploring the potential consequences of coextinctions; (iii) discussing the interactions and synergies between coextinction and other drivers of species loss, particularly climate change; and (iv) suggesting the way forward for understanding the phenomenon of coextinction, which may well be the most insidious threat to global biodiversity.","container-title":"Proceedings of the Royal Society B: Biological Sciences","DOI":"10.1098/rspb.2009.0413","ISSN":"0962-8452, 1471-2954","issue":"1670","journalAbbreviation":"Proc. R. Soc. B.","language":"en","license":"https://royalsociety.org/journals/ethics-policies/data-sharing-mining/","note":"publisher: The Royal Society","page":"3037-3045","source":"Crossref","title":"The sixth mass coextinction: are most endangered species parasites and mutualists?","title-short":"The sixth mass coextinction","volume":"276","author":[{"family":"Dunn","given":"Robert R."},{"family":"Harris","given":"Nyeema C."},{"family":"Colwell","given":"Robert K."},{"family":"Koh","given":"Lian Pin"},{"family":"Sodhi","given":"Navjot S."}],"issued":{"date-parts":[["2009",9,7]]}}}],"schema":"https://github.com/citation-style-language/schema/raw/master/csl-citation.json"} </w:instrText>
-      </w:r>
-      <w:r>
-        <w:fldChar w:fldCharType="separate"/>
-      </w:r>
-      <w:r>
-        <w:rPr>
-          <w:noProof/>
-        </w:rPr>
-        <w:t>(Colwell et al., 2012; Dunn et al., 2009)</w:t>
-      </w:r>
-      <w:r>
-        <w:fldChar w:fldCharType="end"/>
-      </w:r>
-      <w:r>
-        <w:t xml:space="preserve"> and phenological mismatches.</w:t>
-      </w:r>
-      <w:r>
-        <w:t xml:space="preserve"> </w:t>
-      </w:r>
-      <w:r>
-        <w:t>Building our understanding about the temporal dynamics and context dependence of seed dispersal interactions in masting systems is an important first step in understanding and curbing biodiversity loss in ecosystems across the planet.</w:t>
-      </w:r>
-    </w:p>
-    <w:bookmarkEnd w:id="25"/>
-    <w:p>
-      <w:pPr>
-        <w:pStyle w:val="BodyText"/>
-        <w:rPr>
-          <w:b/>
-          <w:bCs/>
-        </w:rPr>
         <w:sectPr>
           <w:pgSz w:w="12240" w:h="15840"/>
           <w:pgMar w:top="1440" w:right="1440" w:bottom="1440" w:left="1440" w:header="720" w:footer="720" w:gutter="0"/>
@@ -8804,6 +8380,101 @@
           <w:docGrid w:linePitch="326"/>
         </w:sectPr>
       </w:pPr>
+      <w:r>
+        <w:lastRenderedPageBreak/>
+        <w:t xml:space="preserve">Like all mutualistic interactions, seed dispersal interactions are at great risk of disappearing with ongoing change across the globe due to processes such as co-extinction </w:t>
+      </w:r>
+      <w:r>
+        <w:fldChar w:fldCharType="begin"/>
+      </w:r>
+      <w:r>
+        <w:instrText xml:space="preserve"> ADDIN ZOTERO_ITEM CSL_CITATION {"citationID":"hXPJ32AJ","properties":{"formattedCitation":"(Colwell et al., 2012; Dunn et al., 2009)","plainCitation":"(Colwell et al., 2012; Dunn et al., 2009)","noteIndex":0},"citationItems":[{"id":2910,"uris":["http://zotero.org/users/6391447/items/BUDWNGTV"],"itemData":{"id":2910,"type":"article-journal","abstract":"The extinction of a single species is rarely an isolated event. Instead, dependent parasites, commensals, and mutualist partners (affiliates) face the risk of coextinction as their hosts or partners decline and fail. Species interactions in ecological networks can transmit the effects of primary extinctions within and between trophic levels, causing secondary extinctions and extinction cascades. Documenting coextinctions is complicated by ignorance of host specificity, limitations of historical collections, incomplete systematics of affiliate taxa, and lack of experimental studies. Host shifts may reduce the rate of coextinctions, but they are poorly understood. In the absence of better empirical records of coextinctions, statistical models estimate the rates of past and future coextinctions, and based on primary extinctions and interactions among species, network models explore extinction cascades. Models predict and historical evidence reveals that the threat of coextinction is influenced by both host and affiliate traits and is exacerbated by other threats, including habitat loss, climate change, and invasive species.","container-title":"Annual Review of Ecology, Evolution, and Systematics","DOI":"10.1146/annurev-ecolsys-110411-160304","ISSN":"1543-592X, 1545-2069","issue":"1","journalAbbreviation":"Annu. Rev. Ecol. Evol. Syst.","language":"en","note":"publisher: Annual Reviews","page":"183-203","source":"Crossref","title":"Coextinction and Persistence of Dependent Species in a Changing World","volume":"43","author":[{"family":"Colwell","given":"Robert K."},{"family":"Dunn","given":"Robert R."},{"family":"Harris","given":"Nyeema C."}],"issued":{"date-parts":[["2012",12,1]]}}},{"id":2908,"uris":["http://zotero.org/users/6391447/items/JAWB3SAX"],"itemData":{"id":2908,"type":"article-journal","abstract":"The effects of species declines and extinction on biotic interactions remain poorly understood. The loss of a species is expected to result in the loss of other species that depend on it (coextinction), leading to cascading effects across trophic levels. Such effects are likely to be most severe in mutualistic and parasitic interactions. Indeed, models suggest that coextinction may be the most common form of biodiversity loss. Paradoxically, few historical or contemporary coextinction events have actually been recorded. We review the current knowledge of coextinction by: (i) considering plausible explanations for the discrepancy between predicted and observed coextinction rates; (ii) exploring the potential consequences of coextinctions; (iii) discussing the interactions and synergies between coextinction and other drivers of species loss, particularly climate change; and (iv) suggesting the way forward for understanding the phenomenon of coextinction, which may well be the most insidious threat to global biodiversity.","container-title":"Proceedings of the Royal Society B: Biological Sciences","DOI":"10.1098/rspb.2009.0413","ISSN":"0962-8452, 1471-2954","issue":"1670","journalAbbreviation":"Proc. R. Soc. B.","language":"en","license":"https://royalsociety.org/journals/ethics-policies/data-sharing-mining/","note":"publisher: The Royal Society","page":"3037-3045","source":"Crossref","title":"The sixth mass coextinction: are most endangered species parasites and mutualists?","title-short":"The sixth mass coextinction","volume":"276","author":[{"family":"Dunn","given":"Robert R."},{"family":"Harris","given":"Nyeema C."},{"family":"Colwell","given":"Robert K."},{"family":"Koh","given":"Lian Pin"},{"family":"Sodhi","given":"Navjot S."}],"issued":{"date-parts":[["2009",9,7]]}}}],"schema":"https://github.com/citation-style-language/schema/raw/master/csl-citation.json"} </w:instrText>
+      </w:r>
+      <w:r>
+        <w:fldChar w:fldCharType="separate"/>
+      </w:r>
+      <w:r>
+        <w:rPr>
+          <w:noProof/>
+        </w:rPr>
+        <w:t>(Colwell et al., 2012; Dunn et al., 2009)</w:t>
+      </w:r>
+      <w:r>
+        <w:fldChar w:fldCharType="end"/>
+      </w:r>
+      <w:r>
+        <w:t xml:space="preserve"> and phenological mismatches</w:t>
+      </w:r>
+      <w:r>
+        <w:t xml:space="preserve"> (Rafferty et al. 2015)</w:t>
+      </w:r>
+      <w:r>
+        <w:t>.</w:t>
+      </w:r>
+      <w:r>
+        <w:t xml:space="preserve"> </w:t>
+      </w:r>
+      <w:r>
+        <w:t>Building our understanding about the temporal dynamics and context dependence of seed dispersal interactions is an important first step in understanding and curbing biodiversity loss in ecosystems</w:t>
+      </w:r>
+      <w:r>
+        <w:t xml:space="preserve"> across the planet</w:t>
+      </w:r>
+      <w:r>
+        <w:t xml:space="preserve"> </w:t>
+      </w:r>
+      <w:r>
+        <w:t>that rely on this mutualism</w:t>
+      </w:r>
+      <w:r>
+        <w:t>.</w:t>
+      </w:r>
+      <w:bookmarkEnd w:id="23"/>
+      <w:r>
+        <w:t xml:space="preserve"> </w:t>
+      </w:r>
+      <w:r>
+        <w:t xml:space="preserve">Using models that explicitly test multiple hypotheses about temporal relationships (Ogle et al.,) may be a first step in creating interaction networks for </w:t>
+      </w:r>
+      <w:r>
+        <w:t>many kinds of</w:t>
+      </w:r>
+      <w:r>
+        <w:t xml:space="preserve"> interactions (e.g., </w:t>
+      </w:r>
+      <w:r>
+        <w:t>trophic</w:t>
+      </w:r>
+      <w:r>
+        <w:t>, mutualis</w:t>
+      </w:r>
+      <w:r>
+        <w:t>t, parasitic</w:t>
+      </w:r>
+      <w:r>
+        <w:t xml:space="preserve">) that better capture the intrinsic temporal legacies of past and present abiotic and biotic </w:t>
+      </w:r>
+      <w:r>
+        <w:t>influences</w:t>
+      </w:r>
+      <w:r>
+        <w:t xml:space="preserve"> o</w:t>
+      </w:r>
+      <w:r>
+        <w:t xml:space="preserve">n </w:t>
+      </w:r>
+      <w:r>
+        <w:t xml:space="preserve">current </w:t>
+      </w:r>
+      <w:r>
+        <w:t>interaction strength</w:t>
+      </w:r>
+      <w:r>
+        <w:t xml:space="preserve"> (Essl). </w:t>
+      </w:r>
+      <w:r>
+        <w:t xml:space="preserve"> </w:t>
+      </w:r>
     </w:p>
     <w:p>
       <w:pPr>
@@ -11626,7 +11297,24 @@
       </w:r>
     </w:p>
   </w:comment>
-  <w:comment w:id="9" w:author="Kiona Ogle" w:date="2025-08-21T09:26:00Z" w:initials="KO">
+  <w:comment w:id="8" w:author="Ana Miller-ter Kuile" w:date="2025-09-22T14:57:00Z" w:initials="AM">
+    <w:p>
+      <w:r>
+        <w:rPr>
+          <w:rStyle w:val="CommentReference"/>
+        </w:rPr>
+        <w:annotationRef/>
+      </w:r>
+      <w:r>
+        <w:rPr>
+          <w:sz w:val="20"/>
+          <w:szCs w:val="20"/>
+        </w:rPr>
+        <w:t>I'm not sure if this is the best word here - but wanting to get at this idea of "memory" or that things today are a consequence of things happening through time</w:t>
+      </w:r>
+    </w:p>
+  </w:comment>
+  <w:comment w:id="12" w:author="Kyle Christopher Rodman" w:date="2025-08-11T12:02:00Z" w:initials="KR">
     <w:p>
       <w:pPr>
         <w:pStyle w:val="CommentText"/>
@@ -11638,11 +11326,11 @@
         <w:annotationRef/>
       </w:r>
       <w:r>
-        <w:t>I would provide a map of the region, denoting the distribution (and estimated abundance) of pinyon pine, and points for all bird sampled locations. Haven’t you made such a map? It would be good to show the extent of the region.</w:t>
+        <w:t>You could probably shorten this to just a couple of sentences and make it an appendix section</w:t>
       </w:r>
     </w:p>
   </w:comment>
-  <w:comment w:id="10" w:author="Kiona Ogle" w:date="2025-08-21T09:28:00Z" w:initials="KO">
+  <w:comment w:id="13" w:author="Kiona Ogle" w:date="2025-08-21T12:31:00Z" w:initials="KO">
     <w:p>
       <w:pPr>
         <w:pStyle w:val="CommentText"/>
@@ -11654,11 +11342,11 @@
         <w:annotationRef/>
       </w:r>
       <w:r>
-        <w:t>In this section, you might also provide some more details about the region; e.g., total area represented, elevation range spanned.</w:t>
+        <w:t>I wouldn’t shorten, but might need some clarification.</w:t>
       </w:r>
     </w:p>
   </w:comment>
-  <w:comment w:id="13" w:author="Kyle Christopher Rodman" w:date="2025-08-11T12:02:00Z" w:initials="KR">
+  <w:comment w:id="14" w:author="Kiona Ogle" w:date="2025-08-21T12:30:00Z" w:initials="KO">
     <w:p>
       <w:pPr>
         <w:pStyle w:val="CommentText"/>
@@ -11670,11 +11358,11 @@
         <w:annotationRef/>
       </w:r>
       <w:r>
-        <w:t>You could probably shorten this to just a couple of sentences and make it an appendix section</w:t>
+        <w:t>May need to provide a little more information about this. What is the source and spatial resolution? Is this different from the aforementioned BA estimates?</w:t>
       </w:r>
     </w:p>
   </w:comment>
-  <w:comment w:id="14" w:author="Kiona Ogle" w:date="2025-08-21T12:31:00Z" w:initials="KO">
+  <w:comment w:id="15" w:author="Kyle Christopher Rodman" w:date="2025-08-11T11:57:00Z" w:initials="KR">
     <w:p>
       <w:pPr>
         <w:pStyle w:val="CommentText"/>
@@ -11686,11 +11374,28 @@
         <w:annotationRef/>
       </w:r>
       <w:r>
-        <w:t>I wouldn’t shorten, but might need some clarification.</w:t>
+        <w:t>It's possible that we may need to put a couple of photos of example locations which show declines or increases in tree cover since the early 2000s.</w:t>
       </w:r>
     </w:p>
   </w:comment>
-  <w:comment w:id="15" w:author="Kiona Ogle" w:date="2025-08-21T12:30:00Z" w:initials="KO">
+  <w:comment w:id="18" w:author="Ana Miller-ter Kuile" w:date="2025-09-22T09:11:00Z" w:initials="AM">
+    <w:p>
+      <w:r>
+        <w:rPr>
+          <w:rStyle w:val="CommentReference"/>
+        </w:rPr>
+        <w:annotationRef/>
+      </w:r>
+      <w:r>
+        <w:rPr>
+          <w:sz w:val="20"/>
+          <w:szCs w:val="20"/>
+        </w:rPr>
+        <w:t>Note: update all equations to have numbers</w:t>
+      </w:r>
+    </w:p>
+  </w:comment>
+  <w:comment w:id="24" w:author="Kyle Christopher Rodman" w:date="2025-08-11T13:14:00Z" w:initials="KR">
     <w:p>
       <w:pPr>
         <w:pStyle w:val="CommentText"/>
@@ -11702,75 +11407,11 @@
         <w:annotationRef/>
       </w:r>
       <w:r>
-        <w:t>May need to provide a little more information about this. What is the source and spatial resolution? Is this different from the aforementioned BA estimates?</w:t>
+        <w:t>Do you have this for the out-of-sample stuff as well? Right now it looks like you present in-sample R-squared, and in-sample + out-of-sample RMSE</w:t>
       </w:r>
     </w:p>
   </w:comment>
-  <w:comment w:id="16" w:author="Kyle Christopher Rodman" w:date="2025-08-11T11:57:00Z" w:initials="KR">
-    <w:p>
-      <w:pPr>
-        <w:pStyle w:val="CommentText"/>
-      </w:pPr>
-      <w:r>
-        <w:rPr>
-          <w:rStyle w:val="CommentReference"/>
-        </w:rPr>
-        <w:annotationRef/>
-      </w:r>
-      <w:r>
-        <w:t>It's possible that we may need to put a couple of photos of example locations which show declines or increases in tree cover since the early 2000s.</w:t>
-      </w:r>
-    </w:p>
-  </w:comment>
-  <w:comment w:id="18" w:author="Kyle Christopher Rodman" w:date="2025-08-11T12:25:00Z" w:initials="KR">
-    <w:p>
-      <w:pPr>
-        <w:pStyle w:val="CommentText"/>
-      </w:pPr>
-      <w:r>
-        <w:rPr>
-          <w:rStyle w:val="CommentReference"/>
-        </w:rPr>
-        <w:annotationRef/>
-      </w:r>
-      <w:r>
-        <w:t>Suggest a supplementary figure. Maybe some density plots or histograms of all covariate values vs. those extracted to bird data?</w:t>
-      </w:r>
-    </w:p>
-  </w:comment>
-  <w:comment w:id="19" w:author="Kiona Ogle" w:date="2025-08-22T14:46:00Z" w:initials="KO">
-    <w:p>
-      <w:pPr>
-        <w:pStyle w:val="CommentText"/>
-      </w:pPr>
-      <w:r>
-        <w:rPr>
-          <w:rStyle w:val="CommentReference"/>
-        </w:rPr>
-        <w:annotationRef/>
-      </w:r>
-      <w:r>
-        <w:t>I agree – would be good to include supplementary figures.</w:t>
-      </w:r>
-    </w:p>
-  </w:comment>
-  <w:comment w:id="26" w:author="Kyle Christopher Rodman" w:date="2025-08-11T13:14:00Z" w:initials="KR">
-    <w:p>
-      <w:pPr>
-        <w:pStyle w:val="CommentText"/>
-      </w:pPr>
-      <w:r>
-        <w:rPr>
-          <w:rStyle w:val="CommentReference"/>
-        </w:rPr>
-        <w:annotationRef/>
-      </w:r>
-      <w:r>
-        <w:t>Do you have this for the out-of-sample stuff as well? Right now it looks like you present in-sample R-squared, and in-sample + out-of-sample RMSE</w:t>
-      </w:r>
-    </w:p>
-  </w:comment>
-  <w:comment w:id="27" w:author="Ana Miller-ter Kuile" w:date="2025-08-18T14:49:00Z" w:initials="AM">
+  <w:comment w:id="25" w:author="Ana Miller-ter Kuile" w:date="2025-08-18T14:49:00Z" w:initials="AM">
     <w:p>
       <w:r>
         <w:rPr>
@@ -11793,14 +11434,12 @@
 <file path=word/commentsExtended.xml><?xml version="1.0" encoding="utf-8"?>
 <w15:commentsEx xmlns:wpc="http://schemas.microsoft.com/office/word/2010/wordprocessingCanvas" xmlns:cx="http://schemas.microsoft.com/office/drawing/2014/chartex" xmlns:cx1="http://schemas.microsoft.com/office/drawing/2015/9/8/chartex" xmlns:cx2="http://schemas.microsoft.com/office/drawing/2015/10/21/chartex" xmlns:cx3="http://schemas.microsoft.com/office/drawing/2016/5/9/chartex" xmlns:cx4="http://schemas.microsoft.com/office/drawing/2016/5/10/chartex" xmlns:cx5="http://schemas.microsoft.com/office/drawing/2016/5/11/chartex" xmlns:cx6="http://schemas.microsoft.com/office/drawing/2016/5/12/chartex" xmlns:cx7="http://schemas.microsoft.com/office/drawing/2016/5/13/chartex" xmlns:cx8="http://schemas.microsoft.com/office/drawing/2016/5/14/chartex" xmlns:mc="http://schemas.openxmlformats.org/markup-compatibility/2006" xmlns:aink="http://schemas.microsoft.com/office/drawing/2016/ink" xmlns:am3d="http://schemas.microsoft.com/office/drawing/2017/model3d" xmlns:o="urn:schemas-microsoft-com:office:office" xmlns:oel="http://schemas.microsoft.com/office/2019/extlst" xmlns:r="http://schemas.openxmlformats.org/officeDocument/2006/relationships" xmlns:m="http://schemas.openxmlformats.org/officeDocument/2006/math" xmlns:v="urn:schemas-microsoft-com:vml" xmlns:wp14="http://schemas.microsoft.com/office/word/2010/wordprocessingDrawing" xmlns:wp="http://schemas.openxmlformats.org/drawingml/2006/wordprocessingDrawing" xmlns:w10="urn:schemas-microsoft-com:office:word" xmlns:w="http://schemas.openxmlformats.org/wordprocessingml/2006/main" xmlns:w14="http://schemas.microsoft.com/office/word/2010/wordml" xmlns:w15="http://schemas.microsoft.com/office/word/2012/wordml" xmlns:w16cex="http://schemas.microsoft.com/office/word/2018/wordml/cex" xmlns:w16cid="http://schemas.microsoft.com/office/word/2016/wordml/cid" xmlns:w16="http://schemas.microsoft.com/office/word/2018/wordml" xmlns:w16du="http://schemas.microsoft.com/office/word/2023/wordml/word16du" xmlns:w16sdtdh="http://schemas.microsoft.com/office/word/2020/wordml/sdtdatahash" xmlns:w16sdtfl="http://schemas.microsoft.com/office/word/2024/wordml/sdtformatlock" xmlns:w16se="http://schemas.microsoft.com/office/word/2015/wordml/symex" xmlns:wpg="http://schemas.microsoft.com/office/word/2010/wordprocessingGroup" xmlns:wpi="http://schemas.microsoft.com/office/word/2010/wordprocessingInk" xmlns:wne="http://schemas.microsoft.com/office/word/2006/wordml" xmlns:wps="http://schemas.microsoft.com/office/word/2010/wordprocessingShape" mc:Ignorable="w14 w15 w16se w16cid w16 w16cex w16sdtdh w16sdtfl w16du wp14">
   <w15:commentEx w15:paraId="249DF32B" w15:done="0"/>
-  <w15:commentEx w15:paraId="157AB27F" w15:done="0"/>
-  <w15:commentEx w15:paraId="1F5D9C21" w15:paraIdParent="157AB27F" w15:done="0"/>
+  <w15:commentEx w15:paraId="0114E7FC" w15:done="0"/>
   <w15:commentEx w15:paraId="692C415B" w15:done="0"/>
   <w15:commentEx w15:paraId="667170D9" w15:paraIdParent="692C415B" w15:done="0"/>
   <w15:commentEx w15:paraId="45E0C097" w15:done="0"/>
   <w15:commentEx w15:paraId="6A67D02A" w15:done="0"/>
-  <w15:commentEx w15:paraId="5D20A00C" w15:done="0"/>
-  <w15:commentEx w15:paraId="5A4F8F83" w15:paraIdParent="5D20A00C" w15:done="0"/>
+  <w15:commentEx w15:paraId="7F3FFDCA" w15:done="0"/>
   <w15:commentEx w15:paraId="6C68DD2B" w15:done="0"/>
   <w15:commentEx w15:paraId="1F190560" w15:paraIdParent="6C68DD2B" w15:done="0"/>
 </w15:commentsEx>
@@ -11809,26 +11448,12 @@
 <file path=word/commentsExtensible.xml><?xml version="1.0" encoding="utf-8"?>
 <w16cex:commentsExtensible xmlns:wpc="http://schemas.microsoft.com/office/word/2010/wordprocessingCanvas" xmlns:cx="http://schemas.microsoft.com/office/drawing/2014/chartex" xmlns:cx1="http://schemas.microsoft.com/office/drawing/2015/9/8/chartex" xmlns:cx2="http://schemas.microsoft.com/office/drawing/2015/10/21/chartex" xmlns:cx3="http://schemas.microsoft.com/office/drawing/2016/5/9/chartex" xmlns:cx4="http://schemas.microsoft.com/office/drawing/2016/5/10/chartex" xmlns:cx5="http://schemas.microsoft.com/office/drawing/2016/5/11/chartex" xmlns:cx6="http://schemas.microsoft.com/office/drawing/2016/5/12/chartex" xmlns:cx7="http://schemas.microsoft.com/office/drawing/2016/5/13/chartex" xmlns:cx8="http://schemas.microsoft.com/office/drawing/2016/5/14/chartex" xmlns:cr="http://schemas.microsoft.com/office/comments/2020/reactions" xmlns:mc="http://schemas.openxmlformats.org/markup-compatibility/2006" xmlns:aink="http://schemas.microsoft.com/office/drawing/2016/ink" xmlns:am3d="http://schemas.microsoft.com/office/drawing/2017/model3d" xmlns:o="urn:schemas-microsoft-com:office:office" xmlns:oel="http://schemas.microsoft.com/office/2019/extlst" xmlns:r="http://schemas.openxmlformats.org/officeDocument/2006/relationships" xmlns:m="http://schemas.openxmlformats.org/officeDocument/2006/math" xmlns:v="urn:schemas-microsoft-com:vml" xmlns:wp14="http://schemas.microsoft.com/office/word/2010/wordprocessingDrawing" xmlns:wp="http://schemas.openxmlformats.org/drawingml/2006/wordprocessingDrawing" xmlns:w10="urn:schemas-microsoft-com:office:word" xmlns:w="http://schemas.openxmlformats.org/wordprocessingml/2006/main" xmlns:w14="http://schemas.microsoft.com/office/word/2010/wordml" xmlns:w15="http://schemas.microsoft.com/office/word/2012/wordml" xmlns:w16cex="http://schemas.microsoft.com/office/word/2018/wordml/cex" xmlns:w16cid="http://schemas.microsoft.com/office/word/2016/wordml/cid" xmlns:w16="http://schemas.microsoft.com/office/word/2018/wordml" xmlns:w16du="http://schemas.microsoft.com/office/word/2023/wordml/word16du" xmlns:w16sdtdh="http://schemas.microsoft.com/office/word/2020/wordml/sdtdatahash" xmlns:w16sdtfl="http://schemas.microsoft.com/office/word/2024/wordml/sdtformatlock" xmlns:w16se="http://schemas.microsoft.com/office/word/2015/wordml/symex" xmlns:wpg="http://schemas.microsoft.com/office/word/2010/wordprocessingGroup" xmlns:wpi="http://schemas.microsoft.com/office/word/2010/wordprocessingInk" xmlns:wne="http://schemas.microsoft.com/office/word/2006/wordml" xmlns:wps="http://schemas.microsoft.com/office/word/2010/wordprocessingShape" mc:Ignorable="w14 w15 w16se w16cid w16 w16cex w16sdtdh w16sdtfl cr w16du wp14">
   <w16cex:commentExtensible w16cex:durableId="58E235D0" w16cex:dateUtc="2025-05-14T22:30:00Z"/>
-  <w16cex:commentExtensible w16cex:durableId="2CB27058" w16cex:dateUtc="2025-08-21T16:26:00Z"/>
-  <w16cex:commentExtensible w16cex:durableId="2E58695F" w16cex:dateUtc="2025-08-21T16:28:00Z"/>
+  <w16cex:commentExtensible w16cex:durableId="292779F6" w16cex:dateUtc="2025-09-22T21:57:00Z"/>
   <w16cex:commentExtensible w16cex:durableId="65A94FC0" w16cex:dateUtc="2025-08-11T19:02:00Z"/>
   <w16cex:commentExtensible w16cex:durableId="4B76E3C7" w16cex:dateUtc="2025-08-21T19:31:00Z"/>
   <w16cex:commentExtensible w16cex:durableId="3DDD810B" w16cex:dateUtc="2025-08-21T19:30:00Z"/>
   <w16cex:commentExtensible w16cex:durableId="08493D9A" w16cex:dateUtc="2025-08-11T18:57:00Z"/>
-  <w16cex:commentExtensible w16cex:durableId="5462DEC0" w16cex:dateUtc="2025-08-11T19:25:00Z">
-    <w16cex:extLst>
-      <w16:ext w16:uri="{CE6994B0-6A32-4C9F-8C6B-6E91EDA988CE}">
-        <cr:reactions xmlns:cr="http://schemas.microsoft.com/office/comments/2020/reactions">
-          <cr:reaction reactionType="1">
-            <cr:reactionInfo dateUtc="2025-08-11T21:57:05Z">
-              <cr:user userId="S::urn:spo:guest#jamie.l.sanderlin@usda.gov::" userProvider="AD" userName="jamie.l.sanderlin@usda.gov"/>
-            </cr:reactionInfo>
-          </cr:reaction>
-        </cr:reactions>
-      </w16:ext>
-    </w16cex:extLst>
-  </w16cex:commentExtensible>
-  <w16cex:commentExtensible w16cex:durableId="06694D88" w16cex:dateUtc="2025-08-22T21:46:00Z"/>
+  <w16cex:commentExtensible w16cex:durableId="4A06039F" w16cex:dateUtc="2025-09-22T16:11:00Z"/>
   <w16cex:commentExtensible w16cex:durableId="776A4C3C" w16cex:dateUtc="2025-08-11T20:14:00Z"/>
   <w16cex:commentExtensible w16cex:durableId="715DA146" w16cex:dateUtc="2025-08-18T21:49:00Z"/>
 </w16cex:commentsExtensible>
@@ -11837,14 +11462,12 @@
 <file path=word/commentsIds.xml><?xml version="1.0" encoding="utf-8"?>
 <w16cid:commentsIds xmlns:wpc="http://schemas.microsoft.com/office/word/2010/wordprocessingCanvas" xmlns:cx="http://schemas.microsoft.com/office/drawing/2014/chartex" xmlns:cx1="http://schemas.microsoft.com/office/drawing/2015/9/8/chartex" xmlns:cx2="http://schemas.microsoft.com/office/drawing/2015/10/21/chartex" xmlns:cx3="http://schemas.microsoft.com/office/drawing/2016/5/9/chartex" xmlns:cx4="http://schemas.microsoft.com/office/drawing/2016/5/10/chartex" xmlns:cx5="http://schemas.microsoft.com/office/drawing/2016/5/11/chartex" xmlns:cx6="http://schemas.microsoft.com/office/drawing/2016/5/12/chartex" xmlns:cx7="http://schemas.microsoft.com/office/drawing/2016/5/13/chartex" xmlns:cx8="http://schemas.microsoft.com/office/drawing/2016/5/14/chartex" xmlns:mc="http://schemas.openxmlformats.org/markup-compatibility/2006" xmlns:aink="http://schemas.microsoft.com/office/drawing/2016/ink" xmlns:am3d="http://schemas.microsoft.com/office/drawing/2017/model3d" xmlns:o="urn:schemas-microsoft-com:office:office" xmlns:oel="http://schemas.microsoft.com/office/2019/extlst" xmlns:r="http://schemas.openxmlformats.org/officeDocument/2006/relationships" xmlns:m="http://schemas.openxmlformats.org/officeDocument/2006/math" xmlns:v="urn:schemas-microsoft-com:vml" xmlns:wp14="http://schemas.microsoft.com/office/word/2010/wordprocessingDrawing" xmlns:wp="http://schemas.openxmlformats.org/drawingml/2006/wordprocessingDrawing" xmlns:w10="urn:schemas-microsoft-com:office:word" xmlns:w="http://schemas.openxmlformats.org/wordprocessingml/2006/main" xmlns:w14="http://schemas.microsoft.com/office/word/2010/wordml" xmlns:w15="http://schemas.microsoft.com/office/word/2012/wordml" xmlns:w16cex="http://schemas.microsoft.com/office/word/2018/wordml/cex" xmlns:w16cid="http://schemas.microsoft.com/office/word/2016/wordml/cid" xmlns:w16="http://schemas.microsoft.com/office/word/2018/wordml" xmlns:w16du="http://schemas.microsoft.com/office/word/2023/wordml/word16du" xmlns:w16sdtdh="http://schemas.microsoft.com/office/word/2020/wordml/sdtdatahash" xmlns:w16sdtfl="http://schemas.microsoft.com/office/word/2024/wordml/sdtformatlock" xmlns:w16se="http://schemas.microsoft.com/office/word/2015/wordml/symex" xmlns:wpg="http://schemas.microsoft.com/office/word/2010/wordprocessingGroup" xmlns:wpi="http://schemas.microsoft.com/office/word/2010/wordprocessingInk" xmlns:wne="http://schemas.microsoft.com/office/word/2006/wordml" xmlns:wps="http://schemas.microsoft.com/office/word/2010/wordprocessingShape" mc:Ignorable="w14 w15 w16se w16cid w16 w16cex w16sdtdh w16sdtfl w16du wp14">
   <w16cid:commentId w16cid:paraId="249DF32B" w16cid:durableId="58E235D0"/>
-  <w16cid:commentId w16cid:paraId="157AB27F" w16cid:durableId="2CB27058"/>
-  <w16cid:commentId w16cid:paraId="1F5D9C21" w16cid:durableId="2E58695F"/>
+  <w16cid:commentId w16cid:paraId="0114E7FC" w16cid:durableId="292779F6"/>
   <w16cid:commentId w16cid:paraId="692C415B" w16cid:durableId="65A94FC0"/>
   <w16cid:commentId w16cid:paraId="667170D9" w16cid:durableId="4B76E3C7"/>
   <w16cid:commentId w16cid:paraId="45E0C097" w16cid:durableId="3DDD810B"/>
   <w16cid:commentId w16cid:paraId="6A67D02A" w16cid:durableId="08493D9A"/>
-  <w16cid:commentId w16cid:paraId="5D20A00C" w16cid:durableId="5462DEC0"/>
-  <w16cid:commentId w16cid:paraId="5A4F8F83" w16cid:durableId="06694D88"/>
+  <w16cid:commentId w16cid:paraId="7F3FFDCA" w16cid:durableId="4A06039F"/>
   <w16cid:commentId w16cid:paraId="6C68DD2B" w16cid:durableId="776A4C3C"/>
   <w16cid:commentId w16cid:paraId="1F190560" w16cid:durableId="715DA146"/>
 </w16cid:commentsIds>
@@ -12434,14 +12057,14 @@
   <w15:person w15:author="Ana Teresa Miller ter Kuile">
     <w15:presenceInfo w15:providerId="AD" w15:userId="S::ana.miller-ter-kuile@nau.edu::f05f7ea4-c99a-402b-8c05-7689738ab6c0"/>
   </w15:person>
-  <w15:person w15:author="Kiona Ogle">
-    <w15:presenceInfo w15:providerId="AD" w15:userId="S::Kiona.Ogle@nau.edu::38df18cf-0f00-4a01-bbff-aa9af4ea00e4"/>
+  <w15:person w15:author="Ana Miller-ter Kuile">
+    <w15:presenceInfo w15:providerId="AD" w15:userId="S::Ana.Miller-ter-Kuile@nau.edu::f05f7ea4-c99a-402b-8c05-7689738ab6c0"/>
   </w15:person>
   <w15:person w15:author="Kyle Christopher Rodman">
     <w15:presenceInfo w15:providerId="AD" w15:userId="S::Kyle.Rodman@nau.edu::eb4c0d42-db71-4cbe-95f9-6192ec5d81d2"/>
   </w15:person>
-  <w15:person w15:author="Ana Miller-ter Kuile">
-    <w15:presenceInfo w15:providerId="AD" w15:userId="S::Ana.Miller-ter-Kuile@nau.edu::f05f7ea4-c99a-402b-8c05-7689738ab6c0"/>
+  <w15:person w15:author="Kiona Ogle">
+    <w15:presenceInfo w15:providerId="AD" w15:userId="S::Kiona.Ogle@nau.edu::38df18cf-0f00-4a01-bbff-aa9af4ea00e4"/>
   </w15:person>
 </w15:people>
 </file>

</xml_diff>